<commit_message>
Deploying to gh-pages from @ Morrison-Lab/psw@7a823ea7566f4a692b80dabbd90f58e0bf35f042 🚀
</commit_message>
<xml_diff>
--- a/chapters/citations-evidence.docx
+++ b/chapters/citations-evidence.docx
@@ -15,7 +15,7 @@
         <w:pStyle w:val="Date"/>
       </w:pPr>
       <w:r>
-        <w:t xml:space="preserve">Last modified: 2026-10-05 05:52:32 (UTC)</w:t>
+        <w:t xml:space="preserve">Last modified: 2026-10-05 07:15:27 (UTC)</w:t>
       </w:r>
     </w:p>
     <w:p>
@@ -2610,13 +2610,75 @@
         <w:t xml:space="preserve"> </w:t>
       </w:r>
       <w:r>
-        <w:t xml:space="preserve">Credit the source in a note at the start or end of the adapted section;</w:t>
-      </w:r>
-      <w:r>
-        <w:t xml:space="preserve"> </w:t>
-      </w:r>
-      <w:r>
-        <w:t xml:space="preserve">in Quarto, a</w:t>
+        <w:t xml:space="preserve">Credit the source in a note at the start or end of the adapted section.</w:t>
+      </w:r>
+    </w:p>
+    <w:p>
+      <w:pPr>
+        <w:pStyle w:val="BodyText"/>
+      </w:pPr>
+      <w:r>
+        <w:t xml:space="preserve">Put that note in a div, never in running prose.</w:t>
+      </w:r>
+      <w:r>
+        <w:t xml:space="preserve"> </w:t>
+      </w:r>
+      <w:r>
+        <w:t xml:space="preserve">An attribution is not part of the argument,</w:t>
+      </w:r>
+      <w:r>
+        <w:t xml:space="preserve"> </w:t>
+      </w:r>
+      <w:r>
+        <w:t xml:space="preserve">and a reader skimming the section should be able to tell it apart</w:t>
+      </w:r>
+      <w:r>
+        <w:t xml:space="preserve"> </w:t>
+      </w:r>
+      <w:r>
+        <w:t xml:space="preserve">from the content it credits.</w:t>
+      </w:r>
+      <w:r>
+        <w:t xml:space="preserve"> </w:t>
+      </w:r>
+      <w:r>
+        <w:t xml:space="preserve">In Quarto, use a collapsed</w:t>
+      </w:r>
+      <w:r>
+        <w:t xml:space="preserve"> </w:t>
+      </w:r>
+      <w:r>
+        <w:rPr>
+          <w:rStyle w:val="VerbatimChar"/>
+        </w:rPr>
+        <w:t xml:space="preserve">.callout-note</w:t>
+      </w:r>
+      <w:r>
+        <w:t xml:space="preserve"> </w:t>
+      </w:r>
+      <w:r>
+        <w:t xml:space="preserve">titled</w:t>
+      </w:r>
+      <w:r>
+        <w:t xml:space="preserve"> </w:t>
+      </w:r>
+      <w:r>
+        <w:t xml:space="preserve">“Source”</w:t>
+      </w:r>
+      <w:r>
+        <w:t xml:space="preserve">,</w:t>
+      </w:r>
+      <w:r>
+        <w:t xml:space="preserve"> </w:t>
+      </w:r>
+      <w:r>
+        <w:t xml:space="preserve">which frames the credit and keeps it out of the way on the page.</w:t>
+      </w:r>
+      <w:r>
+        <w:t xml:space="preserve"> </w:t>
+      </w:r>
+      <w:r>
+        <w:t xml:space="preserve">A</w:t>
       </w:r>
       <w:r>
         <w:t xml:space="preserve"> </w:t>
@@ -2631,7 +2693,134 @@
         <w:t xml:space="preserve"> </w:t>
       </w:r>
       <w:r>
-        <w:t xml:space="preserve">div keeps the credit out of the slides.</w:t>
+        <w:t xml:space="preserve">div keeps the credit out of the slides,</w:t>
+      </w:r>
+      <w:r>
+        <w:t xml:space="preserve"> </w:t>
+      </w:r>
+      <w:r>
+        <w:t xml:space="preserve">but on an HTML page it renders as a plain unstyled</w:t>
+      </w:r>
+      <w:r>
+        <w:t xml:space="preserve"> </w:t>
+      </w:r>
+      <w:r>
+        <w:rPr>
+          <w:rStyle w:val="VerbatimChar"/>
+        </w:rPr>
+        <w:t xml:space="preserve">&lt;div&gt;</w:t>
+      </w:r>
+      <w:r>
+        <w:t xml:space="preserve">,</w:t>
+      </w:r>
+      <w:r>
+        <w:t xml:space="preserve"> </w:t>
+      </w:r>
+      <w:r>
+        <w:t xml:space="preserve">which looks like running prose;</w:t>
+      </w:r>
+      <w:r>
+        <w:t xml:space="preserve"> </w:t>
+      </w:r>
+      <w:r>
+        <w:t xml:space="preserve">use it only on a site whose stylesheet sets</w:t>
+      </w:r>
+      <w:r>
+        <w:t xml:space="preserve"> </w:t>
+      </w:r>
+      <w:r>
+        <w:rPr>
+          <w:rStyle w:val="VerbatimChar"/>
+        </w:rPr>
+        <w:t xml:space="preserve">.notes</w:t>
+      </w:r>
+      <w:r>
+        <w:t xml:space="preserve"> </w:t>
+      </w:r>
+      <w:r>
+        <w:t xml:space="preserve">apart.</w:t>
+      </w:r>
+    </w:p>
+    <w:p>
+      <w:pPr>
+        <w:pStyle w:val="BodyText"/>
+      </w:pPr>
+      <w:r>
+        <w:t xml:space="preserve">The same applies to license notices</w:t>
+      </w:r>
+      <w:r>
+        <w:t xml:space="preserve"> </w:t>
+      </w:r>
+      <w:r>
+        <w:t xml:space="preserve">and to statements of how the adaptation differs from the source.</w:t>
+      </w:r>
+    </w:p>
+    <w:p>
+      <w:pPr>
+        <w:pStyle w:val="BodyText"/>
+      </w:pPr>
+      <w:r>
+        <w:t xml:space="preserve">❌ A plain paragraph between the heading and the first definition:</w:t>
+      </w:r>
+    </w:p>
+    <w:p>
+      <w:pPr>
+        <w:pStyle w:val="SourceCode"/>
+      </w:pPr>
+      <w:r>
+        <w:rPr>
+          <w:rStyle w:val="NormalTok"/>
+        </w:rPr>
+        <w:t xml:space="preserve">This section is adapted from @zhou2024, used under the MIT License.</w:t>
+      </w:r>
+    </w:p>
+    <w:p>
+      <w:pPr>
+        <w:pStyle w:val="FirstParagraph"/>
+      </w:pPr>
+      <w:r>
+        <w:t xml:space="preserve">✅ The same credit in a collapsed callout:</w:t>
+      </w:r>
+    </w:p>
+    <w:p>
+      <w:pPr>
+        <w:pStyle w:val="SourceCode"/>
+      </w:pPr>
+      <w:r>
+        <w:rPr>
+          <w:rStyle w:val="NormalTok"/>
+        </w:rPr>
+        <w:t xml:space="preserve">::: {.callout-note collapse="true"}</w:t>
+      </w:r>
+      <w:r>
+        <w:br/>
+      </w:r>
+      <w:r>
+        <w:rPr>
+          <w:rStyle w:val="FunctionTok"/>
+        </w:rPr>
+        <w:t xml:space="preserve">#### Source</w:t>
+      </w:r>
+      <w:r>
+        <w:br/>
+      </w:r>
+      <w:r>
+        <w:br/>
+      </w:r>
+      <w:r>
+        <w:rPr>
+          <w:rStyle w:val="NormalTok"/>
+        </w:rPr>
+        <w:t xml:space="preserve">This section is adapted from @zhou2024, used under the MIT License.</w:t>
+      </w:r>
+      <w:r>
+        <w:br/>
+      </w:r>
+      <w:r>
+        <w:rPr>
+          <w:rStyle w:val="NormalTok"/>
+        </w:rPr>
+        <w:t xml:space="preserve">:::</w:t>
       </w:r>
     </w:p>
     <w:bookmarkEnd w:id="31"/>

</xml_diff>

<commit_message>
Deploying to gh-pages from @ Morrison-Lab/psw@2b5e09a9ab216c96c3745dc8903ebc26802e3f70 🚀
</commit_message>
<xml_diff>
--- a/chapters/citations-evidence.docx
+++ b/chapters/citations-evidence.docx
@@ -15,7 +15,7 @@
         <w:pStyle w:val="Date"/>
       </w:pPr>
       <w:r>
-        <w:t xml:space="preserve">Last modified: 2026-10-05 09:12:29 (UTC)</w:t>
+        <w:t xml:space="preserve">Last modified: 2026-10-05 09:20:22 (UTC)</w:t>
       </w:r>
     </w:p>
     <w:p>
@@ -430,7 +430,7 @@
         <w:t xml:space="preserve"> </w:t>
       </w:r>
       <w:r>
-        <w:t xml:space="preserve">(e.g.,</w:t>
+        <w:t xml:space="preserve">(for example,</w:t>
       </w:r>
       <w:r>
         <w:t xml:space="preserve"> </w:t>
@@ -2384,7 +2384,7 @@
         <w:t xml:space="preserve">Provide context</w:t>
       </w:r>
       <w:r>
-        <w:t xml:space="preserve">: Help readers understand why a source is relevant (e.g.,</w:t>
+        <w:t xml:space="preserve">: Help readers understand why a source is relevant (for example,</w:t>
       </w:r>
       <w:r>
         <w:t xml:space="preserve"> </w:t>

</xml_diff>

<commit_message>
Deploying to gh-pages from @ Morrison-Lab/psw@42cdf897e81042421fd68e041115d4be1dc36064 🚀
</commit_message>
<xml_diff>
--- a/chapters/citations-evidence.docx
+++ b/chapters/citations-evidence.docx
@@ -15,7 +15,7 @@
         <w:pStyle w:val="Date"/>
       </w:pPr>
       <w:r>
-        <w:t xml:space="preserve">Last modified: 2026-10-05 18:41:41 (UTC)</w:t>
+        <w:t xml:space="preserve">Last modified: 2026-10-05 18:48:57 (UTC)</w:t>
       </w:r>
     </w:p>
     <w:p>
@@ -2288,13 +2288,13 @@
       </w:r>
     </w:p>
     <w:bookmarkEnd w:id="27"/>
-    <w:bookmarkStart w:id="28" w:name="best-practices"/>
+    <w:bookmarkStart w:id="33" w:name="link-liberally"/>
     <w:p>
       <w:pPr>
         <w:pStyle w:val="Heading2"/>
       </w:pPr>
       <w:r>
-        <w:t xml:space="preserve">7 Best practices</w:t>
+        <w:t xml:space="preserve">7 Link liberally</w:t>
       </w:r>
     </w:p>
     <w:p>
@@ -2302,6 +2302,370 @@
         <w:pStyle w:val="FirstParagraph"/>
       </w:pPr>
       <w:r>
+        <w:t xml:space="preserve">A link lets a reader check a claim or learn more</w:t>
+      </w:r>
+      <w:r>
+        <w:t xml:space="preserve"> </w:t>
+      </w:r>
+      <w:r>
+        <w:t xml:space="preserve">without searching for the source themselves.</w:t>
+      </w:r>
+      <w:r>
+        <w:t xml:space="preserve"> </w:t>
+      </w:r>
+      <w:r>
+        <w:t xml:space="preserve">When in doubt, add the link;</w:t>
+      </w:r>
+      <w:r>
+        <w:t xml:space="preserve"> </w:t>
+      </w:r>
+      <w:r>
+        <w:t xml:space="preserve">leave one out only for a specific reason.</w:t>
+      </w:r>
+      <w:r>
+        <w:t xml:space="preserve"> </w:t>
+      </w:r>
+      <w:r>
+        <w:t xml:space="preserve">Link these things whenever they appear:</w:t>
+      </w:r>
+    </w:p>
+    <w:p>
+      <w:pPr>
+        <w:pStyle w:val="Compact"/>
+        <w:numPr>
+          <w:ilvl w:val="0"/>
+          <w:numId w:val="1014"/>
+        </w:numPr>
+      </w:pPr>
+      <w:r>
+        <w:t xml:space="preserve">a term to the place where it is defined,</w:t>
+      </w:r>
+      <w:r>
+        <w:t xml:space="preserve"> </w:t>
+      </w:r>
+      <w:r>
+        <w:t xml:space="preserve">in the same document or another one;</w:t>
+      </w:r>
+    </w:p>
+    <w:p>
+      <w:pPr>
+        <w:pStyle w:val="Compact"/>
+        <w:numPr>
+          <w:ilvl w:val="0"/>
+          <w:numId w:val="1014"/>
+        </w:numPr>
+      </w:pPr>
+      <w:r>
+        <w:t xml:space="preserve">a result to the theorem, equation or section that establishes it;</w:t>
+      </w:r>
+    </w:p>
+    <w:p>
+      <w:pPr>
+        <w:pStyle w:val="Compact"/>
+        <w:numPr>
+          <w:ilvl w:val="0"/>
+          <w:numId w:val="1014"/>
+        </w:numPr>
+      </w:pPr>
+      <w:r>
+        <w:t xml:space="preserve">a cited source to its</w:t>
+      </w:r>
+      <w:r>
+        <w:t xml:space="preserve"> </w:t>
+      </w:r>
+      <w:hyperlink r:id="rId28">
+        <w:r>
+          <w:rPr>
+            <w:rStyle w:val="Hyperlink"/>
+          </w:rPr>
+          <w:t xml:space="preserve">DOI</w:t>
+        </w:r>
+      </w:hyperlink>
+      <w:r>
+        <w:t xml:space="preserve"> </w:t>
+      </w:r>
+      <w:r>
+        <w:t xml:space="preserve">or official URL;</w:t>
+      </w:r>
+    </w:p>
+    <w:p>
+      <w:pPr>
+        <w:pStyle w:val="Compact"/>
+        <w:numPr>
+          <w:ilvl w:val="0"/>
+          <w:numId w:val="1014"/>
+        </w:numPr>
+      </w:pPr>
+      <w:r>
+        <w:t xml:space="preserve">software, packages and datasets to their documentation or home page;</w:t>
+      </w:r>
+    </w:p>
+    <w:p>
+      <w:pPr>
+        <w:pStyle w:val="Compact"/>
+        <w:numPr>
+          <w:ilvl w:val="0"/>
+          <w:numId w:val="1014"/>
+        </w:numPr>
+      </w:pPr>
+      <w:r>
+        <w:t xml:space="preserve">a related section elsewhere in the document,</w:t>
+      </w:r>
+      <w:r>
+        <w:t xml:space="preserve"> </w:t>
+      </w:r>
+      <w:r>
+        <w:t xml:space="preserve">instead of repeating its content.</w:t>
+      </w:r>
+    </w:p>
+    <w:p>
+      <w:pPr>
+        <w:pStyle w:val="FirstParagraph"/>
+      </w:pPr>
+      <w:r>
+        <w:t xml:space="preserve">In</w:t>
+      </w:r>
+      <w:r>
+        <w:t xml:space="preserve"> </w:t>
+      </w:r>
+      <w:hyperlink r:id="rId29">
+        <w:r>
+          <w:rPr>
+            <w:rStyle w:val="Hyperlink"/>
+          </w:rPr>
+          <w:t xml:space="preserve">Quarto</w:t>
+        </w:r>
+      </w:hyperlink>
+      <w:r>
+        <w:t xml:space="preserve">,</w:t>
+      </w:r>
+      <w:r>
+        <w:t xml:space="preserve"> </w:t>
+      </w:r>
+      <w:r>
+        <w:t xml:space="preserve">use a cross-reference such as</w:t>
+      </w:r>
+      <w:r>
+        <w:t xml:space="preserve"> </w:t>
+      </w:r>
+      <w:r>
+        <w:rPr>
+          <w:rStyle w:val="VerbatimChar"/>
+        </w:rPr>
+        <w:t xml:space="preserve">@def-confidence-interval</w:t>
+      </w:r>
+      <w:r>
+        <w:t xml:space="preserve"> </w:t>
+      </w:r>
+      <w:r>
+        <w:t xml:space="preserve">for a definition or result in the same document,</w:t>
+      </w:r>
+      <w:r>
+        <w:t xml:space="preserve"> </w:t>
+      </w:r>
+      <w:r>
+        <w:t xml:space="preserve">so the link updates when numbering changes</w:t>
+      </w:r>
+      <w:r>
+        <w:t xml:space="preserve"> </w:t>
+      </w:r>
+      <w:r>
+        <w:t xml:space="preserve">(see</w:t>
+      </w:r>
+      <w:r>
+        <w:t xml:space="preserve"> </w:t>
+      </w:r>
+      <w:hyperlink r:id="rId15">
+        <w:r>
+          <w:rPr>
+            <w:rStyle w:val="Hyperlink"/>
+          </w:rPr>
+          <w:t xml:space="preserve">Defining terms clearly</w:t>
+        </w:r>
+      </w:hyperlink>
+      <w:r>
+        <w:t xml:space="preserve">).</w:t>
+      </w:r>
+      <w:r>
+        <w:t xml:space="preserve"> </w:t>
+      </w:r>
+      <w:r>
+        <w:t xml:space="preserve">For a target on another page, use an ordinary link to that page’s anchor.</w:t>
+      </w:r>
+    </w:p>
+    <w:p>
+      <w:pPr>
+        <w:pStyle w:val="BodyText"/>
+      </w:pPr>
+      <w:r>
+        <w:t xml:space="preserve">Leave a link out only for a reason such as one of the following:</w:t>
+      </w:r>
+    </w:p>
+    <w:p>
+      <w:pPr>
+        <w:pStyle w:val="Compact"/>
+        <w:numPr>
+          <w:ilvl w:val="0"/>
+          <w:numId w:val="1015"/>
+        </w:numPr>
+      </w:pPr>
+      <w:r>
+        <w:t xml:space="preserve">the target is private, such as a repository of graded homework;</w:t>
+      </w:r>
+    </w:p>
+    <w:p>
+      <w:pPr>
+        <w:pStyle w:val="Compact"/>
+        <w:numPr>
+          <w:ilvl w:val="0"/>
+          <w:numId w:val="1015"/>
+        </w:numPr>
+      </w:pPr>
+      <w:r>
+        <w:t xml:space="preserve">the same target is already linked earlier in the same paragraph;</w:t>
+      </w:r>
+    </w:p>
+    <w:p>
+      <w:pPr>
+        <w:pStyle w:val="Compact"/>
+        <w:numPr>
+          <w:ilvl w:val="0"/>
+          <w:numId w:val="1015"/>
+        </w:numPr>
+      </w:pPr>
+      <w:r>
+        <w:t xml:space="preserve">the target is unstable, and a stable alternative such as a DOI exists.</w:t>
+      </w:r>
+    </w:p>
+    <w:bookmarkStart w:id="32" w:name="exm-link-liberally"/>
+    <w:p>
+      <w:pPr>
+        <w:pStyle w:val="FirstParagraph"/>
+      </w:pPr>
+      <w:r>
+        <w:rPr>
+          <w:b/>
+          <w:bCs/>
+        </w:rPr>
+        <w:t xml:space="preserve">Example 2 (Adding links a reader would use)</w:t>
+      </w:r>
+      <w:r>
+        <w:t xml:space="preserve"> </w:t>
+      </w:r>
+      <w:r>
+        <w:t xml:space="preserve"> </w:t>
+      </w:r>
+    </w:p>
+    <w:p>
+      <w:pPr>
+        <w:pStyle w:val="BlockText"/>
+      </w:pPr>
+      <w:r>
+        <w:t xml:space="preserve">❌ We fit the model with the lme4 package</w:t>
+      </w:r>
+      <w:r>
+        <w:t xml:space="preserve"> </w:t>
+      </w:r>
+      <w:r>
+        <w:t xml:space="preserve">and report a 95% confidence interval for each fixed effect.</w:t>
+      </w:r>
+    </w:p>
+    <w:p>
+      <w:pPr>
+        <w:pStyle w:val="BlockText"/>
+      </w:pPr>
+      <w:r>
+        <w:t xml:space="preserve">✅ We fit the model with the</w:t>
+      </w:r>
+      <w:r>
+        <w:t xml:space="preserve"> </w:t>
+      </w:r>
+      <w:hyperlink r:id="rId30">
+        <w:r>
+          <w:rPr>
+            <w:rStyle w:val="Hyperlink"/>
+          </w:rPr>
+          <w:t xml:space="preserve">lme4</w:t>
+        </w:r>
+      </w:hyperlink>
+      <w:r>
+        <w:t xml:space="preserve"> </w:t>
+      </w:r>
+      <w:r>
+        <w:t xml:space="preserve">package</w:t>
+      </w:r>
+      <w:r>
+        <w:t xml:space="preserve"> </w:t>
+      </w:r>
+      <w:r>
+        <w:t xml:space="preserve">and report a 95%</w:t>
+      </w:r>
+      <w:r>
+        <w:t xml:space="preserve"> </w:t>
+      </w:r>
+      <w:hyperlink r:id="rId31">
+        <w:r>
+          <w:rPr>
+            <w:rStyle w:val="Hyperlink"/>
+          </w:rPr>
+          <w:t xml:space="preserve">confidence interval</w:t>
+        </w:r>
+      </w:hyperlink>
+      <w:r>
+        <w:t xml:space="preserve"> </w:t>
+      </w:r>
+      <w:r>
+        <w:t xml:space="preserve">for each fixed effect.</w:t>
+      </w:r>
+    </w:p>
+    <w:p>
+      <w:pPr>
+        <w:pStyle w:val="FirstParagraph"/>
+      </w:pPr>
+      <w:r>
+        <w:t xml:space="preserve">A reader who does not know lme4,</w:t>
+      </w:r>
+      <w:r>
+        <w:t xml:space="preserve"> </w:t>
+      </w:r>
+      <w:r>
+        <w:t xml:space="preserve">or wants the exact meaning of</w:t>
+      </w:r>
+      <w:r>
+        <w:t xml:space="preserve"> </w:t>
+      </w:r>
+      <w:r>
+        <w:t xml:space="preserve">“confidence interval”</w:t>
+      </w:r>
+      <w:r>
+        <w:t xml:space="preserve"> </w:t>
+      </w:r>
+      <w:r>
+        <w:t xml:space="preserve">in this guide,</w:t>
+      </w:r>
+      <w:r>
+        <w:t xml:space="preserve"> </w:t>
+      </w:r>
+      <w:r>
+        <w:t xml:space="preserve">can now follow the link instead of searching.</w:t>
+      </w:r>
+    </w:p>
+    <w:bookmarkEnd w:id="32"/>
+    <w:bookmarkEnd w:id="33"/>
+    <w:bookmarkStart w:id="34" w:name="best-practices"/>
+    <w:p>
+      <w:pPr>
+        <w:pStyle w:val="Heading2"/>
+      </w:pPr>
+      <w:r>
+        <w:t xml:space="preserve">8 Best practices</w:t>
+      </w:r>
+    </w:p>
+    <w:p>
+      <w:pPr>
+        <w:pStyle w:val="FirstParagraph"/>
+      </w:pPr>
+      <w:r>
         <w:t xml:space="preserve">To effectively support your claims:</w:t>
       </w:r>
     </w:p>
@@ -2310,7 +2674,7 @@
         <w:pStyle w:val="Compact"/>
         <w:numPr>
           <w:ilvl w:val="0"/>
-          <w:numId w:val="1014"/>
+          <w:numId w:val="1016"/>
         </w:numPr>
       </w:pPr>
       <w:r>
@@ -2335,7 +2699,7 @@
         <w:pStyle w:val="Compact"/>
         <w:numPr>
           <w:ilvl w:val="0"/>
-          <w:numId w:val="1014"/>
+          <w:numId w:val="1016"/>
         </w:numPr>
       </w:pPr>
       <w:r>
@@ -2354,7 +2718,7 @@
         <w:pStyle w:val="Compact"/>
         <w:numPr>
           <w:ilvl w:val="0"/>
-          <w:numId w:val="1014"/>
+          <w:numId w:val="1016"/>
         </w:numPr>
       </w:pPr>
       <w:r>
@@ -2373,7 +2737,7 @@
         <w:pStyle w:val="Compact"/>
         <w:numPr>
           <w:ilvl w:val="0"/>
-          <w:numId w:val="1014"/>
+          <w:numId w:val="1016"/>
         </w:numPr>
       </w:pPr>
       <w:r>
@@ -2413,7 +2777,7 @@
         <w:pStyle w:val="Compact"/>
         <w:numPr>
           <w:ilvl w:val="0"/>
-          <w:numId w:val="1014"/>
+          <w:numId w:val="1016"/>
         </w:numPr>
       </w:pPr>
       <w:r>
@@ -2432,7 +2796,7 @@
         <w:pStyle w:val="Compact"/>
         <w:numPr>
           <w:ilvl w:val="0"/>
-          <w:numId w:val="1014"/>
+          <w:numId w:val="1016"/>
         </w:numPr>
       </w:pPr>
       <w:r>
@@ -2451,7 +2815,7 @@
         <w:pStyle w:val="Compact"/>
         <w:numPr>
           <w:ilvl w:val="0"/>
-          <w:numId w:val="1014"/>
+          <w:numId w:val="1016"/>
         </w:numPr>
       </w:pPr>
       <w:r>
@@ -2465,14 +2829,14 @@
         <w:t xml:space="preserve">: When possible, include work from different research groups and perspectives</w:t>
       </w:r>
     </w:p>
-    <w:bookmarkEnd w:id="28"/>
-    <w:bookmarkStart w:id="29" w:name="quote-the-original"/>
+    <w:bookmarkEnd w:id="34"/>
+    <w:bookmarkStart w:id="35" w:name="quote-the-original"/>
     <w:p>
       <w:pPr>
         <w:pStyle w:val="Heading2"/>
       </w:pPr>
       <w:r>
-        <w:t xml:space="preserve">8 Quote the original</w:t>
+        <w:t xml:space="preserve">9 Quote the original</w:t>
       </w:r>
     </w:p>
     <w:p>
@@ -2523,14 +2887,14 @@
         <w:t xml:space="preserve">(Mitchell 1997)</w:t>
       </w:r>
     </w:p>
-    <w:bookmarkEnd w:id="29"/>
-    <w:bookmarkStart w:id="30" w:name="put-the-content-first"/>
+    <w:bookmarkEnd w:id="35"/>
+    <w:bookmarkStart w:id="36" w:name="put-the-content-first"/>
     <w:p>
       <w:pPr>
         <w:pStyle w:val="Heading2"/>
       </w:pPr>
       <w:r>
-        <w:t xml:space="preserve">9 Put the content first</w:t>
+        <w:t xml:space="preserve">10 Put the content first</w:t>
       </w:r>
     </w:p>
     <w:p>
@@ -2577,14 +2941,14 @@
         <w:t xml:space="preserve">without commentary on who said it or where it was repeated.</w:t>
       </w:r>
     </w:p>
-    <w:bookmarkEnd w:id="30"/>
-    <w:bookmarkStart w:id="31" w:name="adapting-another-courses-material"/>
+    <w:bookmarkEnd w:id="36"/>
+    <w:bookmarkStart w:id="37" w:name="adapting-another-courses-material"/>
     <w:p>
       <w:pPr>
         <w:pStyle w:val="Heading2"/>
       </w:pPr>
       <w:r>
-        <w:t xml:space="preserve">10 Adapting another course’s material</w:t>
+        <w:t xml:space="preserve">11 Adapting another course’s material</w:t>
       </w:r>
     </w:p>
     <w:p>
@@ -2823,22 +3187,22 @@
         <w:t xml:space="preserve">:::</w:t>
       </w:r>
     </w:p>
-    <w:bookmarkEnd w:id="31"/>
-    <w:bookmarkStart w:id="32" w:name="common-citation-errors-to-avoid"/>
+    <w:bookmarkEnd w:id="37"/>
+    <w:bookmarkStart w:id="38" w:name="common-citation-errors-to-avoid"/>
     <w:p>
       <w:pPr>
         <w:pStyle w:val="Heading2"/>
       </w:pPr>
       <w:r>
-        <w:t xml:space="preserve">11 Common citation errors to avoid</w:t>
-      </w:r>
-    </w:p>
-    <w:p>
-      <w:pPr>
-        <w:pStyle w:val="Compact"/>
-        <w:numPr>
-          <w:ilvl w:val="0"/>
-          <w:numId w:val="1015"/>
+        <w:t xml:space="preserve">12 Common citation errors to avoid</w:t>
+      </w:r>
+    </w:p>
+    <w:p>
+      <w:pPr>
+        <w:pStyle w:val="Compact"/>
+        <w:numPr>
+          <w:ilvl w:val="0"/>
+          <w:numId w:val="1017"/>
         </w:numPr>
       </w:pPr>
       <w:r>
@@ -2857,7 +3221,7 @@
         <w:pStyle w:val="Compact"/>
         <w:numPr>
           <w:ilvl w:val="0"/>
-          <w:numId w:val="1015"/>
+          <w:numId w:val="1017"/>
         </w:numPr>
       </w:pPr>
       <w:r>
@@ -2888,7 +3252,7 @@
         <w:pStyle w:val="Compact"/>
         <w:numPr>
           <w:ilvl w:val="0"/>
-          <w:numId w:val="1015"/>
+          <w:numId w:val="1017"/>
         </w:numPr>
       </w:pPr>
       <w:r>
@@ -2937,7 +3301,7 @@
         <w:pStyle w:val="Compact"/>
         <w:numPr>
           <w:ilvl w:val="0"/>
-          <w:numId w:val="1015"/>
+          <w:numId w:val="1017"/>
         </w:numPr>
       </w:pPr>
       <w:r>
@@ -2956,7 +3320,7 @@
         <w:pStyle w:val="Compact"/>
         <w:numPr>
           <w:ilvl w:val="0"/>
-          <w:numId w:val="1015"/>
+          <w:numId w:val="1017"/>
         </w:numPr>
       </w:pPr>
       <w:r>
@@ -2975,7 +3339,7 @@
         <w:pStyle w:val="Compact"/>
         <w:numPr>
           <w:ilvl w:val="0"/>
-          <w:numId w:val="1015"/>
+          <w:numId w:val="1017"/>
         </w:numPr>
       </w:pPr>
       <w:r>
@@ -2994,7 +3358,7 @@
         <w:pStyle w:val="Compact"/>
         <w:numPr>
           <w:ilvl w:val="0"/>
-          <w:numId w:val="1015"/>
+          <w:numId w:val="1017"/>
         </w:numPr>
       </w:pPr>
       <w:r>
@@ -3008,23 +3372,23 @@
         <w:t xml:space="preserve">: Failing to cite work that directly influenced your ideas</w:t>
       </w:r>
     </w:p>
-    <w:bookmarkEnd w:id="32"/>
-    <w:bookmarkStart w:id="38" w:name="examples"/>
+    <w:bookmarkEnd w:id="38"/>
+    <w:bookmarkStart w:id="44" w:name="examples"/>
     <w:p>
       <w:pPr>
         <w:pStyle w:val="Heading2"/>
       </w:pPr>
       <w:r>
-        <w:t xml:space="preserve">12 Examples</w:t>
-      </w:r>
-    </w:p>
-    <w:bookmarkStart w:id="33" w:name="poor-unsupported-claim"/>
+        <w:t xml:space="preserve">13 Examples</w:t>
+      </w:r>
+    </w:p>
+    <w:bookmarkStart w:id="39" w:name="poor-unsupported-claim"/>
     <w:p>
       <w:pPr>
         <w:pStyle w:val="Heading3"/>
       </w:pPr>
       <w:r>
-        <w:t xml:space="preserve">12.1 Poor (unsupported claim)</w:t>
+        <w:t xml:space="preserve">13.1 Poor (unsupported claim)</w:t>
       </w:r>
     </w:p>
     <w:p>
@@ -3050,14 +3414,14 @@
         <w:t xml:space="preserve">: This claim is stated as fact without any support.</w:t>
       </w:r>
     </w:p>
-    <w:bookmarkEnd w:id="33"/>
-    <w:bookmarkStart w:id="34" w:name="better-citation-provided"/>
+    <w:bookmarkEnd w:id="39"/>
+    <w:bookmarkStart w:id="40" w:name="better-citation-provided"/>
     <w:p>
       <w:pPr>
         <w:pStyle w:val="Heading3"/>
       </w:pPr>
       <w:r>
-        <w:t xml:space="preserve">12.2 Better (citation provided)</w:t>
+        <w:t xml:space="preserve">13.2 Better (citation provided)</w:t>
       </w:r>
     </w:p>
     <w:p>
@@ -3092,14 +3456,14 @@
         <w:t xml:space="preserve">: Citations provide evidence for the claim.</w:t>
       </w:r>
     </w:p>
-    <w:bookmarkEnd w:id="34"/>
-    <w:bookmarkStart w:id="35" w:name="best-citation-with-context"/>
+    <w:bookmarkEnd w:id="40"/>
+    <w:bookmarkStart w:id="41" w:name="best-citation-with-context"/>
     <w:p>
       <w:pPr>
         <w:pStyle w:val="Heading3"/>
       </w:pPr>
       <w:r>
-        <w:t xml:space="preserve">12.3 Best (citation with context)</w:t>
+        <w:t xml:space="preserve">13.3 Best (citation with context)</w:t>
       </w:r>
     </w:p>
     <w:p>
@@ -3146,14 +3510,14 @@
         <w:t xml:space="preserve">: The specific support each citation provides is explained.</w:t>
       </w:r>
     </w:p>
-    <w:bookmarkEnd w:id="35"/>
-    <w:bookmarkStart w:id="36" w:name="poor-irrelevant-citation"/>
+    <w:bookmarkEnd w:id="41"/>
+    <w:bookmarkStart w:id="42" w:name="poor-irrelevant-citation"/>
     <w:p>
       <w:pPr>
         <w:pStyle w:val="Heading3"/>
       </w:pPr>
       <w:r>
-        <w:t xml:space="preserve">12.4 Poor (irrelevant citation)</w:t>
+        <w:t xml:space="preserve">13.4 Poor (irrelevant citation)</w:t>
       </w:r>
     </w:p>
     <w:p>
@@ -3188,14 +3552,14 @@
         <w:t xml:space="preserve">: Knuth’s 1984 paper on literate programming doesn’t address Python or data science.</w:t>
       </w:r>
     </w:p>
-    <w:bookmarkEnd w:id="36"/>
-    <w:bookmarkStart w:id="37" w:name="better-relevant-citation"/>
+    <w:bookmarkEnd w:id="42"/>
+    <w:bookmarkStart w:id="43" w:name="better-relevant-citation"/>
     <w:p>
       <w:pPr>
         <w:pStyle w:val="Heading3"/>
       </w:pPr>
       <w:r>
-        <w:t xml:space="preserve">12.5 Better (relevant citation)</w:t>
+        <w:t xml:space="preserve">13.5 Better (relevant citation)</w:t>
       </w:r>
     </w:p>
     <w:p>
@@ -3230,15 +3594,15 @@
         <w:t xml:space="preserve">: The citation is to a current survey of programming language usage.</w:t>
       </w:r>
     </w:p>
-    <w:bookmarkEnd w:id="37"/>
-    <w:bookmarkEnd w:id="38"/>
-    <w:bookmarkStart w:id="49" w:name="conclusion"/>
+    <w:bookmarkEnd w:id="43"/>
+    <w:bookmarkEnd w:id="44"/>
+    <w:bookmarkStart w:id="55" w:name="conclusion"/>
     <w:p>
       <w:pPr>
         <w:pStyle w:val="Heading2"/>
       </w:pPr>
       <w:r>
-        <w:t xml:space="preserve">13 Conclusion</w:t>
+        <w:t xml:space="preserve">14 Conclusion</w:t>
       </w:r>
     </w:p>
     <w:p>
@@ -3291,8 +3655,8 @@
         <w:t xml:space="preserve">add a citation or present direct evidence.</w:t>
       </w:r>
     </w:p>
-    <w:bookmarkStart w:id="48" w:name="refs"/>
-    <w:bookmarkStart w:id="40" w:name="ref-hawkins2004"/>
+    <w:bookmarkStart w:id="54" w:name="refs"/>
+    <w:bookmarkStart w:id="46" w:name="ref-hawkins2004"/>
     <w:p>
       <w:pPr>
         <w:pStyle w:val="Bibliography"/>
@@ -3325,7 +3689,7 @@
       <w:r>
         <w:t xml:space="preserve"> </w:t>
       </w:r>
-      <w:hyperlink r:id="rId39">
+      <w:hyperlink r:id="rId45">
         <w:r>
           <w:rPr>
             <w:rStyle w:val="Hyperlink"/>
@@ -3337,8 +3701,8 @@
         <w:t xml:space="preserve">.</w:t>
       </w:r>
     </w:p>
-    <w:bookmarkEnd w:id="40"/>
-    <w:bookmarkStart w:id="42" w:name="ref-knuth84"/>
+    <w:bookmarkEnd w:id="46"/>
+    <w:bookmarkStart w:id="48" w:name="ref-knuth84"/>
     <w:p>
       <w:pPr>
         <w:pStyle w:val="Bibliography"/>
@@ -3371,7 +3735,7 @@
       <w:r>
         <w:t xml:space="preserve"> </w:t>
       </w:r>
-      <w:hyperlink r:id="rId41">
+      <w:hyperlink r:id="rId47">
         <w:r>
           <w:rPr>
             <w:rStyle w:val="Hyperlink"/>
@@ -3383,8 +3747,8 @@
         <w:t xml:space="preserve">.</w:t>
       </w:r>
     </w:p>
-    <w:bookmarkEnd w:id="42"/>
-    <w:bookmarkStart w:id="43" w:name="ref-mitchell1997"/>
+    <w:bookmarkEnd w:id="48"/>
+    <w:bookmarkStart w:id="49" w:name="ref-mitchell1997"/>
     <w:p>
       <w:pPr>
         <w:pStyle w:val="Bibliography"/>
@@ -3406,8 +3770,8 @@
         <w:t xml:space="preserve">. McGraw-Hill.</w:t>
       </w:r>
     </w:p>
-    <w:bookmarkEnd w:id="43"/>
-    <w:bookmarkStart w:id="45" w:name="ref-stackoverflow2024"/>
+    <w:bookmarkEnd w:id="49"/>
+    <w:bookmarkStart w:id="51" w:name="ref-stackoverflow2024"/>
     <w:p>
       <w:pPr>
         <w:pStyle w:val="Bibliography"/>
@@ -3431,7 +3795,7 @@
       <w:r>
         <w:t xml:space="preserve"> </w:t>
       </w:r>
-      <w:hyperlink r:id="rId44">
+      <w:hyperlink r:id="rId50">
         <w:r>
           <w:rPr>
             <w:rStyle w:val="Hyperlink"/>
@@ -3443,8 +3807,8 @@
         <w:t xml:space="preserve">.</w:t>
       </w:r>
     </w:p>
-    <w:bookmarkEnd w:id="45"/>
-    <w:bookmarkStart w:id="47" w:name="ref-vapnik1998"/>
+    <w:bookmarkEnd w:id="51"/>
+    <w:bookmarkStart w:id="53" w:name="ref-vapnik1998"/>
     <w:p>
       <w:pPr>
         <w:pStyle w:val="Bibliography"/>
@@ -3468,7 +3832,7 @@
       <w:r>
         <w:t xml:space="preserve"> </w:t>
       </w:r>
-      <w:hyperlink r:id="rId46">
+      <w:hyperlink r:id="rId52">
         <w:r>
           <w:rPr>
             <w:rStyle w:val="Hyperlink"/>
@@ -3480,9 +3844,9 @@
         <w:t xml:space="preserve">.</w:t>
       </w:r>
     </w:p>
-    <w:bookmarkEnd w:id="47"/>
-    <w:bookmarkEnd w:id="48"/>
-    <w:bookmarkEnd w:id="49"/>
+    <w:bookmarkEnd w:id="53"/>
+    <w:bookmarkEnd w:id="54"/>
+    <w:bookmarkEnd w:id="55"/>
     <w:sectPr>
       <w:footnotePr>
         <w:numRestart w:val="eachSect"/>
@@ -3824,6 +4188,12 @@
     <w:abstractNumId w:val="991"/>
   </w:num>
   <w:num w:numId="1014">
+    <w:abstractNumId w:val="991"/>
+  </w:num>
+  <w:num w:numId="1015">
+    <w:abstractNumId w:val="991"/>
+  </w:num>
+  <w:num w:numId="1016">
     <w:abstractNumId w:val="99411"/>
     <w:lvlOverride w:ilvl="0">
       <w:startOverride w:val="1"/>
@@ -3853,7 +4223,7 @@
       <w:startOverride w:val="1"/>
     </w:lvlOverride>
   </w:num>
-  <w:num w:numId="1015">
+  <w:num w:numId="1017">
     <w:abstractNumId w:val="991"/>
   </w:num>
 </w:numbering>

</xml_diff>

<commit_message>
Deploying to gh-pages from @ Morrison-Lab/psw@e7b762c5ea0ee21be54c5c032121d93631aa3186 🚀
</commit_message>
<xml_diff>
--- a/chapters/citations-evidence.docx
+++ b/chapters/citations-evidence.docx
@@ -15,7 +15,7 @@
         <w:pStyle w:val="Date"/>
       </w:pPr>
       <w:r>
-        <w:t xml:space="preserve">Last modified: 2026-10-13 13:21:25 (PDT)</w:t>
+        <w:t xml:space="preserve">Last modified: 2026-10-13 15:24:59 (PDT)</w:t>
       </w:r>
     </w:p>
     <w:p>
@@ -2888,13 +2888,13 @@
       </w:r>
     </w:p>
     <w:bookmarkEnd w:id="35"/>
-    <w:bookmarkStart w:id="36" w:name="put-the-content-first"/>
+    <w:bookmarkStart w:id="38" w:name="cite-the-original-for-named-results"/>
     <w:p>
       <w:pPr>
         <w:pStyle w:val="Heading2"/>
       </w:pPr>
       <w:r>
-        <w:t xml:space="preserve">10 Put the content first</w:t>
+        <w:t xml:space="preserve">10 Cite the original for named results</w:t>
       </w:r>
     </w:p>
     <w:p>
@@ -2902,6 +2902,347 @@
         <w:pStyle w:val="FirstParagraph"/>
       </w:pPr>
       <w:r>
+        <w:t xml:space="preserve">When you present a result that carries a person’s name,</w:t>
+      </w:r>
+      <w:r>
+        <w:t xml:space="preserve"> </w:t>
+      </w:r>
+      <w:r>
+        <w:t xml:space="preserve">or whose first appearance is well documented,</w:t>
+      </w:r>
+      <w:r>
+        <w:t xml:space="preserve"> </w:t>
+      </w:r>
+      <w:r>
+        <w:t xml:space="preserve">cite the publication where it first appeared</w:t>
+      </w:r>
+      <w:r>
+        <w:t xml:space="preserve"> </w:t>
+      </w:r>
+      <w:r>
+        <w:t xml:space="preserve">alongside a modern textbook that teaches it.</w:t>
+      </w:r>
+      <w:r>
+        <w:t xml:space="preserve"> </w:t>
+      </w:r>
+      <w:r>
+        <w:t xml:space="preserve">The original shows readers where the result comes from</w:t>
+      </w:r>
+      <w:r>
+        <w:t xml:space="preserve"> </w:t>
+      </w:r>
+      <w:r>
+        <w:t xml:space="preserve">and credits its authors.</w:t>
+      </w:r>
+      <w:r>
+        <w:t xml:space="preserve"> </w:t>
+      </w:r>
+      <w:r>
+        <w:t xml:space="preserve">The textbook is where a student will actually learn it.</w:t>
+      </w:r>
+    </w:p>
+    <w:p>
+      <w:pPr>
+        <w:pStyle w:val="BodyText"/>
+      </w:pPr>
+      <w:r>
+        <w:t xml:space="preserve">Put the historical note in a short remark after the statement and its proof,</w:t>
+      </w:r>
+      <w:r>
+        <w:t xml:space="preserve"> </w:t>
+      </w:r>
+      <w:r>
+        <w:t xml:space="preserve">not inside the definition or theorem itself,</w:t>
+      </w:r>
+      <w:r>
+        <w:t xml:space="preserve"> </w:t>
+      </w:r>
+      <w:r>
+        <w:t xml:space="preserve">so that each theorem div still holds one result.</w:t>
+      </w:r>
+    </w:p>
+    <w:p>
+      <w:pPr>
+        <w:pStyle w:val="BodyText"/>
+      </w:pPr>
+      <w:r>
+        <w:t xml:space="preserve">Apply the rule to:</w:t>
+      </w:r>
+    </w:p>
+    <w:p>
+      <w:pPr>
+        <w:pStyle w:val="Compact"/>
+        <w:numPr>
+          <w:ilvl w:val="0"/>
+          <w:numId w:val="1017"/>
+        </w:numPr>
+      </w:pPr>
+      <w:r>
+        <w:t xml:space="preserve">named theorems, inequalities, and algorithms;</w:t>
+      </w:r>
+    </w:p>
+    <w:p>
+      <w:pPr>
+        <w:pStyle w:val="Compact"/>
+        <w:numPr>
+          <w:ilvl w:val="0"/>
+          <w:numId w:val="1017"/>
+        </w:numPr>
+      </w:pPr>
+      <w:r>
+        <w:t xml:space="preserve">definitions that a specific paper introduced;</w:t>
+      </w:r>
+    </w:p>
+    <w:p>
+      <w:pPr>
+        <w:pStyle w:val="Compact"/>
+        <w:numPr>
+          <w:ilvl w:val="0"/>
+          <w:numId w:val="1017"/>
+        </w:numPr>
+      </w:pPr>
+      <w:r>
+        <w:t xml:space="preserve">results whose usual name is not the whole story,</w:t>
+      </w:r>
+      <w:r>
+        <w:t xml:space="preserve"> </w:t>
+      </w:r>
+      <w:r>
+        <w:t xml:space="preserve">such as Chebyshev’s inequality,</w:t>
+      </w:r>
+      <w:r>
+        <w:t xml:space="preserve"> </w:t>
+      </w:r>
+      <w:r>
+        <w:t xml:space="preserve">which Bienaymé derived earlier.</w:t>
+      </w:r>
+    </w:p>
+    <w:p>
+      <w:pPr>
+        <w:pStyle w:val="FirstParagraph"/>
+      </w:pPr>
+      <w:r>
+        <w:t xml:space="preserve">Do not apply it to:</w:t>
+      </w:r>
+    </w:p>
+    <w:p>
+      <w:pPr>
+        <w:pStyle w:val="Compact"/>
+        <w:numPr>
+          <w:ilvl w:val="0"/>
+          <w:numId w:val="1018"/>
+        </w:numPr>
+      </w:pPr>
+      <w:r>
+        <w:t xml:space="preserve">routine lemmas;</w:t>
+      </w:r>
+    </w:p>
+    <w:p>
+      <w:pPr>
+        <w:pStyle w:val="Compact"/>
+        <w:numPr>
+          <w:ilvl w:val="0"/>
+          <w:numId w:val="1018"/>
+        </w:numPr>
+      </w:pPr>
+      <w:r>
+        <w:t xml:space="preserve">textbook exercises;</w:t>
+      </w:r>
+    </w:p>
+    <w:p>
+      <w:pPr>
+        <w:pStyle w:val="Compact"/>
+        <w:numPr>
+          <w:ilvl w:val="0"/>
+          <w:numId w:val="1018"/>
+        </w:numPr>
+      </w:pPr>
+      <w:r>
+        <w:t xml:space="preserve">results with no identifiable first source.</w:t>
+      </w:r>
+    </w:p>
+    <w:p>
+      <w:pPr>
+        <w:pStyle w:val="FirstParagraph"/>
+      </w:pPr>
+      <w:r>
+        <w:t xml:space="preserve">When the credit is disputed or the first source is unclear,</w:t>
+      </w:r>
+      <w:r>
+        <w:t xml:space="preserve"> </w:t>
+      </w:r>
+      <w:r>
+        <w:t xml:space="preserve">say so in one sentence and cite a history of the result</w:t>
+      </w:r>
+      <w:r>
+        <w:t xml:space="preserve"> </w:t>
+      </w:r>
+      <w:r>
+        <w:t xml:space="preserve">instead of naming a source you have not checked.</w:t>
+      </w:r>
+    </w:p>
+    <w:p>
+      <w:pPr>
+        <w:pStyle w:val="BodyText"/>
+      </w:pPr>
+      <w:r>
+        <w:t xml:space="preserve">Check every detail of the original against an official source, such as:</w:t>
+      </w:r>
+    </w:p>
+    <w:p>
+      <w:pPr>
+        <w:pStyle w:val="Compact"/>
+        <w:numPr>
+          <w:ilvl w:val="0"/>
+          <w:numId w:val="1019"/>
+        </w:numPr>
+      </w:pPr>
+      <w:r>
+        <w:t xml:space="preserve">the publisher;</w:t>
+      </w:r>
+    </w:p>
+    <w:p>
+      <w:pPr>
+        <w:pStyle w:val="Compact"/>
+        <w:numPr>
+          <w:ilvl w:val="0"/>
+          <w:numId w:val="1019"/>
+        </w:numPr>
+      </w:pPr>
+      <w:r>
+        <w:t xml:space="preserve">the journal’s archive;</w:t>
+      </w:r>
+    </w:p>
+    <w:p>
+      <w:pPr>
+        <w:pStyle w:val="Compact"/>
+        <w:numPr>
+          <w:ilvl w:val="0"/>
+          <w:numId w:val="1019"/>
+        </w:numPr>
+      </w:pPr>
+      <w:r>
+        <w:t xml:space="preserve">a library such as</w:t>
+      </w:r>
+      <w:r>
+        <w:t xml:space="preserve"> </w:t>
+      </w:r>
+      <w:hyperlink r:id="rId36">
+        <w:r>
+          <w:rPr>
+            <w:rStyle w:val="Hyperlink"/>
+          </w:rPr>
+          <w:t xml:space="preserve">Numdam</w:t>
+        </w:r>
+      </w:hyperlink>
+      <w:r>
+        <w:t xml:space="preserve">.</w:t>
+      </w:r>
+    </w:p>
+    <w:p>
+      <w:pPr>
+        <w:pStyle w:val="FirstParagraph"/>
+      </w:pPr>
+      <w:r>
+        <w:t xml:space="preserve">Never cite an unauthorized copy,</w:t>
+      </w:r>
+      <w:r>
+        <w:t xml:space="preserve"> </w:t>
+      </w:r>
+      <w:r>
+        <w:t xml:space="preserve">and never fill in a title, volume, or page number from memory.</w:t>
+      </w:r>
+    </w:p>
+    <w:bookmarkStart w:id="37" w:name="exm-cite-original"/>
+    <w:p>
+      <w:pPr>
+        <w:pStyle w:val="BodyText"/>
+      </w:pPr>
+      <w:r>
+        <w:rPr>
+          <w:b/>
+          <w:bCs/>
+        </w:rPr>
+        <w:t xml:space="preserve">Example 3 (Crediting Chebyshev’s inequality)</w:t>
+      </w:r>
+      <w:r>
+        <w:t xml:space="preserve"> </w:t>
+      </w:r>
+      <w:r>
+        <w:t xml:space="preserve"> </w:t>
+      </w:r>
+    </w:p>
+    <w:p>
+      <w:pPr>
+        <w:pStyle w:val="BlockText"/>
+      </w:pPr>
+      <w:r>
+        <w:t xml:space="preserve">❌ Chebyshev’s inequality says that …</w:t>
+      </w:r>
+    </w:p>
+    <w:p>
+      <w:pPr>
+        <w:pStyle w:val="BlockText"/>
+      </w:pPr>
+      <w:r>
+        <w:t xml:space="preserve">✅ Chebyshev’s inequality says that …</w:t>
+      </w:r>
+      <w:r>
+        <w:t xml:space="preserve"> </w:t>
+      </w:r>
+      <w:r>
+        <w:t xml:space="preserve">Bienaymé derived the bound</w:t>
+      </w:r>
+      <w:r>
+        <w:t xml:space="preserve"> </w:t>
+      </w:r>
+      <w:r>
+        <w:t xml:space="preserve">(Bienaymé 1853)</w:t>
+      </w:r>
+      <w:r>
+        <w:t xml:space="preserve">, and Tchébychef proved a more general form</w:t>
+      </w:r>
+      <w:r>
+        <w:t xml:space="preserve"> </w:t>
+      </w:r>
+      <w:r>
+        <w:t xml:space="preserve">(Tchébychef 1867)</w:t>
+      </w:r>
+      <w:r>
+        <w:t xml:space="preserve">.</w:t>
+      </w:r>
+      <w:r>
+        <w:t xml:space="preserve"> </w:t>
+      </w:r>
+      <w:r>
+        <w:t xml:space="preserve">A modern treatment is in</w:t>
+      </w:r>
+      <w:r>
+        <w:t xml:space="preserve"> </w:t>
+      </w:r>
+      <w:r>
+        <w:t xml:space="preserve">Blitzstein and Hwang (2019)</w:t>
+      </w:r>
+      <w:r>
+        <w:t xml:space="preserve">.</w:t>
+      </w:r>
+    </w:p>
+    <w:bookmarkEnd w:id="37"/>
+    <w:bookmarkEnd w:id="38"/>
+    <w:bookmarkStart w:id="39" w:name="put-the-content-first"/>
+    <w:p>
+      <w:pPr>
+        <w:pStyle w:val="Heading2"/>
+      </w:pPr>
+      <w:r>
+        <w:t xml:space="preserve">11 Put the content first</w:t>
+      </w:r>
+    </w:p>
+    <w:p>
+      <w:pPr>
+        <w:pStyle w:val="FirstParagraph"/>
+      </w:pPr>
+      <w:r>
         <w:t xml:space="preserve">Headings and sentences should name the topic, not its author:</w:t>
       </w:r>
       <w:r>
@@ -2941,14 +3282,14 @@
         <w:t xml:space="preserve">without commentary on who said it or where it was repeated.</w:t>
       </w:r>
     </w:p>
-    <w:bookmarkEnd w:id="36"/>
-    <w:bookmarkStart w:id="38" w:name="adapting-another-courses-material"/>
+    <w:bookmarkEnd w:id="39"/>
+    <w:bookmarkStart w:id="41" w:name="adapting-another-courses-material"/>
     <w:p>
       <w:pPr>
         <w:pStyle w:val="Heading2"/>
       </w:pPr>
       <w:r>
-        <w:t xml:space="preserve">11 Adapting another course’s material</w:t>
+        <w:t xml:space="preserve">12 Adapting another course’s material</w:t>
       </w:r>
     </w:p>
     <w:p>
@@ -3187,13 +3528,13 @@
         <w:t xml:space="preserve">:::</w:t>
       </w:r>
     </w:p>
-    <w:bookmarkStart w:id="37" w:name="material-from-your-own-repositories"/>
+    <w:bookmarkStart w:id="40" w:name="material-from-your-own-repositories"/>
     <w:p>
       <w:pPr>
         <w:pStyle w:val="Heading3"/>
       </w:pPr>
       <w:r>
-        <w:t xml:space="preserve">11.1 Material from your own repositories</w:t>
+        <w:t xml:space="preserve">12.1 Material from your own repositories</w:t>
       </w:r>
     </w:p>
     <w:p>
@@ -3229,7 +3570,7 @@
         <w:pStyle w:val="Compact"/>
         <w:numPr>
           <w:ilvl w:val="0"/>
-          <w:numId w:val="1017"/>
+          <w:numId w:val="1020"/>
         </w:numPr>
       </w:pPr>
       <w:r>
@@ -3241,7 +3582,7 @@
         <w:pStyle w:val="Compact"/>
         <w:numPr>
           <w:ilvl w:val="0"/>
-          <w:numId w:val="1017"/>
+          <w:numId w:val="1020"/>
         </w:numPr>
       </w:pPr>
       <w:r>
@@ -3279,7 +3620,7 @@
         <w:pStyle w:val="Compact"/>
         <w:numPr>
           <w:ilvl w:val="0"/>
-          <w:numId w:val="1018"/>
+          <w:numId w:val="1021"/>
         </w:numPr>
       </w:pPr>
       <w:r>
@@ -3303,7 +3644,7 @@
         <w:pStyle w:val="Compact"/>
         <w:numPr>
           <w:ilvl w:val="0"/>
-          <w:numId w:val="1018"/>
+          <w:numId w:val="1021"/>
         </w:numPr>
       </w:pPr>
       <w:r>
@@ -3316,23 +3657,23 @@
         <w:t xml:space="preserve">That link is a cross-reference, not an attribution.</w:t>
       </w:r>
     </w:p>
-    <w:bookmarkEnd w:id="37"/>
-    <w:bookmarkEnd w:id="38"/>
-    <w:bookmarkStart w:id="39" w:name="common-citation-errors-to-avoid"/>
+    <w:bookmarkEnd w:id="40"/>
+    <w:bookmarkEnd w:id="41"/>
+    <w:bookmarkStart w:id="42" w:name="common-citation-errors-to-avoid"/>
     <w:p>
       <w:pPr>
         <w:pStyle w:val="Heading2"/>
       </w:pPr>
       <w:r>
-        <w:t xml:space="preserve">12 Common citation errors to avoid</w:t>
-      </w:r>
-    </w:p>
-    <w:p>
-      <w:pPr>
-        <w:pStyle w:val="Compact"/>
-        <w:numPr>
-          <w:ilvl w:val="0"/>
-          <w:numId w:val="1019"/>
+        <w:t xml:space="preserve">13 Common citation errors to avoid</w:t>
+      </w:r>
+    </w:p>
+    <w:p>
+      <w:pPr>
+        <w:pStyle w:val="Compact"/>
+        <w:numPr>
+          <w:ilvl w:val="0"/>
+          <w:numId w:val="1022"/>
         </w:numPr>
       </w:pPr>
       <w:r>
@@ -3351,7 +3692,7 @@
         <w:pStyle w:val="Compact"/>
         <w:numPr>
           <w:ilvl w:val="0"/>
-          <w:numId w:val="1019"/>
+          <w:numId w:val="1022"/>
         </w:numPr>
       </w:pPr>
       <w:r>
@@ -3382,7 +3723,7 @@
         <w:pStyle w:val="Compact"/>
         <w:numPr>
           <w:ilvl w:val="0"/>
-          <w:numId w:val="1019"/>
+          <w:numId w:val="1022"/>
         </w:numPr>
       </w:pPr>
       <w:r>
@@ -3431,7 +3772,7 @@
         <w:pStyle w:val="Compact"/>
         <w:numPr>
           <w:ilvl w:val="0"/>
-          <w:numId w:val="1019"/>
+          <w:numId w:val="1022"/>
         </w:numPr>
       </w:pPr>
       <w:r>
@@ -3450,7 +3791,7 @@
         <w:pStyle w:val="Compact"/>
         <w:numPr>
           <w:ilvl w:val="0"/>
-          <w:numId w:val="1019"/>
+          <w:numId w:val="1022"/>
         </w:numPr>
       </w:pPr>
       <w:r>
@@ -3469,7 +3810,7 @@
         <w:pStyle w:val="Compact"/>
         <w:numPr>
           <w:ilvl w:val="0"/>
-          <w:numId w:val="1019"/>
+          <w:numId w:val="1022"/>
         </w:numPr>
       </w:pPr>
       <w:r>
@@ -3488,7 +3829,7 @@
         <w:pStyle w:val="Compact"/>
         <w:numPr>
           <w:ilvl w:val="0"/>
-          <w:numId w:val="1019"/>
+          <w:numId w:val="1022"/>
         </w:numPr>
       </w:pPr>
       <w:r>
@@ -3502,23 +3843,23 @@
         <w:t xml:space="preserve">: Failing to cite work that directly influenced your ideas</w:t>
       </w:r>
     </w:p>
-    <w:bookmarkEnd w:id="39"/>
-    <w:bookmarkStart w:id="45" w:name="examples"/>
+    <w:bookmarkEnd w:id="42"/>
+    <w:bookmarkStart w:id="48" w:name="examples"/>
     <w:p>
       <w:pPr>
         <w:pStyle w:val="Heading2"/>
       </w:pPr>
       <w:r>
-        <w:t xml:space="preserve">13 Examples</w:t>
-      </w:r>
-    </w:p>
-    <w:bookmarkStart w:id="40" w:name="poor-unsupported-claim"/>
+        <w:t xml:space="preserve">14 Examples</w:t>
+      </w:r>
+    </w:p>
+    <w:bookmarkStart w:id="43" w:name="poor-unsupported-claim"/>
     <w:p>
       <w:pPr>
         <w:pStyle w:val="Heading3"/>
       </w:pPr>
       <w:r>
-        <w:t xml:space="preserve">13.1 Poor (unsupported claim)</w:t>
+        <w:t xml:space="preserve">14.1 Poor (unsupported claim)</w:t>
       </w:r>
     </w:p>
     <w:p>
@@ -3544,14 +3885,14 @@
         <w:t xml:space="preserve">: This claim is stated as fact without any support.</w:t>
       </w:r>
     </w:p>
-    <w:bookmarkEnd w:id="40"/>
-    <w:bookmarkStart w:id="41" w:name="better-citation-provided"/>
+    <w:bookmarkEnd w:id="43"/>
+    <w:bookmarkStart w:id="44" w:name="better-citation-provided"/>
     <w:p>
       <w:pPr>
         <w:pStyle w:val="Heading3"/>
       </w:pPr>
       <w:r>
-        <w:t xml:space="preserve">13.2 Better (citation provided)</w:t>
+        <w:t xml:space="preserve">14.2 Better (citation provided)</w:t>
       </w:r>
     </w:p>
     <w:p>
@@ -3586,14 +3927,14 @@
         <w:t xml:space="preserve">: Citations provide evidence for the claim.</w:t>
       </w:r>
     </w:p>
-    <w:bookmarkEnd w:id="41"/>
-    <w:bookmarkStart w:id="42" w:name="best-citation-with-context"/>
+    <w:bookmarkEnd w:id="44"/>
+    <w:bookmarkStart w:id="45" w:name="best-citation-with-context"/>
     <w:p>
       <w:pPr>
         <w:pStyle w:val="Heading3"/>
       </w:pPr>
       <w:r>
-        <w:t xml:space="preserve">13.3 Best (citation with context)</w:t>
+        <w:t xml:space="preserve">14.3 Best (citation with context)</w:t>
       </w:r>
     </w:p>
     <w:p>
@@ -3640,14 +3981,14 @@
         <w:t xml:space="preserve">: The specific support each citation provides is explained.</w:t>
       </w:r>
     </w:p>
-    <w:bookmarkEnd w:id="42"/>
-    <w:bookmarkStart w:id="43" w:name="poor-irrelevant-citation"/>
+    <w:bookmarkEnd w:id="45"/>
+    <w:bookmarkStart w:id="46" w:name="poor-irrelevant-citation"/>
     <w:p>
       <w:pPr>
         <w:pStyle w:val="Heading3"/>
       </w:pPr>
       <w:r>
-        <w:t xml:space="preserve">13.4 Poor (irrelevant citation)</w:t>
+        <w:t xml:space="preserve">14.4 Poor (irrelevant citation)</w:t>
       </w:r>
     </w:p>
     <w:p>
@@ -3682,14 +4023,14 @@
         <w:t xml:space="preserve">: Knuth’s 1984 paper on literate programming doesn’t address Python or data science.</w:t>
       </w:r>
     </w:p>
-    <w:bookmarkEnd w:id="43"/>
-    <w:bookmarkStart w:id="44" w:name="better-relevant-citation"/>
+    <w:bookmarkEnd w:id="46"/>
+    <w:bookmarkStart w:id="47" w:name="better-relevant-citation"/>
     <w:p>
       <w:pPr>
         <w:pStyle w:val="Heading3"/>
       </w:pPr>
       <w:r>
-        <w:t xml:space="preserve">13.5 Better (relevant citation)</w:t>
+        <w:t xml:space="preserve">14.5 Better (relevant citation)</w:t>
       </w:r>
     </w:p>
     <w:p>
@@ -3724,15 +4065,15 @@
         <w:t xml:space="preserve">: The citation is to a current survey of programming language usage.</w:t>
       </w:r>
     </w:p>
-    <w:bookmarkEnd w:id="44"/>
-    <w:bookmarkEnd w:id="45"/>
-    <w:bookmarkStart w:id="56" w:name="conclusion"/>
+    <w:bookmarkEnd w:id="47"/>
+    <w:bookmarkEnd w:id="48"/>
+    <w:bookmarkStart w:id="65" w:name="conclusion"/>
     <w:p>
       <w:pPr>
         <w:pStyle w:val="Heading2"/>
       </w:pPr>
       <w:r>
-        <w:t xml:space="preserve">14 Conclusion</w:t>
+        <w:t xml:space="preserve">15 Conclusion</w:t>
       </w:r>
     </w:p>
     <w:p>
@@ -3785,8 +4126,103 @@
         <w:t xml:space="preserve">add a citation or present direct evidence.</w:t>
       </w:r>
     </w:p>
-    <w:bookmarkStart w:id="55" w:name="refs"/>
-    <w:bookmarkStart w:id="47" w:name="ref-hawkins2004"/>
+    <w:bookmarkStart w:id="64" w:name="refs"/>
+    <w:bookmarkStart w:id="50" w:name="ref-bienayme1853"/>
+    <w:p>
+      <w:pPr>
+        <w:pStyle w:val="Bibliography"/>
+      </w:pPr>
+      <w:r>
+        <w:t xml:space="preserve">Bienaymé, Irénée-Jules. 1853.</w:t>
+      </w:r>
+      <w:r>
+        <w:t xml:space="preserve"> </w:t>
+      </w:r>
+      <w:r>
+        <w:t xml:space="preserve">“Considérations à l’appui de La Découverte de</w:t>
+      </w:r>
+      <w:r>
+        <w:t xml:space="preserve"> </w:t>
+      </w:r>
+      <w:r>
+        <w:t xml:space="preserve">Laplace</w:t>
+      </w:r>
+      <w:r>
+        <w:t xml:space="preserve"> </w:t>
+      </w:r>
+      <w:r>
+        <w:t xml:space="preserve">Sur La Loi de Probabilité Dans La Méthode Des Moindres Carrés.”</w:t>
+      </w:r>
+      <w:r>
+        <w:t xml:space="preserve"> </w:t>
+      </w:r>
+      <w:r>
+        <w:rPr>
+          <w:i/>
+          <w:iCs/>
+        </w:rPr>
+        <w:t xml:space="preserve">Comptes Rendus de l’Académie Des Sciences</w:t>
+      </w:r>
+      <w:r>
+        <w:t xml:space="preserve"> </w:t>
+      </w:r>
+      <w:r>
+        <w:t xml:space="preserve">37: 309–24.</w:t>
+      </w:r>
+      <w:r>
+        <w:t xml:space="preserve"> </w:t>
+      </w:r>
+      <w:hyperlink r:id="rId49">
+        <w:r>
+          <w:rPr>
+            <w:rStyle w:val="Hyperlink"/>
+          </w:rPr>
+          <w:t xml:space="preserve">https://www.numdam.org/item/JMPA_1867_2_12__158_0/</w:t>
+        </w:r>
+      </w:hyperlink>
+      <w:r>
+        <w:t xml:space="preserve">.</w:t>
+      </w:r>
+    </w:p>
+    <w:bookmarkEnd w:id="50"/>
+    <w:bookmarkStart w:id="52" w:name="ref-blitzstein2019introduction"/>
+    <w:p>
+      <w:pPr>
+        <w:pStyle w:val="Bibliography"/>
+      </w:pPr>
+      <w:r>
+        <w:t xml:space="preserve">Blitzstein, Joseph K., and Jessica Hwang. 2019.</w:t>
+      </w:r>
+      <w:r>
+        <w:t xml:space="preserve"> </w:t>
+      </w:r>
+      <w:r>
+        <w:rPr>
+          <w:i/>
+          <w:iCs/>
+        </w:rPr>
+        <w:t xml:space="preserve">Introduction to Probability</w:t>
+      </w:r>
+      <w:r>
+        <w:t xml:space="preserve">. 2nd ed. Chapman; Hall/CRC.</w:t>
+      </w:r>
+      <w:r>
+        <w:t xml:space="preserve"> </w:t>
+      </w:r>
+      <w:hyperlink r:id="rId51">
+        <w:r>
+          <w:rPr>
+            <w:rStyle w:val="Hyperlink"/>
+          </w:rPr>
+          <w:t xml:space="preserve">https://doi.org/10.1201/9780429428357</w:t>
+        </w:r>
+      </w:hyperlink>
+      <w:r>
+        <w:t xml:space="preserve">.</w:t>
+      </w:r>
+    </w:p>
+    <w:bookmarkEnd w:id="52"/>
+    <w:bookmarkStart w:id="54" w:name="ref-hawkins2004"/>
     <w:p>
       <w:pPr>
         <w:pStyle w:val="Bibliography"/>
@@ -3819,7 +4255,7 @@
       <w:r>
         <w:t xml:space="preserve"> </w:t>
       </w:r>
-      <w:hyperlink r:id="rId46">
+      <w:hyperlink r:id="rId53">
         <w:r>
           <w:rPr>
             <w:rStyle w:val="Hyperlink"/>
@@ -3831,8 +4267,8 @@
         <w:t xml:space="preserve">.</w:t>
       </w:r>
     </w:p>
-    <w:bookmarkEnd w:id="47"/>
-    <w:bookmarkStart w:id="49" w:name="ref-knuth84"/>
+    <w:bookmarkEnd w:id="54"/>
+    <w:bookmarkStart w:id="56" w:name="ref-knuth84"/>
     <w:p>
       <w:pPr>
         <w:pStyle w:val="Bibliography"/>
@@ -3865,7 +4301,7 @@
       <w:r>
         <w:t xml:space="preserve"> </w:t>
       </w:r>
-      <w:hyperlink r:id="rId48">
+      <w:hyperlink r:id="rId55">
         <w:r>
           <w:rPr>
             <w:rStyle w:val="Hyperlink"/>
@@ -3877,8 +4313,8 @@
         <w:t xml:space="preserve">.</w:t>
       </w:r>
     </w:p>
-    <w:bookmarkEnd w:id="49"/>
-    <w:bookmarkStart w:id="50" w:name="ref-mitchell1997"/>
+    <w:bookmarkEnd w:id="56"/>
+    <w:bookmarkStart w:id="57" w:name="ref-mitchell1997"/>
     <w:p>
       <w:pPr>
         <w:pStyle w:val="Bibliography"/>
@@ -3900,8 +4336,8 @@
         <w:t xml:space="preserve">. McGraw-Hill.</w:t>
       </w:r>
     </w:p>
-    <w:bookmarkEnd w:id="50"/>
-    <w:bookmarkStart w:id="52" w:name="ref-stackoverflow2024"/>
+    <w:bookmarkEnd w:id="57"/>
+    <w:bookmarkStart w:id="59" w:name="ref-stackoverflow2024"/>
     <w:p>
       <w:pPr>
         <w:pStyle w:val="Bibliography"/>
@@ -3925,7 +4361,7 @@
       <w:r>
         <w:t xml:space="preserve"> </w:t>
       </w:r>
-      <w:hyperlink r:id="rId51">
+      <w:hyperlink r:id="rId58">
         <w:r>
           <w:rPr>
             <w:rStyle w:val="Hyperlink"/>
@@ -3937,8 +4373,51 @@
         <w:t xml:space="preserve">.</w:t>
       </w:r>
     </w:p>
-    <w:bookmarkEnd w:id="52"/>
-    <w:bookmarkStart w:id="54" w:name="ref-vapnik1998"/>
+    <w:bookmarkEnd w:id="59"/>
+    <w:bookmarkStart w:id="61" w:name="ref-tchebichef1867"/>
+    <w:p>
+      <w:pPr>
+        <w:pStyle w:val="Bibliography"/>
+      </w:pPr>
+      <w:r>
+        <w:t xml:space="preserve">Tchébychef, P. L. 1867.</w:t>
+      </w:r>
+      <w:r>
+        <w:t xml:space="preserve"> </w:t>
+      </w:r>
+      <w:r>
+        <w:t xml:space="preserve">“Des Valeurs Moyennes.”</w:t>
+      </w:r>
+      <w:r>
+        <w:t xml:space="preserve"> </w:t>
+      </w:r>
+      <w:r>
+        <w:rPr>
+          <w:i/>
+          <w:iCs/>
+        </w:rPr>
+        <w:t xml:space="preserve">Journal de Mathématiques Pures Et Appliquées</w:t>
+      </w:r>
+      <w:r>
+        <w:t xml:space="preserve">, 2nd series, vol. 12: 177–84.</w:t>
+      </w:r>
+      <w:r>
+        <w:t xml:space="preserve"> </w:t>
+      </w:r>
+      <w:hyperlink r:id="rId60">
+        <w:r>
+          <w:rPr>
+            <w:rStyle w:val="Hyperlink"/>
+          </w:rPr>
+          <w:t xml:space="preserve">https://www.numdam.org/item/JMPA_1867_2_12__177_0/</w:t>
+        </w:r>
+      </w:hyperlink>
+      <w:r>
+        <w:t xml:space="preserve">.</w:t>
+      </w:r>
+    </w:p>
+    <w:bookmarkEnd w:id="61"/>
+    <w:bookmarkStart w:id="63" w:name="ref-vapnik1998"/>
     <w:p>
       <w:pPr>
         <w:pStyle w:val="Bibliography"/>
@@ -3962,7 +4441,7 @@
       <w:r>
         <w:t xml:space="preserve"> </w:t>
       </w:r>
-      <w:hyperlink r:id="rId53">
+      <w:hyperlink r:id="rId62">
         <w:r>
           <w:rPr>
             <w:rStyle w:val="Hyperlink"/>
@@ -3974,9 +4453,9 @@
         <w:t xml:space="preserve">.</w:t>
       </w:r>
     </w:p>
-    <w:bookmarkEnd w:id="54"/>
-    <w:bookmarkEnd w:id="55"/>
-    <w:bookmarkEnd w:id="56"/>
+    <w:bookmarkEnd w:id="63"/>
+    <w:bookmarkEnd w:id="64"/>
+    <w:bookmarkEnd w:id="65"/>
     <w:sectPr>
       <w:footnotePr>
         <w:numRestart w:val="eachSect"/>
@@ -4360,6 +4839,15 @@
     <w:abstractNumId w:val="991"/>
   </w:num>
   <w:num w:numId="1019">
+    <w:abstractNumId w:val="991"/>
+  </w:num>
+  <w:num w:numId="1020">
+    <w:abstractNumId w:val="991"/>
+  </w:num>
+  <w:num w:numId="1021">
+    <w:abstractNumId w:val="991"/>
+  </w:num>
+  <w:num w:numId="1022">
     <w:abstractNumId w:val="991"/>
   </w:num>
 </w:numbering>

</xml_diff>

<commit_message>
Deploying to gh-pages from @ Morrison-Lab/psw@c8b28a894790bdcfa7f4d831fad8f8224fa19170 🚀
</commit_message>
<xml_diff>
--- a/chapters/citations-evidence.docx
+++ b/chapters/citations-evidence.docx
@@ -15,7 +15,7 @@
         <w:pStyle w:val="Date"/>
       </w:pPr>
       <w:r>
-        <w:t xml:space="preserve">Last modified: 2026-10-15 12:42:12 (PDT)</w:t>
+        <w:t xml:space="preserve">Last modified: 2026-10-15 12:46:23 (PDT)</w:t>
       </w:r>
     </w:p>
     <w:p>
@@ -2288,7 +2288,7 @@
       </w:r>
     </w:p>
     <w:bookmarkEnd w:id="27"/>
-    <w:bookmarkStart w:id="33" w:name="link-liberally"/>
+    <w:bookmarkStart w:id="34" w:name="link-liberally"/>
     <w:p>
       <w:pPr>
         <w:pStyle w:val="Heading2"/>
@@ -2368,12 +2368,61 @@
         </w:numPr>
       </w:pPr>
       <w:r>
+        <w:t xml:space="preserve">a definition, theorem or named method to its</w:t>
+      </w:r>
+      <w:r>
+        <w:t xml:space="preserve"> </w:t>
+      </w:r>
+      <w:hyperlink r:id="rId28">
+        <w:r>
+          <w:rPr>
+            <w:rStyle w:val="Hyperlink"/>
+          </w:rPr>
+          <w:t xml:space="preserve">Wikipedia</w:t>
+        </w:r>
+      </w:hyperlink>
+      <w:r>
+        <w:t xml:space="preserve"> </w:t>
+      </w:r>
+      <w:r>
+        <w:t xml:space="preserve">article, when one exists</w:t>
+      </w:r>
+      <w:r>
+        <w:t xml:space="preserve"> </w:t>
+      </w:r>
+      <w:r>
+        <w:t xml:space="preserve">(see</w:t>
+      </w:r>
+      <w:r>
+        <w:t xml:space="preserve"> </w:t>
+      </w:r>
+      <w:hyperlink w:anchor="link-to-wikipedia-but-do-not-cite-it">
+        <w:r>
+          <w:rPr>
+            <w:rStyle w:val="Hyperlink"/>
+          </w:rPr>
+          <w:t xml:space="preserve">Link to Wikipedia, but do not cite it</w:t>
+        </w:r>
+      </w:hyperlink>
+      <w:r>
+        <w:t xml:space="preserve">);</w:t>
+      </w:r>
+    </w:p>
+    <w:p>
+      <w:pPr>
+        <w:pStyle w:val="Compact"/>
+        <w:numPr>
+          <w:ilvl w:val="0"/>
+          <w:numId w:val="1014"/>
+        </w:numPr>
+      </w:pPr>
+      <w:r>
         <w:t xml:space="preserve">a cited source to its</w:t>
       </w:r>
       <w:r>
         <w:t xml:space="preserve"> </w:t>
       </w:r>
-      <w:hyperlink r:id="rId28">
+      <w:hyperlink r:id="rId29">
         <w:r>
           <w:rPr>
             <w:rStyle w:val="Hyperlink"/>
@@ -2428,7 +2477,7 @@
       <w:r>
         <w:t xml:space="preserve"> </w:t>
       </w:r>
-      <w:hyperlink r:id="rId29">
+      <w:hyperlink r:id="rId30">
         <w:r>
           <w:rPr>
             <w:rStyle w:val="Hyperlink"/>
@@ -2537,7 +2586,7 @@
         <w:t xml:space="preserve">the target is unstable, and a stable alternative such as a DOI exists.</w:t>
       </w:r>
     </w:p>
-    <w:bookmarkStart w:id="32" w:name="exm-link-liberally"/>
+    <w:bookmarkStart w:id="33" w:name="exm-link-liberally"/>
     <w:p>
       <w:pPr>
         <w:pStyle w:val="FirstParagraph"/>
@@ -2580,7 +2629,7 @@
       <w:r>
         <w:t xml:space="preserve"> </w:t>
       </w:r>
-      <w:hyperlink r:id="rId30">
+      <w:hyperlink r:id="rId31">
         <w:r>
           <w:rPr>
             <w:rStyle w:val="Hyperlink"/>
@@ -2603,7 +2652,7 @@
       <w:r>
         <w:t xml:space="preserve"> </w:t>
       </w:r>
-      <w:hyperlink r:id="rId31">
+      <w:hyperlink r:id="rId32">
         <w:r>
           <w:rPr>
             <w:rStyle w:val="Hyperlink"/>
@@ -2650,15 +2699,15 @@
         <w:t xml:space="preserve">can now follow the link instead of searching.</w:t>
       </w:r>
     </w:p>
-    <w:bookmarkEnd w:id="32"/>
     <w:bookmarkEnd w:id="33"/>
-    <w:bookmarkStart w:id="34" w:name="best-practices"/>
+    <w:bookmarkEnd w:id="34"/>
+    <w:bookmarkStart w:id="37" w:name="link-to-wikipedia-but-do-not-cite-it"/>
     <w:p>
       <w:pPr>
         <w:pStyle w:val="Heading2"/>
       </w:pPr>
       <w:r>
-        <w:t xml:space="preserve">8 Best practices</w:t>
+        <w:t xml:space="preserve">8 Link to Wikipedia, but do not cite it</w:t>
       </w:r>
     </w:p>
     <w:p>
@@ -2666,6 +2715,280 @@
         <w:pStyle w:val="FirstParagraph"/>
       </w:pPr>
       <w:r>
+        <w:t xml:space="preserve">Wikipedia is free to every reader,</w:t>
+      </w:r>
+      <w:r>
+        <w:t xml:space="preserve"> </w:t>
+      </w:r>
+      <w:r>
+        <w:t xml:space="preserve">and its articles on definitions, theorems and methods are usually reliable enough</w:t>
+      </w:r>
+      <w:r>
+        <w:t xml:space="preserve"> </w:t>
+      </w:r>
+      <w:r>
+        <w:t xml:space="preserve">to orient a newcomer.</w:t>
+      </w:r>
+      <w:r>
+        <w:t xml:space="preserve"> </w:t>
+      </w:r>
+      <w:r>
+        <w:t xml:space="preserve">So link each definition, theorem or named method to its Wikipedia article whenever one exists:</w:t>
+      </w:r>
+      <w:r>
+        <w:t xml:space="preserve"> </w:t>
+      </w:r>
+      <w:r>
+        <w:t xml:space="preserve">the link gives readers a second, free explanation</w:t>
+      </w:r>
+      <w:r>
+        <w:t xml:space="preserve"> </w:t>
+      </w:r>
+      <w:r>
+        <w:t xml:space="preserve">without leaving them to search for it.</w:t>
+      </w:r>
+    </w:p>
+    <w:p>
+      <w:pPr>
+        <w:pStyle w:val="BodyText"/>
+      </w:pPr>
+      <w:r>
+        <w:t xml:space="preserve">Link, however, does not mean cite.</w:t>
+      </w:r>
+      <w:r>
+        <w:t xml:space="preserve"> </w:t>
+      </w:r>
+      <w:r>
+        <w:t xml:space="preserve">The link tells the reader where to read more;</w:t>
+      </w:r>
+      <w:r>
+        <w:t xml:space="preserve"> </w:t>
+      </w:r>
+      <w:r>
+        <w:t xml:space="preserve">the evidence for a claim still comes from the primary source,</w:t>
+      </w:r>
+      <w:r>
+        <w:t xml:space="preserve"> </w:t>
+      </w:r>
+      <w:r>
+        <w:t xml:space="preserve">as</w:t>
+      </w:r>
+      <w:r>
+        <w:t xml:space="preserve"> </w:t>
+      </w:r>
+      <w:hyperlink w:anchor="sources-to-generally-avoid">
+        <w:r>
+          <w:rPr>
+            <w:rStyle w:val="Hyperlink"/>
+          </w:rPr>
+          <w:t xml:space="preserve">Sources to generally avoid</w:t>
+        </w:r>
+      </w:hyperlink>
+      <w:r>
+        <w:t xml:space="preserve"> </w:t>
+      </w:r>
+      <w:r>
+        <w:t xml:space="preserve">explains.</w:t>
+      </w:r>
+      <w:r>
+        <w:t xml:space="preserve"> </w:t>
+      </w:r>
+      <w:r>
+        <w:t xml:space="preserve">When you do both, put the Wikipedia link beside the definition</w:t>
+      </w:r>
+      <w:r>
+        <w:t xml:space="preserve"> </w:t>
+      </w:r>
+      <w:r>
+        <w:t xml:space="preserve">and the citation beside the claim.</w:t>
+      </w:r>
+    </w:p>
+    <w:p>
+      <w:pPr>
+        <w:pStyle w:val="Compact"/>
+        <w:numPr>
+          <w:ilvl w:val="0"/>
+          <w:numId w:val="1016"/>
+        </w:numPr>
+      </w:pPr>
+      <w:r>
+        <w:t xml:space="preserve">Link the article for the specific concept, not a broader article that mentions it.</w:t>
+      </w:r>
+    </w:p>
+    <w:p>
+      <w:pPr>
+        <w:pStyle w:val="Compact"/>
+        <w:numPr>
+          <w:ilvl w:val="0"/>
+          <w:numId w:val="1016"/>
+        </w:numPr>
+      </w:pPr>
+      <w:r>
+        <w:t xml:space="preserve">Read the article’s definition before linking it,</w:t>
+      </w:r>
+      <w:r>
+        <w:t xml:space="preserve"> </w:t>
+      </w:r>
+      <w:r>
+        <w:t xml:space="preserve">because notation and conventions vary,</w:t>
+      </w:r>
+      <w:r>
+        <w:t xml:space="preserve"> </w:t>
+      </w:r>
+      <w:r>
+        <w:t xml:space="preserve">and a reader who follows the link should find the same concept you defined.</w:t>
+      </w:r>
+      <w:r>
+        <w:t xml:space="preserve"> </w:t>
+      </w:r>
+      <w:r>
+        <w:t xml:space="preserve">If the article’s convention differs from yours, say how.</w:t>
+      </w:r>
+    </w:p>
+    <w:p>
+      <w:pPr>
+        <w:pStyle w:val="Compact"/>
+        <w:numPr>
+          <w:ilvl w:val="0"/>
+          <w:numId w:val="1016"/>
+        </w:numPr>
+      </w:pPr>
+      <w:r>
+        <w:t xml:space="preserve">Use a stable link to the article, not to a search result.</w:t>
+      </w:r>
+    </w:p>
+    <w:p>
+      <w:pPr>
+        <w:pStyle w:val="Compact"/>
+        <w:numPr>
+          <w:ilvl w:val="0"/>
+          <w:numId w:val="1016"/>
+        </w:numPr>
+      </w:pPr>
+      <w:r>
+        <w:t xml:space="preserve">Link a term once where it is defined, not at every use;</w:t>
+      </w:r>
+      <w:r>
+        <w:t xml:space="preserve"> </w:t>
+      </w:r>
+      <w:r>
+        <w:t xml:space="preserve">later uses link to your own definition.</w:t>
+      </w:r>
+    </w:p>
+    <w:bookmarkStart w:id="36" w:name="exm-link-wikipedia"/>
+    <w:p>
+      <w:pPr>
+        <w:pStyle w:val="FirstParagraph"/>
+      </w:pPr>
+      <w:r>
+        <w:rPr>
+          <w:b/>
+          <w:bCs/>
+        </w:rPr>
+        <w:t xml:space="preserve">Example 3 (Linking a definition to Wikipedia)</w:t>
+      </w:r>
+      <w:r>
+        <w:t xml:space="preserve"> </w:t>
+      </w:r>
+      <w:r>
+        <w:t xml:space="preserve"> </w:t>
+      </w:r>
+    </w:p>
+    <w:p>
+      <w:pPr>
+        <w:pStyle w:val="BlockText"/>
+      </w:pPr>
+      <w:r>
+        <w:t xml:space="preserve">❌ A</w:t>
+      </w:r>
+      <w:r>
+        <w:t xml:space="preserve"> </w:t>
+      </w:r>
+      <w:r>
+        <w:rPr>
+          <w:i/>
+          <w:iCs/>
+        </w:rPr>
+        <w:t xml:space="preserve">Poisson random variable</w:t>
+      </w:r>
+      <w:r>
+        <w:t xml:space="preserve"> </w:t>
+      </w:r>
+      <w:r>
+        <w:t xml:space="preserve">counts events in a fixed interval.</w:t>
+      </w:r>
+    </w:p>
+    <w:p>
+      <w:pPr>
+        <w:pStyle w:val="BlockText"/>
+      </w:pPr>
+      <w:r>
+        <w:t xml:space="preserve">✅ A</w:t>
+      </w:r>
+      <w:r>
+        <w:t xml:space="preserve"> </w:t>
+      </w:r>
+      <w:r>
+        <w:rPr>
+          <w:i/>
+          <w:iCs/>
+        </w:rPr>
+        <w:t xml:space="preserve">Poisson random variable</w:t>
+      </w:r>
+      <w:r>
+        <w:t xml:space="preserve"> </w:t>
+      </w:r>
+      <w:r>
+        <w:t xml:space="preserve">counts events in a fixed interval</w:t>
+      </w:r>
+      <w:r>
+        <w:t xml:space="preserve"> </w:t>
+      </w:r>
+      <w:r>
+        <w:t xml:space="preserve">(</w:t>
+      </w:r>
+      <w:hyperlink r:id="rId35">
+        <w:r>
+          <w:rPr>
+            <w:rStyle w:val="Hyperlink"/>
+          </w:rPr>
+          <w:t xml:space="preserve">Wikipedia: Poisson distribution</w:t>
+        </w:r>
+      </w:hyperlink>
+      <w:r>
+        <w:t xml:space="preserve">).</w:t>
+      </w:r>
+    </w:p>
+    <w:p>
+      <w:pPr>
+        <w:pStyle w:val="FirstParagraph"/>
+      </w:pPr>
+      <w:r>
+        <w:t xml:space="preserve">A reader who wants another presentation of the Poisson distribution now has one,</w:t>
+      </w:r>
+      <w:r>
+        <w:t xml:space="preserve"> </w:t>
+      </w:r>
+      <w:r>
+        <w:t xml:space="preserve">and the definition itself still comes from your own text.</w:t>
+      </w:r>
+    </w:p>
+    <w:bookmarkEnd w:id="36"/>
+    <w:bookmarkEnd w:id="37"/>
+    <w:bookmarkStart w:id="38" w:name="best-practices"/>
+    <w:p>
+      <w:pPr>
+        <w:pStyle w:val="Heading2"/>
+      </w:pPr>
+      <w:r>
+        <w:t xml:space="preserve">9 Best practices</w:t>
+      </w:r>
+    </w:p>
+    <w:p>
+      <w:pPr>
+        <w:pStyle w:val="FirstParagraph"/>
+      </w:pPr>
+      <w:r>
         <w:t xml:space="preserve">To effectively support your claims:</w:t>
       </w:r>
     </w:p>
@@ -2674,7 +2997,7 @@
         <w:pStyle w:val="Compact"/>
         <w:numPr>
           <w:ilvl w:val="0"/>
-          <w:numId w:val="1016"/>
+          <w:numId w:val="1017"/>
         </w:numPr>
       </w:pPr>
       <w:r>
@@ -2699,7 +3022,7 @@
         <w:pStyle w:val="Compact"/>
         <w:numPr>
           <w:ilvl w:val="0"/>
-          <w:numId w:val="1016"/>
+          <w:numId w:val="1017"/>
         </w:numPr>
       </w:pPr>
       <w:r>
@@ -2718,7 +3041,7 @@
         <w:pStyle w:val="Compact"/>
         <w:numPr>
           <w:ilvl w:val="0"/>
-          <w:numId w:val="1016"/>
+          <w:numId w:val="1017"/>
         </w:numPr>
       </w:pPr>
       <w:r>
@@ -2737,7 +3060,7 @@
         <w:pStyle w:val="Compact"/>
         <w:numPr>
           <w:ilvl w:val="0"/>
-          <w:numId w:val="1016"/>
+          <w:numId w:val="1017"/>
         </w:numPr>
       </w:pPr>
       <w:r>
@@ -2777,7 +3100,7 @@
         <w:pStyle w:val="Compact"/>
         <w:numPr>
           <w:ilvl w:val="0"/>
-          <w:numId w:val="1016"/>
+          <w:numId w:val="1017"/>
         </w:numPr>
       </w:pPr>
       <w:r>
@@ -2796,7 +3119,7 @@
         <w:pStyle w:val="Compact"/>
         <w:numPr>
           <w:ilvl w:val="0"/>
-          <w:numId w:val="1016"/>
+          <w:numId w:val="1017"/>
         </w:numPr>
       </w:pPr>
       <w:r>
@@ -2815,7 +3138,7 @@
         <w:pStyle w:val="Compact"/>
         <w:numPr>
           <w:ilvl w:val="0"/>
-          <w:numId w:val="1016"/>
+          <w:numId w:val="1017"/>
         </w:numPr>
       </w:pPr>
       <w:r>
@@ -2829,14 +3152,14 @@
         <w:t xml:space="preserve">: When possible, include work from different research groups and perspectives</w:t>
       </w:r>
     </w:p>
-    <w:bookmarkEnd w:id="34"/>
-    <w:bookmarkStart w:id="35" w:name="quote-the-original"/>
+    <w:bookmarkEnd w:id="38"/>
+    <w:bookmarkStart w:id="39" w:name="quote-the-original"/>
     <w:p>
       <w:pPr>
         <w:pStyle w:val="Heading2"/>
       </w:pPr>
       <w:r>
-        <w:t xml:space="preserve">9 Quote the original</w:t>
+        <w:t xml:space="preserve">10 Quote the original</w:t>
       </w:r>
     </w:p>
     <w:p>
@@ -2887,14 +3210,14 @@
         <w:t xml:space="preserve">(Mitchell 1997)</w:t>
       </w:r>
     </w:p>
-    <w:bookmarkEnd w:id="35"/>
-    <w:bookmarkStart w:id="38" w:name="cite-the-original-for-named-results"/>
+    <w:bookmarkEnd w:id="39"/>
+    <w:bookmarkStart w:id="42" w:name="cite-the-original-for-named-results"/>
     <w:p>
       <w:pPr>
         <w:pStyle w:val="Heading2"/>
       </w:pPr>
       <w:r>
-        <w:t xml:space="preserve">10 Cite the original for named results</w:t>
+        <w:t xml:space="preserve">11 Cite the original for named results</w:t>
       </w:r>
     </w:p>
     <w:p>
@@ -2974,7 +3297,7 @@
         <w:pStyle w:val="Compact"/>
         <w:numPr>
           <w:ilvl w:val="0"/>
-          <w:numId w:val="1017"/>
+          <w:numId w:val="1018"/>
         </w:numPr>
       </w:pPr>
       <w:r>
@@ -2986,7 +3309,7 @@
         <w:pStyle w:val="Compact"/>
         <w:numPr>
           <w:ilvl w:val="0"/>
-          <w:numId w:val="1017"/>
+          <w:numId w:val="1018"/>
         </w:numPr>
       </w:pPr>
       <w:r>
@@ -2998,7 +3321,7 @@
         <w:pStyle w:val="Compact"/>
         <w:numPr>
           <w:ilvl w:val="0"/>
-          <w:numId w:val="1017"/>
+          <w:numId w:val="1018"/>
         </w:numPr>
       </w:pPr>
       <w:r>
@@ -3030,7 +3353,7 @@
         <w:pStyle w:val="Compact"/>
         <w:numPr>
           <w:ilvl w:val="0"/>
-          <w:numId w:val="1018"/>
+          <w:numId w:val="1019"/>
         </w:numPr>
       </w:pPr>
       <w:r>
@@ -3042,7 +3365,7 @@
         <w:pStyle w:val="Compact"/>
         <w:numPr>
           <w:ilvl w:val="0"/>
-          <w:numId w:val="1018"/>
+          <w:numId w:val="1019"/>
         </w:numPr>
       </w:pPr>
       <w:r>
@@ -3054,7 +3377,7 @@
         <w:pStyle w:val="Compact"/>
         <w:numPr>
           <w:ilvl w:val="0"/>
-          <w:numId w:val="1018"/>
+          <w:numId w:val="1019"/>
         </w:numPr>
       </w:pPr>
       <w:r>
@@ -3094,7 +3417,7 @@
         <w:pStyle w:val="Compact"/>
         <w:numPr>
           <w:ilvl w:val="0"/>
-          <w:numId w:val="1019"/>
+          <w:numId w:val="1020"/>
         </w:numPr>
       </w:pPr>
       <w:r>
@@ -3106,7 +3429,7 @@
         <w:pStyle w:val="Compact"/>
         <w:numPr>
           <w:ilvl w:val="0"/>
-          <w:numId w:val="1019"/>
+          <w:numId w:val="1020"/>
         </w:numPr>
       </w:pPr>
       <w:r>
@@ -3118,7 +3441,7 @@
         <w:pStyle w:val="Compact"/>
         <w:numPr>
           <w:ilvl w:val="0"/>
-          <w:numId w:val="1019"/>
+          <w:numId w:val="1020"/>
         </w:numPr>
       </w:pPr>
       <w:r>
@@ -3127,7 +3450,7 @@
       <w:r>
         <w:t xml:space="preserve"> </w:t>
       </w:r>
-      <w:hyperlink r:id="rId36">
+      <w:hyperlink r:id="rId40">
         <w:r>
           <w:rPr>
             <w:rStyle w:val="Hyperlink"/>
@@ -3153,7 +3476,7 @@
         <w:t xml:space="preserve">and never fill in a title, volume, or page number from memory.</w:t>
       </w:r>
     </w:p>
-    <w:bookmarkStart w:id="37" w:name="exm-cite-original"/>
+    <w:bookmarkStart w:id="41" w:name="exm-cite-original"/>
     <w:p>
       <w:pPr>
         <w:pStyle w:val="BodyText"/>
@@ -3163,7 +3486,7 @@
           <w:b/>
           <w:bCs/>
         </w:rPr>
-        <w:t xml:space="preserve">Example 3 (Crediting Chebyshev’s inequality)</w:t>
+        <w:t xml:space="preserve">Example 4 (Crediting Chebyshev’s inequality)</w:t>
       </w:r>
       <w:r>
         <w:t xml:space="preserve"> </w:t>
@@ -3227,15 +3550,15 @@
         <w:t xml:space="preserve">.</w:t>
       </w:r>
     </w:p>
-    <w:bookmarkEnd w:id="37"/>
-    <w:bookmarkEnd w:id="38"/>
-    <w:bookmarkStart w:id="39" w:name="put-the-content-first"/>
+    <w:bookmarkEnd w:id="41"/>
+    <w:bookmarkEnd w:id="42"/>
+    <w:bookmarkStart w:id="43" w:name="put-the-content-first"/>
     <w:p>
       <w:pPr>
         <w:pStyle w:val="Heading2"/>
       </w:pPr>
       <w:r>
-        <w:t xml:space="preserve">11 Put the content first</w:t>
+        <w:t xml:space="preserve">12 Put the content first</w:t>
       </w:r>
     </w:p>
     <w:p>
@@ -3282,14 +3605,14 @@
         <w:t xml:space="preserve">without commentary on who said it or where it was repeated.</w:t>
       </w:r>
     </w:p>
-    <w:bookmarkEnd w:id="39"/>
-    <w:bookmarkStart w:id="41" w:name="adapting-another-courses-material"/>
+    <w:bookmarkEnd w:id="43"/>
+    <w:bookmarkStart w:id="45" w:name="adapting-another-courses-material"/>
     <w:p>
       <w:pPr>
         <w:pStyle w:val="Heading2"/>
       </w:pPr>
       <w:r>
-        <w:t xml:space="preserve">12 Adapting another course’s material</w:t>
+        <w:t xml:space="preserve">13 Adapting another course’s material</w:t>
       </w:r>
     </w:p>
     <w:p>
@@ -3528,13 +3851,13 @@
         <w:t xml:space="preserve">:::</w:t>
       </w:r>
     </w:p>
-    <w:bookmarkStart w:id="40" w:name="material-from-your-own-repositories"/>
+    <w:bookmarkStart w:id="44" w:name="material-from-your-own-repositories"/>
     <w:p>
       <w:pPr>
         <w:pStyle w:val="Heading3"/>
       </w:pPr>
       <w:r>
-        <w:t xml:space="preserve">12.1 Material from your own repositories</w:t>
+        <w:t xml:space="preserve">13.1 Material from your own repositories</w:t>
       </w:r>
     </w:p>
     <w:p>
@@ -3570,7 +3893,7 @@
         <w:pStyle w:val="Compact"/>
         <w:numPr>
           <w:ilvl w:val="0"/>
-          <w:numId w:val="1020"/>
+          <w:numId w:val="1021"/>
         </w:numPr>
       </w:pPr>
       <w:r>
@@ -3582,7 +3905,7 @@
         <w:pStyle w:val="Compact"/>
         <w:numPr>
           <w:ilvl w:val="0"/>
-          <w:numId w:val="1020"/>
+          <w:numId w:val="1021"/>
         </w:numPr>
       </w:pPr>
       <w:r>
@@ -3620,7 +3943,7 @@
         <w:pStyle w:val="Compact"/>
         <w:numPr>
           <w:ilvl w:val="0"/>
-          <w:numId w:val="1021"/>
+          <w:numId w:val="1022"/>
         </w:numPr>
       </w:pPr>
       <w:r>
@@ -3644,7 +3967,7 @@
         <w:pStyle w:val="Compact"/>
         <w:numPr>
           <w:ilvl w:val="0"/>
-          <w:numId w:val="1021"/>
+          <w:numId w:val="1022"/>
         </w:numPr>
       </w:pPr>
       <w:r>
@@ -3657,23 +3980,23 @@
         <w:t xml:space="preserve">That link is a cross-reference, not an attribution.</w:t>
       </w:r>
     </w:p>
-    <w:bookmarkEnd w:id="40"/>
-    <w:bookmarkEnd w:id="41"/>
-    <w:bookmarkStart w:id="42" w:name="common-citation-errors-to-avoid"/>
+    <w:bookmarkEnd w:id="44"/>
+    <w:bookmarkEnd w:id="45"/>
+    <w:bookmarkStart w:id="46" w:name="common-citation-errors-to-avoid"/>
     <w:p>
       <w:pPr>
         <w:pStyle w:val="Heading2"/>
       </w:pPr>
       <w:r>
-        <w:t xml:space="preserve">13 Common citation errors to avoid</w:t>
-      </w:r>
-    </w:p>
-    <w:p>
-      <w:pPr>
-        <w:pStyle w:val="Compact"/>
-        <w:numPr>
-          <w:ilvl w:val="0"/>
-          <w:numId w:val="1022"/>
+        <w:t xml:space="preserve">14 Common citation errors to avoid</w:t>
+      </w:r>
+    </w:p>
+    <w:p>
+      <w:pPr>
+        <w:pStyle w:val="Compact"/>
+        <w:numPr>
+          <w:ilvl w:val="0"/>
+          <w:numId w:val="1023"/>
         </w:numPr>
       </w:pPr>
       <w:r>
@@ -3692,7 +4015,7 @@
         <w:pStyle w:val="Compact"/>
         <w:numPr>
           <w:ilvl w:val="0"/>
-          <w:numId w:val="1022"/>
+          <w:numId w:val="1023"/>
         </w:numPr>
       </w:pPr>
       <w:r>
@@ -3723,7 +4046,7 @@
         <w:pStyle w:val="Compact"/>
         <w:numPr>
           <w:ilvl w:val="0"/>
-          <w:numId w:val="1022"/>
+          <w:numId w:val="1023"/>
         </w:numPr>
       </w:pPr>
       <w:r>
@@ -3772,7 +4095,7 @@
         <w:pStyle w:val="Compact"/>
         <w:numPr>
           <w:ilvl w:val="0"/>
-          <w:numId w:val="1022"/>
+          <w:numId w:val="1023"/>
         </w:numPr>
       </w:pPr>
       <w:r>
@@ -3791,7 +4114,7 @@
         <w:pStyle w:val="Compact"/>
         <w:numPr>
           <w:ilvl w:val="0"/>
-          <w:numId w:val="1022"/>
+          <w:numId w:val="1023"/>
         </w:numPr>
       </w:pPr>
       <w:r>
@@ -3810,7 +4133,7 @@
         <w:pStyle w:val="Compact"/>
         <w:numPr>
           <w:ilvl w:val="0"/>
-          <w:numId w:val="1022"/>
+          <w:numId w:val="1023"/>
         </w:numPr>
       </w:pPr>
       <w:r>
@@ -3829,7 +4152,7 @@
         <w:pStyle w:val="Compact"/>
         <w:numPr>
           <w:ilvl w:val="0"/>
-          <w:numId w:val="1022"/>
+          <w:numId w:val="1023"/>
         </w:numPr>
       </w:pPr>
       <w:r>
@@ -3843,23 +4166,23 @@
         <w:t xml:space="preserve">: Failing to cite work that directly influenced your ideas</w:t>
       </w:r>
     </w:p>
-    <w:bookmarkEnd w:id="42"/>
-    <w:bookmarkStart w:id="48" w:name="examples"/>
+    <w:bookmarkEnd w:id="46"/>
+    <w:bookmarkStart w:id="52" w:name="examples"/>
     <w:p>
       <w:pPr>
         <w:pStyle w:val="Heading2"/>
       </w:pPr>
       <w:r>
-        <w:t xml:space="preserve">14 Examples</w:t>
-      </w:r>
-    </w:p>
-    <w:bookmarkStart w:id="43" w:name="poor-unsupported-claim"/>
+        <w:t xml:space="preserve">15 Examples</w:t>
+      </w:r>
+    </w:p>
+    <w:bookmarkStart w:id="47" w:name="poor-unsupported-claim"/>
     <w:p>
       <w:pPr>
         <w:pStyle w:val="Heading3"/>
       </w:pPr>
       <w:r>
-        <w:t xml:space="preserve">14.1 Poor (unsupported claim)</w:t>
+        <w:t xml:space="preserve">15.1 Poor (unsupported claim)</w:t>
       </w:r>
     </w:p>
     <w:p>
@@ -3885,14 +4208,14 @@
         <w:t xml:space="preserve">: This claim is stated as fact without any support.</w:t>
       </w:r>
     </w:p>
-    <w:bookmarkEnd w:id="43"/>
-    <w:bookmarkStart w:id="44" w:name="better-citation-provided"/>
+    <w:bookmarkEnd w:id="47"/>
+    <w:bookmarkStart w:id="48" w:name="better-citation-provided"/>
     <w:p>
       <w:pPr>
         <w:pStyle w:val="Heading3"/>
       </w:pPr>
       <w:r>
-        <w:t xml:space="preserve">14.2 Better (citation provided)</w:t>
+        <w:t xml:space="preserve">15.2 Better (citation provided)</w:t>
       </w:r>
     </w:p>
     <w:p>
@@ -3927,14 +4250,14 @@
         <w:t xml:space="preserve">: Citations provide evidence for the claim.</w:t>
       </w:r>
     </w:p>
-    <w:bookmarkEnd w:id="44"/>
-    <w:bookmarkStart w:id="45" w:name="best-citation-with-context"/>
+    <w:bookmarkEnd w:id="48"/>
+    <w:bookmarkStart w:id="49" w:name="best-citation-with-context"/>
     <w:p>
       <w:pPr>
         <w:pStyle w:val="Heading3"/>
       </w:pPr>
       <w:r>
-        <w:t xml:space="preserve">14.3 Best (citation with context)</w:t>
+        <w:t xml:space="preserve">15.3 Best (citation with context)</w:t>
       </w:r>
     </w:p>
     <w:p>
@@ -3981,14 +4304,14 @@
         <w:t xml:space="preserve">: The specific support each citation provides is explained.</w:t>
       </w:r>
     </w:p>
-    <w:bookmarkEnd w:id="45"/>
-    <w:bookmarkStart w:id="46" w:name="poor-irrelevant-citation"/>
+    <w:bookmarkEnd w:id="49"/>
+    <w:bookmarkStart w:id="50" w:name="poor-irrelevant-citation"/>
     <w:p>
       <w:pPr>
         <w:pStyle w:val="Heading3"/>
       </w:pPr>
       <w:r>
-        <w:t xml:space="preserve">14.4 Poor (irrelevant citation)</w:t>
+        <w:t xml:space="preserve">15.4 Poor (irrelevant citation)</w:t>
       </w:r>
     </w:p>
     <w:p>
@@ -4023,14 +4346,14 @@
         <w:t xml:space="preserve">: Knuth’s 1984 paper on literate programming doesn’t address Python or data science.</w:t>
       </w:r>
     </w:p>
-    <w:bookmarkEnd w:id="46"/>
-    <w:bookmarkStart w:id="47" w:name="better-relevant-citation"/>
+    <w:bookmarkEnd w:id="50"/>
+    <w:bookmarkStart w:id="51" w:name="better-relevant-citation"/>
     <w:p>
       <w:pPr>
         <w:pStyle w:val="Heading3"/>
       </w:pPr>
       <w:r>
-        <w:t xml:space="preserve">14.5 Better (relevant citation)</w:t>
+        <w:t xml:space="preserve">15.5 Better (relevant citation)</w:t>
       </w:r>
     </w:p>
     <w:p>
@@ -4065,15 +4388,15 @@
         <w:t xml:space="preserve">: The citation is to a current survey of programming language usage.</w:t>
       </w:r>
     </w:p>
-    <w:bookmarkEnd w:id="47"/>
-    <w:bookmarkEnd w:id="48"/>
-    <w:bookmarkStart w:id="65" w:name="conclusion"/>
+    <w:bookmarkEnd w:id="51"/>
+    <w:bookmarkEnd w:id="52"/>
+    <w:bookmarkStart w:id="69" w:name="conclusion"/>
     <w:p>
       <w:pPr>
         <w:pStyle w:val="Heading2"/>
       </w:pPr>
       <w:r>
-        <w:t xml:space="preserve">15 Conclusion</w:t>
+        <w:t xml:space="preserve">16 Conclusion</w:t>
       </w:r>
     </w:p>
     <w:p>
@@ -4126,8 +4449,8 @@
         <w:t xml:space="preserve">add a citation or present direct evidence.</w:t>
       </w:r>
     </w:p>
-    <w:bookmarkStart w:id="64" w:name="refs"/>
-    <w:bookmarkStart w:id="50" w:name="ref-bienayme1853"/>
+    <w:bookmarkStart w:id="68" w:name="refs"/>
+    <w:bookmarkStart w:id="54" w:name="ref-bienayme1853"/>
     <w:p>
       <w:pPr>
         <w:pStyle w:val="Bibliography"/>
@@ -4172,7 +4495,7 @@
       <w:r>
         <w:t xml:space="preserve"> </w:t>
       </w:r>
-      <w:hyperlink r:id="rId49">
+      <w:hyperlink r:id="rId53">
         <w:r>
           <w:rPr>
             <w:rStyle w:val="Hyperlink"/>
@@ -4184,8 +4507,8 @@
         <w:t xml:space="preserve">.</w:t>
       </w:r>
     </w:p>
-    <w:bookmarkEnd w:id="50"/>
-    <w:bookmarkStart w:id="52" w:name="ref-blitzstein2019introduction"/>
+    <w:bookmarkEnd w:id="54"/>
+    <w:bookmarkStart w:id="56" w:name="ref-blitzstein2019introduction"/>
     <w:p>
       <w:pPr>
         <w:pStyle w:val="Bibliography"/>
@@ -4209,7 +4532,7 @@
       <w:r>
         <w:t xml:space="preserve"> </w:t>
       </w:r>
-      <w:hyperlink r:id="rId51">
+      <w:hyperlink r:id="rId55">
         <w:r>
           <w:rPr>
             <w:rStyle w:val="Hyperlink"/>
@@ -4221,8 +4544,8 @@
         <w:t xml:space="preserve">.</w:t>
       </w:r>
     </w:p>
-    <w:bookmarkEnd w:id="52"/>
-    <w:bookmarkStart w:id="54" w:name="ref-hawkins2004"/>
+    <w:bookmarkEnd w:id="56"/>
+    <w:bookmarkStart w:id="58" w:name="ref-hawkins2004"/>
     <w:p>
       <w:pPr>
         <w:pStyle w:val="Bibliography"/>
@@ -4255,7 +4578,7 @@
       <w:r>
         <w:t xml:space="preserve"> </w:t>
       </w:r>
-      <w:hyperlink r:id="rId53">
+      <w:hyperlink r:id="rId57">
         <w:r>
           <w:rPr>
             <w:rStyle w:val="Hyperlink"/>
@@ -4267,8 +4590,8 @@
         <w:t xml:space="preserve">.</w:t>
       </w:r>
     </w:p>
-    <w:bookmarkEnd w:id="54"/>
-    <w:bookmarkStart w:id="56" w:name="ref-knuth84"/>
+    <w:bookmarkEnd w:id="58"/>
+    <w:bookmarkStart w:id="60" w:name="ref-knuth84"/>
     <w:p>
       <w:pPr>
         <w:pStyle w:val="Bibliography"/>
@@ -4301,7 +4624,7 @@
       <w:r>
         <w:t xml:space="preserve"> </w:t>
       </w:r>
-      <w:hyperlink r:id="rId55">
+      <w:hyperlink r:id="rId59">
         <w:r>
           <w:rPr>
             <w:rStyle w:val="Hyperlink"/>
@@ -4313,8 +4636,8 @@
         <w:t xml:space="preserve">.</w:t>
       </w:r>
     </w:p>
-    <w:bookmarkEnd w:id="56"/>
-    <w:bookmarkStart w:id="57" w:name="ref-mitchell1997"/>
+    <w:bookmarkEnd w:id="60"/>
+    <w:bookmarkStart w:id="61" w:name="ref-mitchell1997"/>
     <w:p>
       <w:pPr>
         <w:pStyle w:val="Bibliography"/>
@@ -4336,8 +4659,8 @@
         <w:t xml:space="preserve">. McGraw-Hill.</w:t>
       </w:r>
     </w:p>
-    <w:bookmarkEnd w:id="57"/>
-    <w:bookmarkStart w:id="59" w:name="ref-stackoverflow2024"/>
+    <w:bookmarkEnd w:id="61"/>
+    <w:bookmarkStart w:id="63" w:name="ref-stackoverflow2024"/>
     <w:p>
       <w:pPr>
         <w:pStyle w:val="Bibliography"/>
@@ -4361,7 +4684,7 @@
       <w:r>
         <w:t xml:space="preserve"> </w:t>
       </w:r>
-      <w:hyperlink r:id="rId58">
+      <w:hyperlink r:id="rId62">
         <w:r>
           <w:rPr>
             <w:rStyle w:val="Hyperlink"/>
@@ -4373,8 +4696,8 @@
         <w:t xml:space="preserve">.</w:t>
       </w:r>
     </w:p>
-    <w:bookmarkEnd w:id="59"/>
-    <w:bookmarkStart w:id="61" w:name="ref-tchebichef1867"/>
+    <w:bookmarkEnd w:id="63"/>
+    <w:bookmarkStart w:id="65" w:name="ref-tchebichef1867"/>
     <w:p>
       <w:pPr>
         <w:pStyle w:val="Bibliography"/>
@@ -4404,7 +4727,7 @@
       <w:r>
         <w:t xml:space="preserve"> </w:t>
       </w:r>
-      <w:hyperlink r:id="rId60">
+      <w:hyperlink r:id="rId64">
         <w:r>
           <w:rPr>
             <w:rStyle w:val="Hyperlink"/>
@@ -4416,8 +4739,8 @@
         <w:t xml:space="preserve">.</w:t>
       </w:r>
     </w:p>
-    <w:bookmarkEnd w:id="61"/>
-    <w:bookmarkStart w:id="63" w:name="ref-vapnik1998"/>
+    <w:bookmarkEnd w:id="65"/>
+    <w:bookmarkStart w:id="67" w:name="ref-vapnik1998"/>
     <w:p>
       <w:pPr>
         <w:pStyle w:val="Bibliography"/>
@@ -4441,7 +4764,7 @@
       <w:r>
         <w:t xml:space="preserve"> </w:t>
       </w:r>
-      <w:hyperlink r:id="rId62">
+      <w:hyperlink r:id="rId66">
         <w:r>
           <w:rPr>
             <w:rStyle w:val="Hyperlink"/>
@@ -4453,9 +4776,9 @@
         <w:t xml:space="preserve">.</w:t>
       </w:r>
     </w:p>
-    <w:bookmarkEnd w:id="63"/>
-    <w:bookmarkEnd w:id="64"/>
-    <w:bookmarkEnd w:id="65"/>
+    <w:bookmarkEnd w:id="67"/>
+    <w:bookmarkEnd w:id="68"/>
+    <w:bookmarkEnd w:id="69"/>
     <w:sectPr>
       <w:footnotePr>
         <w:numRestart w:val="eachSect"/>
@@ -4803,6 +5126,9 @@
     <w:abstractNumId w:val="991"/>
   </w:num>
   <w:num w:numId="1016">
+    <w:abstractNumId w:val="991"/>
+  </w:num>
+  <w:num w:numId="1017">
     <w:abstractNumId w:val="99411"/>
     <w:lvlOverride w:ilvl="0">
       <w:startOverride w:val="1"/>
@@ -4832,9 +5158,6 @@
       <w:startOverride w:val="1"/>
     </w:lvlOverride>
   </w:num>
-  <w:num w:numId="1017">
-    <w:abstractNumId w:val="991"/>
-  </w:num>
   <w:num w:numId="1018">
     <w:abstractNumId w:val="991"/>
   </w:num>
@@ -4848,6 +5171,9 @@
     <w:abstractNumId w:val="991"/>
   </w:num>
   <w:num w:numId="1022">
+    <w:abstractNumId w:val="991"/>
+  </w:num>
+  <w:num w:numId="1023">
     <w:abstractNumId w:val="991"/>
   </w:num>
 </w:numbering>

</xml_diff>

<commit_message>
Deploying to gh-pages from @ Morrison-Lab/psw@ec76fe255ca8b1532f6cd8ee29ff3a54e5957d0e 🚀
</commit_message>
<xml_diff>
--- a/chapters/citations-evidence.docx
+++ b/chapters/citations-evidence.docx
@@ -15,7 +15,7 @@
         <w:pStyle w:val="Date"/>
       </w:pPr>
       <w:r>
-        <w:t xml:space="preserve">Last modified: 2026-10-15 12:46:23 (PDT)</w:t>
+        <w:t xml:space="preserve">Last modified: 2026-10-15 18:53:39 (PDT)</w:t>
       </w:r>
     </w:p>
     <w:p>
@@ -3269,7 +3269,49 @@
         <w:pStyle w:val="BodyText"/>
       </w:pPr>
       <w:r>
-        <w:t xml:space="preserve">Put the historical note in a short remark after the statement and its proof,</w:t>
+        <w:t xml:space="preserve">When the credit is only a citation,</w:t>
+      </w:r>
+      <w:r>
+        <w:t xml:space="preserve"> </w:t>
+      </w:r>
+      <w:r>
+        <w:t xml:space="preserve">end the definition or theorem div with a line</w:t>
+      </w:r>
+      <w:r>
+        <w:t xml:space="preserve"> </w:t>
+      </w:r>
+      <w:r>
+        <w:rPr>
+          <w:rStyle w:val="VerbatimChar"/>
+        </w:rPr>
+        <w:t xml:space="preserve">Source: @key [locator]</w:t>
+      </w:r>
+      <w:r>
+        <w:t xml:space="preserve">.</w:t>
+      </w:r>
+      <w:r>
+        <w:t xml:space="preserve"> </w:t>
+      </w:r>
+      <w:r>
+        <w:t xml:space="preserve">A reference adds no commentary to the statement,</w:t>
+      </w:r>
+      <w:r>
+        <w:t xml:space="preserve"> </w:t>
+      </w:r>
+      <w:r>
+        <w:t xml:space="preserve">and a separate remark that holds only a citation is clutter.</w:t>
+      </w:r>
+      <w:r>
+        <w:t xml:space="preserve"> </w:t>
+      </w:r>
+      <w:r>
+        <w:t xml:space="preserve">When the credit needs substantial prose about the source or history of the content,</w:t>
+      </w:r>
+      <w:r>
+        <w:t xml:space="preserve"> </w:t>
+      </w:r>
+      <w:r>
+        <w:t xml:space="preserve">put that prose in a short remark after the statement and its proof,</w:t>
       </w:r>
       <w:r>
         <w:t xml:space="preserve"> </w:t>

</xml_diff>

<commit_message>
Deploying to gh-pages from @ Morrison-Lab/psw@8e42936a5c235cc2218f2497eab795058ad329a7 🚀
</commit_message>
<xml_diff>
--- a/chapters/citations-evidence.docx
+++ b/chapters/citations-evidence.docx
@@ -15,7 +15,7 @@
         <w:pStyle w:val="Date"/>
       </w:pPr>
       <w:r>
-        <w:t xml:space="preserve">Last modified: 2026-10-16 02:56:58 (PDT)</w:t>
+        <w:t xml:space="preserve">Last modified: 2026-10-16 03:13:33 (PDT)</w:t>
       </w:r>
     </w:p>
     <w:p>
@@ -3210,14 +3210,167 @@
         <w:t xml:space="preserve">(Mitchell 1997)</w:t>
       </w:r>
     </w:p>
+    <w:p>
+      <w:pPr>
+        <w:pStyle w:val="FirstParagraph"/>
+      </w:pPr>
+      <w:r>
+        <w:t xml:space="preserve">Credit a quotation to whoever speaks it in the primary source,</w:t>
+      </w:r>
+      <w:r>
+        <w:t xml:space="preserve"> </w:t>
+      </w:r>
+      <w:r>
+        <w:t xml:space="preserve">even when the speaker is quoting someone else.</w:t>
+      </w:r>
+      <w:r>
+        <w:t xml:space="preserve"> </w:t>
+      </w:r>
+      <w:r>
+        <w:t xml:space="preserve">When attribution is in doubt, read the primary source (a transcript, the original page) first.</w:t>
+      </w:r>
+      <w:r>
+        <w:t xml:space="preserve"> </w:t>
+      </w:r>
+      <w:r>
+        <w:t xml:space="preserve">Uncertainty about who said a line is not evidence about who said it.</w:t>
+      </w:r>
+    </w:p>
     <w:bookmarkEnd w:id="39"/>
-    <w:bookmarkStart w:id="42" w:name="cite-the-original-for-named-results"/>
+    <w:bookmarkStart w:id="40" w:name="Xdc6e961a4731f42c2c786ef03a498fc72396848"/>
     <w:p>
       <w:pPr>
         <w:pStyle w:val="Heading2"/>
       </w:pPr>
       <w:r>
-        <w:t xml:space="preserve">11 Cite the original for named results</w:t>
+        <w:t xml:space="preserve">11 Copy organization names from their source</w:t>
+      </w:r>
+    </w:p>
+    <w:p>
+      <w:pPr>
+        <w:pStyle w:val="FirstParagraph"/>
+      </w:pPr>
+      <w:r>
+        <w:t xml:space="preserve">When a bibliography entry names an organization,</w:t>
+      </w:r>
+      <w:r>
+        <w:t xml:space="preserve"> </w:t>
+      </w:r>
+      <w:r>
+        <w:t xml:space="preserve">copy the name from the organization’s own page (its about page, README or footer)</w:t>
+      </w:r>
+      <w:r>
+        <w:t xml:space="preserve"> </w:t>
+      </w:r>
+      <w:r>
+        <w:t xml:space="preserve">rather than expanding an acronym from memory.</w:t>
+      </w:r>
+    </w:p>
+    <w:bookmarkEnd w:id="40"/>
+    <w:bookmarkStart w:id="41" w:name="cite-an-alias-directly"/>
+    <w:p>
+      <w:pPr>
+        <w:pStyle w:val="Heading2"/>
+      </w:pPr>
+      <w:r>
+        <w:t xml:space="preserve">12 Cite an alias directly</w:t>
+      </w:r>
+    </w:p>
+    <w:p>
+      <w:pPr>
+        <w:pStyle w:val="FirstParagraph"/>
+      </w:pPr>
+      <w:r>
+        <w:t xml:space="preserve">When a source uses another name for a defined term,</w:t>
+      </w:r>
+      <w:r>
+        <w:t xml:space="preserve"> </w:t>
+      </w:r>
+      <w:r>
+        <w:t xml:space="preserve">write the alias in bold and cite the source after it,</w:t>
+      </w:r>
+      <w:r>
+        <w:t xml:space="preserve"> </w:t>
+      </w:r>
+      <w:r>
+        <w:t xml:space="preserve">as in</w:t>
+      </w:r>
+      <w:r>
+        <w:t xml:space="preserve"> </w:t>
+      </w:r>
+      <w:r>
+        <w:rPr>
+          <w:rStyle w:val="VerbatimChar"/>
+        </w:rPr>
+        <w:t xml:space="preserve">also called the **alias** [@key, section]</w:t>
+      </w:r>
+      <w:r>
+        <w:t xml:space="preserve">.</w:t>
+      </w:r>
+      <w:r>
+        <w:t xml:space="preserve"> </w:t>
+      </w:r>
+      <w:r>
+        <w:t xml:space="preserve">The citation already says that the source uses the name,</w:t>
+      </w:r>
+      <w:r>
+        <w:t xml:space="preserve"> </w:t>
+      </w:r>
+      <w:r>
+        <w:t xml:space="preserve">so do not add a sentence such as</w:t>
+      </w:r>
+      <w:r>
+        <w:t xml:space="preserve"> </w:t>
+      </w:r>
+      <w:r>
+        <w:t xml:space="preserve">“The source uses that name”</w:t>
+      </w:r>
+      <w:r>
+        <w:t xml:space="preserve">.</w:t>
+      </w:r>
+    </w:p>
+    <w:p>
+      <w:pPr>
+        <w:pStyle w:val="BlockText"/>
+      </w:pPr>
+      <w:r>
+        <w:t xml:space="preserve">❌</w:t>
+      </w:r>
+      <w:r>
+        <w:t xml:space="preserve"> </w:t>
+      </w:r>
+      <w:r>
+        <w:rPr>
+          <w:rStyle w:val="VerbatimChar"/>
+        </w:rPr>
+        <w:t xml:space="preserve">also called the **alias**. The cited textbook uses that name.</w:t>
+      </w:r>
+    </w:p>
+    <w:p>
+      <w:pPr>
+        <w:pStyle w:val="BlockText"/>
+      </w:pPr>
+      <w:r>
+        <w:t xml:space="preserve">✅</w:t>
+      </w:r>
+      <w:r>
+        <w:t xml:space="preserve"> </w:t>
+      </w:r>
+      <w:r>
+        <w:rPr>
+          <w:rStyle w:val="VerbatimChar"/>
+        </w:rPr>
+        <w:t xml:space="preserve">also called the **alias** [@key, section]</w:t>
+      </w:r>
+    </w:p>
+    <w:bookmarkEnd w:id="41"/>
+    <w:bookmarkStart w:id="44" w:name="cite-the-original-for-named-results"/>
+    <w:p>
+      <w:pPr>
+        <w:pStyle w:val="Heading2"/>
+      </w:pPr>
+      <w:r>
+        <w:t xml:space="preserve">13 Cite the original for named results</w:t>
       </w:r>
     </w:p>
     <w:p>
@@ -3492,7 +3645,7 @@
       <w:r>
         <w:t xml:space="preserve"> </w:t>
       </w:r>
-      <w:hyperlink r:id="rId40">
+      <w:hyperlink r:id="rId42">
         <w:r>
           <w:rPr>
             <w:rStyle w:val="Hyperlink"/>
@@ -3518,7 +3671,7 @@
         <w:t xml:space="preserve">and never fill in a title, volume, or page number from memory.</w:t>
       </w:r>
     </w:p>
-    <w:bookmarkStart w:id="41" w:name="exm-cite-original"/>
+    <w:bookmarkStart w:id="43" w:name="exm-cite-original"/>
     <w:p>
       <w:pPr>
         <w:pStyle w:val="BodyText"/>
@@ -3592,15 +3745,15 @@
         <w:t xml:space="preserve">.</w:t>
       </w:r>
     </w:p>
-    <w:bookmarkEnd w:id="41"/>
-    <w:bookmarkEnd w:id="42"/>
-    <w:bookmarkStart w:id="43" w:name="put-the-content-first"/>
+    <w:bookmarkEnd w:id="43"/>
+    <w:bookmarkEnd w:id="44"/>
+    <w:bookmarkStart w:id="45" w:name="put-the-content-first"/>
     <w:p>
       <w:pPr>
         <w:pStyle w:val="Heading2"/>
       </w:pPr>
       <w:r>
-        <w:t xml:space="preserve">12 Put the content first</w:t>
+        <w:t xml:space="preserve">14 Put the content first</w:t>
       </w:r>
     </w:p>
     <w:p>
@@ -3647,14 +3800,14 @@
         <w:t xml:space="preserve">without commentary on who said it or where it was repeated.</w:t>
       </w:r>
     </w:p>
-    <w:bookmarkEnd w:id="43"/>
-    <w:bookmarkStart w:id="45" w:name="adapting-another-courses-material"/>
+    <w:bookmarkEnd w:id="45"/>
+    <w:bookmarkStart w:id="47" w:name="adapting-another-courses-material"/>
     <w:p>
       <w:pPr>
         <w:pStyle w:val="Heading2"/>
       </w:pPr>
       <w:r>
-        <w:t xml:space="preserve">13 Adapting another course’s material</w:t>
+        <w:t xml:space="preserve">15 Adapting another course’s material</w:t>
       </w:r>
     </w:p>
     <w:p>
@@ -3893,13 +4046,13 @@
         <w:t xml:space="preserve">:::</w:t>
       </w:r>
     </w:p>
-    <w:bookmarkStart w:id="44" w:name="material-from-your-own-repositories"/>
+    <w:bookmarkStart w:id="46" w:name="material-from-your-own-repositories"/>
     <w:p>
       <w:pPr>
         <w:pStyle w:val="Heading3"/>
       </w:pPr>
       <w:r>
-        <w:t xml:space="preserve">13.1 Material from your own repositories</w:t>
+        <w:t xml:space="preserve">15.1 Material from your own repositories</w:t>
       </w:r>
     </w:p>
     <w:p>
@@ -4022,15 +4175,15 @@
         <w:t xml:space="preserve">That link is a cross-reference, not an attribution.</w:t>
       </w:r>
     </w:p>
-    <w:bookmarkEnd w:id="44"/>
-    <w:bookmarkEnd w:id="45"/>
-    <w:bookmarkStart w:id="46" w:name="common-citation-errors-to-avoid"/>
+    <w:bookmarkEnd w:id="46"/>
+    <w:bookmarkEnd w:id="47"/>
+    <w:bookmarkStart w:id="48" w:name="common-citation-errors-to-avoid"/>
     <w:p>
       <w:pPr>
         <w:pStyle w:val="Heading2"/>
       </w:pPr>
       <w:r>
-        <w:t xml:space="preserve">14 Common citation errors to avoid</w:t>
+        <w:t xml:space="preserve">16 Common citation errors to avoid</w:t>
       </w:r>
     </w:p>
     <w:p>
@@ -4208,23 +4361,23 @@
         <w:t xml:space="preserve">: Failing to cite work that directly influenced your ideas</w:t>
       </w:r>
     </w:p>
-    <w:bookmarkEnd w:id="46"/>
-    <w:bookmarkStart w:id="52" w:name="examples"/>
+    <w:bookmarkEnd w:id="48"/>
+    <w:bookmarkStart w:id="54" w:name="examples"/>
     <w:p>
       <w:pPr>
         <w:pStyle w:val="Heading2"/>
       </w:pPr>
       <w:r>
-        <w:t xml:space="preserve">15 Examples</w:t>
-      </w:r>
-    </w:p>
-    <w:bookmarkStart w:id="47" w:name="poor-unsupported-claim"/>
+        <w:t xml:space="preserve">17 Examples</w:t>
+      </w:r>
+    </w:p>
+    <w:bookmarkStart w:id="49" w:name="poor-unsupported-claim"/>
     <w:p>
       <w:pPr>
         <w:pStyle w:val="Heading3"/>
       </w:pPr>
       <w:r>
-        <w:t xml:space="preserve">15.1 Poor (unsupported claim)</w:t>
+        <w:t xml:space="preserve">17.1 Poor (unsupported claim)</w:t>
       </w:r>
     </w:p>
     <w:p>
@@ -4250,14 +4403,14 @@
         <w:t xml:space="preserve">: This claim is stated as fact without any support.</w:t>
       </w:r>
     </w:p>
-    <w:bookmarkEnd w:id="47"/>
-    <w:bookmarkStart w:id="48" w:name="better-citation-provided"/>
+    <w:bookmarkEnd w:id="49"/>
+    <w:bookmarkStart w:id="50" w:name="better-citation-provided"/>
     <w:p>
       <w:pPr>
         <w:pStyle w:val="Heading3"/>
       </w:pPr>
       <w:r>
-        <w:t xml:space="preserve">15.2 Better (citation provided)</w:t>
+        <w:t xml:space="preserve">17.2 Better (citation provided)</w:t>
       </w:r>
     </w:p>
     <w:p>
@@ -4292,14 +4445,14 @@
         <w:t xml:space="preserve">: Citations provide evidence for the claim.</w:t>
       </w:r>
     </w:p>
-    <w:bookmarkEnd w:id="48"/>
-    <w:bookmarkStart w:id="49" w:name="best-citation-with-context"/>
+    <w:bookmarkEnd w:id="50"/>
+    <w:bookmarkStart w:id="51" w:name="best-citation-with-context"/>
     <w:p>
       <w:pPr>
         <w:pStyle w:val="Heading3"/>
       </w:pPr>
       <w:r>
-        <w:t xml:space="preserve">15.3 Best (citation with context)</w:t>
+        <w:t xml:space="preserve">17.3 Best (citation with context)</w:t>
       </w:r>
     </w:p>
     <w:p>
@@ -4346,14 +4499,14 @@
         <w:t xml:space="preserve">: The specific support each citation provides is explained.</w:t>
       </w:r>
     </w:p>
-    <w:bookmarkEnd w:id="49"/>
-    <w:bookmarkStart w:id="50" w:name="poor-irrelevant-citation"/>
+    <w:bookmarkEnd w:id="51"/>
+    <w:bookmarkStart w:id="52" w:name="poor-irrelevant-citation"/>
     <w:p>
       <w:pPr>
         <w:pStyle w:val="Heading3"/>
       </w:pPr>
       <w:r>
-        <w:t xml:space="preserve">15.4 Poor (irrelevant citation)</w:t>
+        <w:t xml:space="preserve">17.4 Poor (irrelevant citation)</w:t>
       </w:r>
     </w:p>
     <w:p>
@@ -4388,14 +4541,14 @@
         <w:t xml:space="preserve">: Knuth’s 1984 paper on literate programming doesn’t address Python or data science.</w:t>
       </w:r>
     </w:p>
-    <w:bookmarkEnd w:id="50"/>
-    <w:bookmarkStart w:id="51" w:name="better-relevant-citation"/>
+    <w:bookmarkEnd w:id="52"/>
+    <w:bookmarkStart w:id="53" w:name="better-relevant-citation"/>
     <w:p>
       <w:pPr>
         <w:pStyle w:val="Heading3"/>
       </w:pPr>
       <w:r>
-        <w:t xml:space="preserve">15.5 Better (relevant citation)</w:t>
+        <w:t xml:space="preserve">17.5 Better (relevant citation)</w:t>
       </w:r>
     </w:p>
     <w:p>
@@ -4430,15 +4583,15 @@
         <w:t xml:space="preserve">: The citation is to a current survey of programming language usage.</w:t>
       </w:r>
     </w:p>
-    <w:bookmarkEnd w:id="51"/>
-    <w:bookmarkEnd w:id="52"/>
-    <w:bookmarkStart w:id="69" w:name="conclusion"/>
+    <w:bookmarkEnd w:id="53"/>
+    <w:bookmarkEnd w:id="54"/>
+    <w:bookmarkStart w:id="71" w:name="conclusion"/>
     <w:p>
       <w:pPr>
         <w:pStyle w:val="Heading2"/>
       </w:pPr>
       <w:r>
-        <w:t xml:space="preserve">16 Conclusion</w:t>
+        <w:t xml:space="preserve">18 Conclusion</w:t>
       </w:r>
     </w:p>
     <w:p>
@@ -4491,8 +4644,8 @@
         <w:t xml:space="preserve">add a citation or present direct evidence.</w:t>
       </w:r>
     </w:p>
-    <w:bookmarkStart w:id="68" w:name="refs"/>
-    <w:bookmarkStart w:id="54" w:name="ref-bienayme1853"/>
+    <w:bookmarkStart w:id="70" w:name="refs"/>
+    <w:bookmarkStart w:id="56" w:name="ref-bienayme1853"/>
     <w:p>
       <w:pPr>
         <w:pStyle w:val="Bibliography"/>
@@ -4537,7 +4690,7 @@
       <w:r>
         <w:t xml:space="preserve"> </w:t>
       </w:r>
-      <w:hyperlink r:id="rId53">
+      <w:hyperlink r:id="rId55">
         <w:r>
           <w:rPr>
             <w:rStyle w:val="Hyperlink"/>
@@ -4549,8 +4702,8 @@
         <w:t xml:space="preserve">.</w:t>
       </w:r>
     </w:p>
-    <w:bookmarkEnd w:id="54"/>
-    <w:bookmarkStart w:id="56" w:name="ref-blitzstein2019introduction"/>
+    <w:bookmarkEnd w:id="56"/>
+    <w:bookmarkStart w:id="58" w:name="ref-blitzstein2019introduction"/>
     <w:p>
       <w:pPr>
         <w:pStyle w:val="Bibliography"/>
@@ -4574,7 +4727,7 @@
       <w:r>
         <w:t xml:space="preserve"> </w:t>
       </w:r>
-      <w:hyperlink r:id="rId55">
+      <w:hyperlink r:id="rId57">
         <w:r>
           <w:rPr>
             <w:rStyle w:val="Hyperlink"/>
@@ -4586,8 +4739,8 @@
         <w:t xml:space="preserve">.</w:t>
       </w:r>
     </w:p>
-    <w:bookmarkEnd w:id="56"/>
-    <w:bookmarkStart w:id="58" w:name="ref-hawkins2004"/>
+    <w:bookmarkEnd w:id="58"/>
+    <w:bookmarkStart w:id="60" w:name="ref-hawkins2004"/>
     <w:p>
       <w:pPr>
         <w:pStyle w:val="Bibliography"/>
@@ -4620,7 +4773,7 @@
       <w:r>
         <w:t xml:space="preserve"> </w:t>
       </w:r>
-      <w:hyperlink r:id="rId57">
+      <w:hyperlink r:id="rId59">
         <w:r>
           <w:rPr>
             <w:rStyle w:val="Hyperlink"/>
@@ -4632,8 +4785,8 @@
         <w:t xml:space="preserve">.</w:t>
       </w:r>
     </w:p>
-    <w:bookmarkEnd w:id="58"/>
-    <w:bookmarkStart w:id="60" w:name="ref-knuth84"/>
+    <w:bookmarkEnd w:id="60"/>
+    <w:bookmarkStart w:id="62" w:name="ref-knuth84"/>
     <w:p>
       <w:pPr>
         <w:pStyle w:val="Bibliography"/>
@@ -4666,7 +4819,7 @@
       <w:r>
         <w:t xml:space="preserve"> </w:t>
       </w:r>
-      <w:hyperlink r:id="rId59">
+      <w:hyperlink r:id="rId61">
         <w:r>
           <w:rPr>
             <w:rStyle w:val="Hyperlink"/>
@@ -4678,8 +4831,8 @@
         <w:t xml:space="preserve">.</w:t>
       </w:r>
     </w:p>
-    <w:bookmarkEnd w:id="60"/>
-    <w:bookmarkStart w:id="61" w:name="ref-mitchell1997"/>
+    <w:bookmarkEnd w:id="62"/>
+    <w:bookmarkStart w:id="63" w:name="ref-mitchell1997"/>
     <w:p>
       <w:pPr>
         <w:pStyle w:val="Bibliography"/>
@@ -4701,8 +4854,8 @@
         <w:t xml:space="preserve">. McGraw-Hill.</w:t>
       </w:r>
     </w:p>
-    <w:bookmarkEnd w:id="61"/>
-    <w:bookmarkStart w:id="63" w:name="ref-stackoverflow2024"/>
+    <w:bookmarkEnd w:id="63"/>
+    <w:bookmarkStart w:id="65" w:name="ref-stackoverflow2024"/>
     <w:p>
       <w:pPr>
         <w:pStyle w:val="Bibliography"/>
@@ -4726,7 +4879,7 @@
       <w:r>
         <w:t xml:space="preserve"> </w:t>
       </w:r>
-      <w:hyperlink r:id="rId62">
+      <w:hyperlink r:id="rId64">
         <w:r>
           <w:rPr>
             <w:rStyle w:val="Hyperlink"/>
@@ -4738,8 +4891,8 @@
         <w:t xml:space="preserve">.</w:t>
       </w:r>
     </w:p>
-    <w:bookmarkEnd w:id="63"/>
-    <w:bookmarkStart w:id="65" w:name="ref-tchebichef1867"/>
+    <w:bookmarkEnd w:id="65"/>
+    <w:bookmarkStart w:id="67" w:name="ref-tchebichef1867"/>
     <w:p>
       <w:pPr>
         <w:pStyle w:val="Bibliography"/>
@@ -4769,7 +4922,7 @@
       <w:r>
         <w:t xml:space="preserve"> </w:t>
       </w:r>
-      <w:hyperlink r:id="rId64">
+      <w:hyperlink r:id="rId66">
         <w:r>
           <w:rPr>
             <w:rStyle w:val="Hyperlink"/>
@@ -4781,8 +4934,8 @@
         <w:t xml:space="preserve">.</w:t>
       </w:r>
     </w:p>
-    <w:bookmarkEnd w:id="65"/>
-    <w:bookmarkStart w:id="67" w:name="ref-vapnik1998"/>
+    <w:bookmarkEnd w:id="67"/>
+    <w:bookmarkStart w:id="69" w:name="ref-vapnik1998"/>
     <w:p>
       <w:pPr>
         <w:pStyle w:val="Bibliography"/>
@@ -4806,7 +4959,7 @@
       <w:r>
         <w:t xml:space="preserve"> </w:t>
       </w:r>
-      <w:hyperlink r:id="rId66">
+      <w:hyperlink r:id="rId68">
         <w:r>
           <w:rPr>
             <w:rStyle w:val="Hyperlink"/>
@@ -4818,9 +4971,9 @@
         <w:t xml:space="preserve">.</w:t>
       </w:r>
     </w:p>
-    <w:bookmarkEnd w:id="67"/>
-    <w:bookmarkEnd w:id="68"/>
     <w:bookmarkEnd w:id="69"/>
+    <w:bookmarkEnd w:id="70"/>
+    <w:bookmarkEnd w:id="71"/>
     <w:sectPr>
       <w:footnotePr>
         <w:numRestart w:val="eachSect"/>

</xml_diff>

<commit_message>
Deploying to gh-pages from @ Morrison-Lab/psw@3a962f0811dbe34fe2f59708de7d397c563afb2b 🚀
</commit_message>
<xml_diff>
--- a/chapters/citations-evidence.docx
+++ b/chapters/citations-evidence.docx
@@ -15,7 +15,7 @@
         <w:pStyle w:val="Date"/>
       </w:pPr>
       <w:r>
-        <w:t xml:space="preserve">Last modified: 2026-10-16 04:14:45 (PDT)</w:t>
+        <w:t xml:space="preserve">Last modified: 2026-10-16 04:25:52 (PDT)</w:t>
       </w:r>
     </w:p>
     <w:p>
@@ -3267,13 +3267,98 @@
       </w:r>
     </w:p>
     <w:bookmarkEnd w:id="40"/>
-    <w:bookmarkStart w:id="41" w:name="cite-an-alias-directly"/>
+    <w:bookmarkStart w:id="43" w:name="verify-each-bibliography-entry"/>
     <w:p>
       <w:pPr>
         <w:pStyle w:val="Heading2"/>
       </w:pPr>
       <w:r>
-        <w:t xml:space="preserve">12 Cite an alias directly</w:t>
+        <w:t xml:space="preserve">12 Verify each bibliography entry</w:t>
+      </w:r>
+    </w:p>
+    <w:p>
+      <w:pPr>
+        <w:pStyle w:val="FirstParagraph"/>
+      </w:pPr>
+      <w:r>
+        <w:t xml:space="preserve">Check each detail of a bibliography entry against an official source.</w:t>
+      </w:r>
+      <w:r>
+        <w:t xml:space="preserve"> </w:t>
+      </w:r>
+      <w:r>
+        <w:t xml:space="preserve">Look the work up through</w:t>
+      </w:r>
+      <w:r>
+        <w:t xml:space="preserve"> </w:t>
+      </w:r>
+      <w:hyperlink r:id="rId41">
+        <w:r>
+          <w:rPr>
+            <w:rStyle w:val="Hyperlink"/>
+          </w:rPr>
+          <w:t xml:space="preserve">Crossref search</w:t>
+        </w:r>
+      </w:hyperlink>
+      <w:r>
+        <w:t xml:space="preserve"> </w:t>
+      </w:r>
+      <w:r>
+        <w:t xml:space="preserve">or its</w:t>
+      </w:r>
+      <w:r>
+        <w:t xml:space="preserve"> </w:t>
+      </w:r>
+      <w:hyperlink r:id="rId42">
+        <w:r>
+          <w:rPr>
+            <w:rStyle w:val="Hyperlink"/>
+          </w:rPr>
+          <w:t xml:space="preserve">REST API</w:t>
+        </w:r>
+      </w:hyperlink>
+      <w:r>
+        <w:t xml:space="preserve">,</w:t>
+      </w:r>
+      <w:r>
+        <w:t xml:space="preserve"> </w:t>
+      </w:r>
+      <w:r>
+        <w:t xml:space="preserve">check the title, volume, issue and pages against the record,</w:t>
+      </w:r>
+      <w:r>
+        <w:t xml:space="preserve"> </w:t>
+      </w:r>
+      <w:r>
+        <w:t xml:space="preserve">and add the DOI.</w:t>
+      </w:r>
+      <w:r>
+        <w:t xml:space="preserve"> </w:t>
+      </w:r>
+      <w:r>
+        <w:t xml:space="preserve">Check a constant in a cited theorem, such as the factors in an inequality,</w:t>
+      </w:r>
+      <w:r>
+        <w:t xml:space="preserve"> </w:t>
+      </w:r>
+      <w:r>
+        <w:t xml:space="preserve">against a second free, official source,</w:t>
+      </w:r>
+      <w:r>
+        <w:t xml:space="preserve"> </w:t>
+      </w:r>
+      <w:r>
+        <w:t xml:space="preserve">and say in the pull request what you checked against what.</w:t>
+      </w:r>
+    </w:p>
+    <w:bookmarkEnd w:id="43"/>
+    <w:bookmarkStart w:id="44" w:name="cite-an-alias-directly"/>
+    <w:p>
+      <w:pPr>
+        <w:pStyle w:val="Heading2"/>
+      </w:pPr>
+      <w:r>
+        <w:t xml:space="preserve">13 Cite an alias directly</w:t>
       </w:r>
     </w:p>
     <w:p>
@@ -3363,14 +3448,14 @@
         <w:t xml:space="preserve">also called the **alias** [@key, section]</w:t>
       </w:r>
     </w:p>
-    <w:bookmarkEnd w:id="41"/>
-    <w:bookmarkStart w:id="44" w:name="cite-the-original-for-named-results"/>
+    <w:bookmarkEnd w:id="44"/>
+    <w:bookmarkStart w:id="47" w:name="cite-the-original-for-named-results"/>
     <w:p>
       <w:pPr>
         <w:pStyle w:val="Heading2"/>
       </w:pPr>
       <w:r>
-        <w:t xml:space="preserve">13 Cite the original for named results</w:t>
+        <w:t xml:space="preserve">14 Cite the original for named results</w:t>
       </w:r>
     </w:p>
     <w:p>
@@ -3645,7 +3730,7 @@
       <w:r>
         <w:t xml:space="preserve"> </w:t>
       </w:r>
-      <w:hyperlink r:id="rId42">
+      <w:hyperlink r:id="rId45">
         <w:r>
           <w:rPr>
             <w:rStyle w:val="Hyperlink"/>
@@ -3671,7 +3756,7 @@
         <w:t xml:space="preserve">and never fill in a title, volume, or page number from memory.</w:t>
       </w:r>
     </w:p>
-    <w:bookmarkStart w:id="43" w:name="exm-cite-original"/>
+    <w:bookmarkStart w:id="46" w:name="exm-cite-original"/>
     <w:p>
       <w:pPr>
         <w:pStyle w:val="BodyText"/>
@@ -3745,15 +3830,15 @@
         <w:t xml:space="preserve">.</w:t>
       </w:r>
     </w:p>
-    <w:bookmarkEnd w:id="43"/>
-    <w:bookmarkEnd w:id="44"/>
-    <w:bookmarkStart w:id="45" w:name="put-the-content-first"/>
+    <w:bookmarkEnd w:id="46"/>
+    <w:bookmarkEnd w:id="47"/>
+    <w:bookmarkStart w:id="48" w:name="put-the-content-first"/>
     <w:p>
       <w:pPr>
         <w:pStyle w:val="Heading2"/>
       </w:pPr>
       <w:r>
-        <w:t xml:space="preserve">14 Put the content first</w:t>
+        <w:t xml:space="preserve">15 Put the content first</w:t>
       </w:r>
     </w:p>
     <w:p>
@@ -3800,14 +3885,14 @@
         <w:t xml:space="preserve">without commentary on who said it or where it was repeated.</w:t>
       </w:r>
     </w:p>
-    <w:bookmarkEnd w:id="45"/>
-    <w:bookmarkStart w:id="47" w:name="adapting-another-courses-material"/>
+    <w:bookmarkEnd w:id="48"/>
+    <w:bookmarkStart w:id="50" w:name="adapting-another-courses-material"/>
     <w:p>
       <w:pPr>
         <w:pStyle w:val="Heading2"/>
       </w:pPr>
       <w:r>
-        <w:t xml:space="preserve">15 Adapting another course’s material</w:t>
+        <w:t xml:space="preserve">16 Adapting another course’s material</w:t>
       </w:r>
     </w:p>
     <w:p>
@@ -4046,13 +4131,13 @@
         <w:t xml:space="preserve">:::</w:t>
       </w:r>
     </w:p>
-    <w:bookmarkStart w:id="46" w:name="material-from-your-own-repositories"/>
+    <w:bookmarkStart w:id="49" w:name="material-from-your-own-repositories"/>
     <w:p>
       <w:pPr>
         <w:pStyle w:val="Heading3"/>
       </w:pPr>
       <w:r>
-        <w:t xml:space="preserve">15.1 Material from your own repositories</w:t>
+        <w:t xml:space="preserve">16.1 Material from your own repositories</w:t>
       </w:r>
     </w:p>
     <w:p>
@@ -4175,15 +4260,15 @@
         <w:t xml:space="preserve">That link is a cross-reference, not an attribution.</w:t>
       </w:r>
     </w:p>
-    <w:bookmarkEnd w:id="46"/>
-    <w:bookmarkEnd w:id="47"/>
-    <w:bookmarkStart w:id="48" w:name="common-citation-errors-to-avoid"/>
+    <w:bookmarkEnd w:id="49"/>
+    <w:bookmarkEnd w:id="50"/>
+    <w:bookmarkStart w:id="51" w:name="common-citation-errors-to-avoid"/>
     <w:p>
       <w:pPr>
         <w:pStyle w:val="Heading2"/>
       </w:pPr>
       <w:r>
-        <w:t xml:space="preserve">16 Common citation errors to avoid</w:t>
+        <w:t xml:space="preserve">17 Common citation errors to avoid</w:t>
       </w:r>
     </w:p>
     <w:p>
@@ -4361,23 +4446,23 @@
         <w:t xml:space="preserve">: Failing to cite work that directly influenced your ideas</w:t>
       </w:r>
     </w:p>
-    <w:bookmarkEnd w:id="48"/>
-    <w:bookmarkStart w:id="54" w:name="examples"/>
+    <w:bookmarkEnd w:id="51"/>
+    <w:bookmarkStart w:id="57" w:name="examples"/>
     <w:p>
       <w:pPr>
         <w:pStyle w:val="Heading2"/>
       </w:pPr>
       <w:r>
-        <w:t xml:space="preserve">17 Examples</w:t>
-      </w:r>
-    </w:p>
-    <w:bookmarkStart w:id="49" w:name="poor-unsupported-claim"/>
+        <w:t xml:space="preserve">18 Examples</w:t>
+      </w:r>
+    </w:p>
+    <w:bookmarkStart w:id="52" w:name="poor-unsupported-claim"/>
     <w:p>
       <w:pPr>
         <w:pStyle w:val="Heading3"/>
       </w:pPr>
       <w:r>
-        <w:t xml:space="preserve">17.1 Poor (unsupported claim)</w:t>
+        <w:t xml:space="preserve">18.1 Poor (unsupported claim)</w:t>
       </w:r>
     </w:p>
     <w:p>
@@ -4403,14 +4488,14 @@
         <w:t xml:space="preserve">: This claim is stated as fact without any support.</w:t>
       </w:r>
     </w:p>
-    <w:bookmarkEnd w:id="49"/>
-    <w:bookmarkStart w:id="50" w:name="better-citation-provided"/>
+    <w:bookmarkEnd w:id="52"/>
+    <w:bookmarkStart w:id="53" w:name="better-citation-provided"/>
     <w:p>
       <w:pPr>
         <w:pStyle w:val="Heading3"/>
       </w:pPr>
       <w:r>
-        <w:t xml:space="preserve">17.2 Better (citation provided)</w:t>
+        <w:t xml:space="preserve">18.2 Better (citation provided)</w:t>
       </w:r>
     </w:p>
     <w:p>
@@ -4445,14 +4530,14 @@
         <w:t xml:space="preserve">: Citations provide evidence for the claim.</w:t>
       </w:r>
     </w:p>
-    <w:bookmarkEnd w:id="50"/>
-    <w:bookmarkStart w:id="51" w:name="best-citation-with-context"/>
+    <w:bookmarkEnd w:id="53"/>
+    <w:bookmarkStart w:id="54" w:name="best-citation-with-context"/>
     <w:p>
       <w:pPr>
         <w:pStyle w:val="Heading3"/>
       </w:pPr>
       <w:r>
-        <w:t xml:space="preserve">17.3 Best (citation with context)</w:t>
+        <w:t xml:space="preserve">18.3 Best (citation with context)</w:t>
       </w:r>
     </w:p>
     <w:p>
@@ -4499,14 +4584,14 @@
         <w:t xml:space="preserve">: The specific support each citation provides is explained.</w:t>
       </w:r>
     </w:p>
-    <w:bookmarkEnd w:id="51"/>
-    <w:bookmarkStart w:id="52" w:name="poor-irrelevant-citation"/>
+    <w:bookmarkEnd w:id="54"/>
+    <w:bookmarkStart w:id="55" w:name="poor-irrelevant-citation"/>
     <w:p>
       <w:pPr>
         <w:pStyle w:val="Heading3"/>
       </w:pPr>
       <w:r>
-        <w:t xml:space="preserve">17.4 Poor (irrelevant citation)</w:t>
+        <w:t xml:space="preserve">18.4 Poor (irrelevant citation)</w:t>
       </w:r>
     </w:p>
     <w:p>
@@ -4541,14 +4626,14 @@
         <w:t xml:space="preserve">: Knuth’s 1984 paper on literate programming doesn’t address Python or data science.</w:t>
       </w:r>
     </w:p>
-    <w:bookmarkEnd w:id="52"/>
-    <w:bookmarkStart w:id="53" w:name="better-relevant-citation"/>
+    <w:bookmarkEnd w:id="55"/>
+    <w:bookmarkStart w:id="56" w:name="better-relevant-citation"/>
     <w:p>
       <w:pPr>
         <w:pStyle w:val="Heading3"/>
       </w:pPr>
       <w:r>
-        <w:t xml:space="preserve">17.5 Better (relevant citation)</w:t>
+        <w:t xml:space="preserve">18.5 Better (relevant citation)</w:t>
       </w:r>
     </w:p>
     <w:p>
@@ -4583,15 +4668,15 @@
         <w:t xml:space="preserve">: The citation is to a current survey of programming language usage.</w:t>
       </w:r>
     </w:p>
-    <w:bookmarkEnd w:id="53"/>
-    <w:bookmarkEnd w:id="54"/>
-    <w:bookmarkStart w:id="71" w:name="conclusion"/>
+    <w:bookmarkEnd w:id="56"/>
+    <w:bookmarkEnd w:id="57"/>
+    <w:bookmarkStart w:id="74" w:name="conclusion"/>
     <w:p>
       <w:pPr>
         <w:pStyle w:val="Heading2"/>
       </w:pPr>
       <w:r>
-        <w:t xml:space="preserve">18 Conclusion</w:t>
+        <w:t xml:space="preserve">19 Conclusion</w:t>
       </w:r>
     </w:p>
     <w:p>
@@ -4644,8 +4729,8 @@
         <w:t xml:space="preserve">add a citation or present direct evidence.</w:t>
       </w:r>
     </w:p>
-    <w:bookmarkStart w:id="70" w:name="refs"/>
-    <w:bookmarkStart w:id="56" w:name="ref-bienayme1853"/>
+    <w:bookmarkStart w:id="73" w:name="refs"/>
+    <w:bookmarkStart w:id="59" w:name="ref-bienayme1853"/>
     <w:p>
       <w:pPr>
         <w:pStyle w:val="Bibliography"/>
@@ -4690,7 +4775,7 @@
       <w:r>
         <w:t xml:space="preserve"> </w:t>
       </w:r>
-      <w:hyperlink r:id="rId55">
+      <w:hyperlink r:id="rId58">
         <w:r>
           <w:rPr>
             <w:rStyle w:val="Hyperlink"/>
@@ -4702,8 +4787,8 @@
         <w:t xml:space="preserve">.</w:t>
       </w:r>
     </w:p>
-    <w:bookmarkEnd w:id="56"/>
-    <w:bookmarkStart w:id="58" w:name="ref-blitzstein2019introduction"/>
+    <w:bookmarkEnd w:id="59"/>
+    <w:bookmarkStart w:id="61" w:name="ref-blitzstein2019introduction"/>
     <w:p>
       <w:pPr>
         <w:pStyle w:val="Bibliography"/>
@@ -4727,7 +4812,7 @@
       <w:r>
         <w:t xml:space="preserve"> </w:t>
       </w:r>
-      <w:hyperlink r:id="rId57">
+      <w:hyperlink r:id="rId60">
         <w:r>
           <w:rPr>
             <w:rStyle w:val="Hyperlink"/>
@@ -4739,8 +4824,8 @@
         <w:t xml:space="preserve">.</w:t>
       </w:r>
     </w:p>
-    <w:bookmarkEnd w:id="58"/>
-    <w:bookmarkStart w:id="60" w:name="ref-hawkins2004"/>
+    <w:bookmarkEnd w:id="61"/>
+    <w:bookmarkStart w:id="63" w:name="ref-hawkins2004"/>
     <w:p>
       <w:pPr>
         <w:pStyle w:val="Bibliography"/>
@@ -4773,7 +4858,7 @@
       <w:r>
         <w:t xml:space="preserve"> </w:t>
       </w:r>
-      <w:hyperlink r:id="rId59">
+      <w:hyperlink r:id="rId62">
         <w:r>
           <w:rPr>
             <w:rStyle w:val="Hyperlink"/>
@@ -4785,8 +4870,8 @@
         <w:t xml:space="preserve">.</w:t>
       </w:r>
     </w:p>
-    <w:bookmarkEnd w:id="60"/>
-    <w:bookmarkStart w:id="62" w:name="ref-knuth84"/>
+    <w:bookmarkEnd w:id="63"/>
+    <w:bookmarkStart w:id="65" w:name="ref-knuth84"/>
     <w:p>
       <w:pPr>
         <w:pStyle w:val="Bibliography"/>
@@ -4819,7 +4904,7 @@
       <w:r>
         <w:t xml:space="preserve"> </w:t>
       </w:r>
-      <w:hyperlink r:id="rId61">
+      <w:hyperlink r:id="rId64">
         <w:r>
           <w:rPr>
             <w:rStyle w:val="Hyperlink"/>
@@ -4831,8 +4916,8 @@
         <w:t xml:space="preserve">.</w:t>
       </w:r>
     </w:p>
-    <w:bookmarkEnd w:id="62"/>
-    <w:bookmarkStart w:id="63" w:name="ref-mitchell1997"/>
+    <w:bookmarkEnd w:id="65"/>
+    <w:bookmarkStart w:id="66" w:name="ref-mitchell1997"/>
     <w:p>
       <w:pPr>
         <w:pStyle w:val="Bibliography"/>
@@ -4854,8 +4939,8 @@
         <w:t xml:space="preserve">. McGraw-Hill.</w:t>
       </w:r>
     </w:p>
-    <w:bookmarkEnd w:id="63"/>
-    <w:bookmarkStart w:id="65" w:name="ref-stackoverflow2024"/>
+    <w:bookmarkEnd w:id="66"/>
+    <w:bookmarkStart w:id="68" w:name="ref-stackoverflow2024"/>
     <w:p>
       <w:pPr>
         <w:pStyle w:val="Bibliography"/>
@@ -4879,7 +4964,7 @@
       <w:r>
         <w:t xml:space="preserve"> </w:t>
       </w:r>
-      <w:hyperlink r:id="rId64">
+      <w:hyperlink r:id="rId67">
         <w:r>
           <w:rPr>
             <w:rStyle w:val="Hyperlink"/>
@@ -4891,8 +4976,8 @@
         <w:t xml:space="preserve">.</w:t>
       </w:r>
     </w:p>
-    <w:bookmarkEnd w:id="65"/>
-    <w:bookmarkStart w:id="67" w:name="ref-tchebichef1867"/>
+    <w:bookmarkEnd w:id="68"/>
+    <w:bookmarkStart w:id="70" w:name="ref-tchebichef1867"/>
     <w:p>
       <w:pPr>
         <w:pStyle w:val="Bibliography"/>
@@ -4922,7 +5007,7 @@
       <w:r>
         <w:t xml:space="preserve"> </w:t>
       </w:r>
-      <w:hyperlink r:id="rId66">
+      <w:hyperlink r:id="rId69">
         <w:r>
           <w:rPr>
             <w:rStyle w:val="Hyperlink"/>
@@ -4934,8 +5019,8 @@
         <w:t xml:space="preserve">.</w:t>
       </w:r>
     </w:p>
-    <w:bookmarkEnd w:id="67"/>
-    <w:bookmarkStart w:id="69" w:name="ref-vapnik1998"/>
+    <w:bookmarkEnd w:id="70"/>
+    <w:bookmarkStart w:id="72" w:name="ref-vapnik1998"/>
     <w:p>
       <w:pPr>
         <w:pStyle w:val="Bibliography"/>
@@ -4959,7 +5044,7 @@
       <w:r>
         <w:t xml:space="preserve"> </w:t>
       </w:r>
-      <w:hyperlink r:id="rId68">
+      <w:hyperlink r:id="rId71">
         <w:r>
           <w:rPr>
             <w:rStyle w:val="Hyperlink"/>
@@ -4971,9 +5056,9 @@
         <w:t xml:space="preserve">.</w:t>
       </w:r>
     </w:p>
-    <w:bookmarkEnd w:id="69"/>
-    <w:bookmarkEnd w:id="70"/>
-    <w:bookmarkEnd w:id="71"/>
+    <w:bookmarkEnd w:id="72"/>
+    <w:bookmarkEnd w:id="73"/>
+    <w:bookmarkEnd w:id="74"/>
     <w:sectPr>
       <w:footnotePr>
         <w:numRestart w:val="eachSect"/>

</xml_diff>

<commit_message>
Deploying to gh-pages from @ Morrison-Lab/psw@a0bd960c3664cae6cab248a6cd4e4287867486f2 🚀
</commit_message>
<xml_diff>
--- a/chapters/citations-evidence.docx
+++ b/chapters/citations-evidence.docx
@@ -15,7 +15,7 @@
         <w:pStyle w:val="Date"/>
       </w:pPr>
       <w:r>
-        <w:t xml:space="preserve">Last modified: 2026-10-16 16:41:57 (PDT)</w:t>
+        <w:t xml:space="preserve">Last modified: 2026-10-16 17:01:04 (PDT)</w:t>
       </w:r>
     </w:p>
     <w:p>
@@ -2035,7 +2035,24 @@
         </w:numPr>
       </w:pPr>
       <w:r>
-        <w:t xml:space="preserve">Wikipedia and general encyclopedias (though they can be useful starting points for finding primary sources)</w:t>
+        <w:t xml:space="preserve">Wikipedia and general encyclopedias as the only source for a claim (cite them beside the primary source, as</w:t>
+      </w:r>
+      <w:r>
+        <w:t xml:space="preserve"> </w:t>
+      </w:r>
+      <w:hyperlink w:anchor="cite-wikipedia-beside-the-primary-source">
+        <w:r>
+          <w:rPr>
+            <w:rStyle w:val="Hyperlink"/>
+          </w:rPr>
+          <w:t xml:space="preserve">Cite Wikipedia, beside the primary source</w:t>
+        </w:r>
+      </w:hyperlink>
+      <w:r>
+        <w:t xml:space="preserve"> </w:t>
+      </w:r>
+      <w:r>
+        <w:t xml:space="preserve">explains)</w:t>
       </w:r>
     </w:p>
     <w:p>
@@ -2396,12 +2413,12 @@
       <w:r>
         <w:t xml:space="preserve"> </w:t>
       </w:r>
-      <w:hyperlink w:anchor="link-to-wikipedia-but-do-not-cite-it">
+      <w:hyperlink w:anchor="cite-wikipedia-beside-the-primary-source">
         <w:r>
           <w:rPr>
             <w:rStyle w:val="Hyperlink"/>
           </w:rPr>
-          <w:t xml:space="preserve">Link to Wikipedia, but do not cite it</w:t>
+          <w:t xml:space="preserve">Cite Wikipedia, beside the primary source</w:t>
         </w:r>
       </w:hyperlink>
       <w:r>
@@ -2701,13 +2718,13 @@
     </w:p>
     <w:bookmarkEnd w:id="33"/>
     <w:bookmarkEnd w:id="34"/>
-    <w:bookmarkStart w:id="37" w:name="link-to-wikipedia-but-do-not-cite-it"/>
+    <w:bookmarkStart w:id="36" w:name="cite-wikipedia-beside-the-primary-source"/>
     <w:p>
       <w:pPr>
         <w:pStyle w:val="Heading2"/>
       </w:pPr>
       <w:r>
-        <w:t xml:space="preserve">8 Link to Wikipedia, but do not cite it</w:t>
+        <w:t xml:space="preserve">8 Cite Wikipedia, beside the primary source</w:t>
       </w:r>
     </w:p>
     <w:p>
@@ -2733,13 +2750,19 @@
         <w:t xml:space="preserve"> </w:t>
       </w:r>
       <w:r>
-        <w:t xml:space="preserve">So link each definition, theorem or named method to its Wikipedia article whenever one exists:</w:t>
-      </w:r>
-      <w:r>
-        <w:t xml:space="preserve"> </w:t>
-      </w:r>
-      <w:r>
-        <w:t xml:space="preserve">the link gives readers a second, free explanation</w:t>
+        <w:t xml:space="preserve">So cite the Wikipedia article for each definition, theorem or named method whenever one exists,</w:t>
+      </w:r>
+      <w:r>
+        <w:t xml:space="preserve"> </w:t>
+      </w:r>
+      <w:r>
+        <w:t xml:space="preserve">and offer it as further reading:</w:t>
+      </w:r>
+      <w:r>
+        <w:t xml:space="preserve"> </w:t>
+      </w:r>
+      <w:r>
+        <w:t xml:space="preserve">the citation gives readers a second, free presentation</w:t>
       </w:r>
       <w:r>
         <w:t xml:space="preserve"> </w:t>
@@ -2753,54 +2776,115 @@
         <w:pStyle w:val="BodyText"/>
       </w:pPr>
       <w:r>
-        <w:t xml:space="preserve">Link, however, does not mean cite.</w:t>
-      </w:r>
-      <w:r>
-        <w:t xml:space="preserve"> </w:t>
-      </w:r>
-      <w:r>
-        <w:t xml:space="preserve">The link tells the reader where to read more;</w:t>
-      </w:r>
-      <w:r>
-        <w:t xml:space="preserve"> </w:t>
-      </w:r>
-      <w:r>
-        <w:t xml:space="preserve">the evidence for a claim still comes from the primary source,</w:t>
-      </w:r>
-      <w:r>
-        <w:t xml:space="preserve"> </w:t>
-      </w:r>
-      <w:r>
-        <w:t xml:space="preserve">as</w:t>
-      </w:r>
-      <w:r>
-        <w:t xml:space="preserve"> </w:t>
-      </w:r>
-      <w:hyperlink w:anchor="sources-to-generally-avoid">
-        <w:r>
-          <w:rPr>
-            <w:rStyle w:val="Hyperlink"/>
-          </w:rPr>
-          <w:t xml:space="preserve">Sources to generally avoid</w:t>
-        </w:r>
-      </w:hyperlink>
-      <w:r>
-        <w:t xml:space="preserve"> </w:t>
-      </w:r>
-      <w:r>
-        <w:t xml:space="preserve">explains.</w:t>
-      </w:r>
-      <w:r>
-        <w:t xml:space="preserve"> </w:t>
-      </w:r>
-      <w:r>
-        <w:t xml:space="preserve">When you do both, put the Wikipedia link beside the definition</w:t>
-      </w:r>
-      <w:r>
-        <w:t xml:space="preserve"> </w:t>
-      </w:r>
-      <w:r>
-        <w:t xml:space="preserve">and the citation beside the claim.</w:t>
+        <w:t xml:space="preserve">The Wikipedia citation adds to the traditional reference and never replaces it.</w:t>
+      </w:r>
+      <w:r>
+        <w:t xml:space="preserve"> </w:t>
+      </w:r>
+      <w:r>
+        <w:t xml:space="preserve">Cite it through the bibliography like any other source,</w:t>
+      </w:r>
+      <w:r>
+        <w:t xml:space="preserve"> </w:t>
+      </w:r>
+      <w:r>
+        <w:t xml:space="preserve">with a</w:t>
+      </w:r>
+      <w:r>
+        <w:t xml:space="preserve"> </w:t>
+      </w:r>
+      <w:r>
+        <w:rPr>
+          <w:rStyle w:val="VerbatimChar"/>
+        </w:rPr>
+        <w:t xml:space="preserve">@misc</w:t>
+      </w:r>
+      <w:r>
+        <w:t xml:space="preserve"> </w:t>
+      </w:r>
+      <w:r>
+        <w:t xml:space="preserve">entry in</w:t>
+      </w:r>
+      <w:r>
+        <w:t xml:space="preserve"> </w:t>
+      </w:r>
+      <w:r>
+        <w:rPr>
+          <w:rStyle w:val="VerbatimChar"/>
+        </w:rPr>
+        <w:t xml:space="preserve">references.bib</w:t>
+      </w:r>
+      <w:r>
+        <w:t xml:space="preserve"> </w:t>
+      </w:r>
+      <w:r>
+        <w:t xml:space="preserve">(author</w:t>
+      </w:r>
+      <w:r>
+        <w:t xml:space="preserve"> </w:t>
+      </w:r>
+      <w:r>
+        <w:rPr>
+          <w:rStyle w:val="VerbatimChar"/>
+        </w:rPr>
+        <w:t xml:space="preserve">{Wikipedia contributors}</w:t>
+      </w:r>
+      <w:r>
+        <w:t xml:space="preserve">, the article’s URL, the access date)</w:t>
+      </w:r>
+      <w:r>
+        <w:t xml:space="preserve"> </w:t>
+      </w:r>
+      <w:r>
+        <w:t xml:space="preserve">keyed</w:t>
+      </w:r>
+      <w:r>
+        <w:t xml:space="preserve"> </w:t>
+      </w:r>
+      <w:r>
+        <w:rPr>
+          <w:rStyle w:val="VerbatimChar"/>
+        </w:rPr>
+        <w:t xml:space="preserve">wikipedia_&lt;article_title&gt;</w:t>
+      </w:r>
+      <w:r>
+        <w:t xml:space="preserve">,</w:t>
+      </w:r>
+      <w:r>
+        <w:t xml:space="preserve"> </w:t>
+      </w:r>
+      <w:r>
+        <w:t xml:space="preserve">and put the citation right after the content it covers, as</w:t>
+      </w:r>
+      <w:r>
+        <w:t xml:space="preserve"> </w:t>
+      </w:r>
+      <w:r>
+        <w:rPr>
+          <w:rStyle w:val="VerbatimChar"/>
+        </w:rPr>
+        <w:t xml:space="preserve">[@wikipedia_poisson_distribution]</w:t>
+      </w:r>
+      <w:r>
+        <w:t xml:space="preserve">.</w:t>
+      </w:r>
+      <w:r>
+        <w:t xml:space="preserve"> </w:t>
+      </w:r>
+      <w:r>
+        <w:t xml:space="preserve">Keep the primary source’s citation beside the claim it supports.</w:t>
+      </w:r>
+      <w:r>
+        <w:t xml:space="preserve"> </w:t>
+      </w:r>
+      <w:r>
+        <w:t xml:space="preserve">Where a page ends a section with further reading,</w:t>
+      </w:r>
+      <w:r>
+        <w:t xml:space="preserve"> </w:t>
+      </w:r>
+      <w:r>
+        <w:t xml:space="preserve">list the same Wikipedia citation there too, next to the other further-reading sources.</w:t>
       </w:r>
     </w:p>
     <w:p>
@@ -2812,7 +2896,7 @@
         </w:numPr>
       </w:pPr>
       <w:r>
-        <w:t xml:space="preserve">Link the article for the specific concept, not a broader article that mentions it.</w:t>
+        <w:t xml:space="preserve">Cite the article for the specific concept, not a broader article that mentions it.</w:t>
       </w:r>
     </w:p>
     <w:p>
@@ -2824,7 +2908,7 @@
         </w:numPr>
       </w:pPr>
       <w:r>
-        <w:t xml:space="preserve">Read the article’s definition before linking it,</w:t>
+        <w:t xml:space="preserve">Read the article’s definition before citing it,</w:t>
       </w:r>
       <w:r>
         <w:t xml:space="preserve"> </w:t>
@@ -2854,7 +2938,7 @@
         </w:numPr>
       </w:pPr>
       <w:r>
-        <w:t xml:space="preserve">Use a stable link to the article, not to a search result.</w:t>
+        <w:t xml:space="preserve">Use a stable URL for the article, not a search result.</w:t>
       </w:r>
     </w:p>
     <w:p>
@@ -2866,7 +2950,7 @@
         </w:numPr>
       </w:pPr>
       <w:r>
-        <w:t xml:space="preserve">Link a term once where it is defined, not at every use;</w:t>
+        <w:t xml:space="preserve">Cite an article once where its term is defined, not at every use;</w:t>
       </w:r>
       <w:r>
         <w:t xml:space="preserve"> </w:t>
@@ -2875,7 +2959,7 @@
         <w:t xml:space="preserve">later uses link to your own definition.</w:t>
       </w:r>
     </w:p>
-    <w:bookmarkStart w:id="36" w:name="exm-link-wikipedia"/>
+    <w:bookmarkStart w:id="35" w:name="exm-link-wikipedia"/>
     <w:p>
       <w:pPr>
         <w:pStyle w:val="FirstParagraph"/>
@@ -2885,7 +2969,7 @@
           <w:b/>
           <w:bCs/>
         </w:rPr>
-        <w:t xml:space="preserve">Example 3 (Linking a definition to Wikipedia)</w:t>
+        <w:t xml:space="preserve">Example 3 (Citing a definition’s Wikipedia article)</w:t>
       </w:r>
       <w:r>
         <w:t xml:space="preserve"> </w:t>
@@ -2945,18 +3029,10 @@
         <w:t xml:space="preserve"> </w:t>
       </w:r>
       <w:r>
-        <w:t xml:space="preserve">(</w:t>
-      </w:r>
-      <w:hyperlink r:id="rId35">
-        <w:r>
-          <w:rPr>
-            <w:rStyle w:val="Hyperlink"/>
-          </w:rPr>
-          <w:t xml:space="preserve">Wikipedia: Poisson distribution</w:t>
-        </w:r>
-      </w:hyperlink>
-      <w:r>
-        <w:t xml:space="preserve">).</w:t>
+        <w:t xml:space="preserve">(Wikipedia contributors 2026)</w:t>
+      </w:r>
+      <w:r>
+        <w:t xml:space="preserve">.</w:t>
       </w:r>
     </w:p>
     <w:p>
@@ -2970,12 +3046,12 @@
         <w:t xml:space="preserve"> </w:t>
       </w:r>
       <w:r>
-        <w:t xml:space="preserve">and the definition itself still comes from your own text.</w:t>
-      </w:r>
-    </w:p>
+        <w:t xml:space="preserve">and the definition itself still comes from your own text and its traditional reference.</w:t>
+      </w:r>
+    </w:p>
+    <w:bookmarkEnd w:id="35"/>
     <w:bookmarkEnd w:id="36"/>
-    <w:bookmarkEnd w:id="37"/>
-    <w:bookmarkStart w:id="38" w:name="best-practices"/>
+    <w:bookmarkStart w:id="37" w:name="best-practices"/>
     <w:p>
       <w:pPr>
         <w:pStyle w:val="Heading2"/>
@@ -3152,14 +3228,98 @@
         <w:t xml:space="preserve">: When possible, include work from different research groups and perspectives</w:t>
       </w:r>
     </w:p>
+    <w:bookmarkEnd w:id="37"/>
+    <w:bookmarkStart w:id="38" w:name="quote-the-original"/>
+    <w:p>
+      <w:pPr>
+        <w:pStyle w:val="Heading2"/>
+      </w:pPr>
+      <w:r>
+        <w:t xml:space="preserve">10 Quote the original</w:t>
+      </w:r>
+    </w:p>
+    <w:p>
+      <w:pPr>
+        <w:pStyle w:val="FirstParagraph"/>
+      </w:pPr>
+      <w:r>
+        <w:t xml:space="preserve">Quote and cite the source that said it,</w:t>
+      </w:r>
+      <w:r>
+        <w:t xml:space="preserve"> </w:t>
+      </w:r>
+      <w:r>
+        <w:t xml:space="preserve">not a later source that quotes it.</w:t>
+      </w:r>
+      <w:r>
+        <w:t xml:space="preserve"> </w:t>
+      </w:r>
+      <w:r>
+        <w:t xml:space="preserve">Check the wording and the page against the original.</w:t>
+      </w:r>
+    </w:p>
+    <w:p>
+      <w:pPr>
+        <w:pStyle w:val="BlockText"/>
+      </w:pPr>
+      <w:r>
+        <w:t xml:space="preserve">❌ Mitchell (1997), as quoted in Goodfellow et al. (2016), defines …</w:t>
+      </w:r>
+    </w:p>
+    <w:p>
+      <w:pPr>
+        <w:pStyle w:val="BlockText"/>
+      </w:pPr>
+      <w:r>
+        <w:t xml:space="preserve">✅</w:t>
+      </w:r>
+      <w:r>
+        <w:t xml:space="preserve"> </w:t>
+      </w:r>
+      <w:r>
+        <w:t xml:space="preserve">“A computer program is said to learn …”</w:t>
+      </w:r>
+      <w:r>
+        <w:t xml:space="preserve"> </w:t>
+      </w:r>
+      <w:r>
+        <w:t xml:space="preserve">(Mitchell 1997)</w:t>
+      </w:r>
+    </w:p>
+    <w:p>
+      <w:pPr>
+        <w:pStyle w:val="FirstParagraph"/>
+      </w:pPr>
+      <w:r>
+        <w:t xml:space="preserve">Credit a quotation to whoever speaks it in the primary source,</w:t>
+      </w:r>
+      <w:r>
+        <w:t xml:space="preserve"> </w:t>
+      </w:r>
+      <w:r>
+        <w:t xml:space="preserve">even when the speaker is quoting someone else.</w:t>
+      </w:r>
+      <w:r>
+        <w:t xml:space="preserve"> </w:t>
+      </w:r>
+      <w:r>
+        <w:t xml:space="preserve">When attribution is in doubt, read the primary source (a transcript, the original page) first.</w:t>
+      </w:r>
+      <w:r>
+        <w:t xml:space="preserve"> </w:t>
+      </w:r>
+      <w:r>
+        <w:t xml:space="preserve">Uncertainty about who said a line is not evidence about who said it.</w:t>
+      </w:r>
+    </w:p>
     <w:bookmarkEnd w:id="38"/>
-    <w:bookmarkStart w:id="39" w:name="quote-the-original"/>
+    <w:bookmarkStart w:id="39" w:name="Xdc6e961a4731f42c2c786ef03a498fc72396848"/>
     <w:p>
       <w:pPr>
         <w:pStyle w:val="Heading2"/>
       </w:pPr>
       <w:r>
-        <w:t xml:space="preserve">10 Quote the original</w:t>
+        <w:t xml:space="preserve">11 Copy organization names from their source</w:t>
       </w:r>
     </w:p>
     <w:p>
@@ -3167,47 +3327,29 @@
         <w:pStyle w:val="FirstParagraph"/>
       </w:pPr>
       <w:r>
-        <w:t xml:space="preserve">Quote and cite the source that said it,</w:t>
-      </w:r>
-      <w:r>
-        <w:t xml:space="preserve"> </w:t>
-      </w:r>
-      <w:r>
-        <w:t xml:space="preserve">not a later source that quotes it.</w:t>
-      </w:r>
-      <w:r>
-        <w:t xml:space="preserve"> </w:t>
-      </w:r>
-      <w:r>
-        <w:t xml:space="preserve">Check the wording and the page against the original.</w:t>
-      </w:r>
-    </w:p>
-    <w:p>
-      <w:pPr>
-        <w:pStyle w:val="BlockText"/>
-      </w:pPr>
-      <w:r>
-        <w:t xml:space="preserve">❌ Mitchell (1997), as quoted in Goodfellow et al. (2016), defines …</w:t>
-      </w:r>
-    </w:p>
-    <w:p>
-      <w:pPr>
-        <w:pStyle w:val="BlockText"/>
-      </w:pPr>
-      <w:r>
-        <w:t xml:space="preserve">✅</w:t>
-      </w:r>
-      <w:r>
-        <w:t xml:space="preserve"> </w:t>
-      </w:r>
-      <w:r>
-        <w:t xml:space="preserve">“A computer program is said to learn …”</w:t>
-      </w:r>
-      <w:r>
-        <w:t xml:space="preserve"> </w:t>
-      </w:r>
-      <w:r>
-        <w:t xml:space="preserve">(Mitchell 1997)</w:t>
+        <w:t xml:space="preserve">When a bibliography entry names an organization,</w:t>
+      </w:r>
+      <w:r>
+        <w:t xml:space="preserve"> </w:t>
+      </w:r>
+      <w:r>
+        <w:t xml:space="preserve">copy the name from the organization’s own page (its about page, README or footer)</w:t>
+      </w:r>
+      <w:r>
+        <w:t xml:space="preserve"> </w:t>
+      </w:r>
+      <w:r>
+        <w:t xml:space="preserve">rather than expanding an acronym from memory.</w:t>
+      </w:r>
+    </w:p>
+    <w:bookmarkEnd w:id="39"/>
+    <w:bookmarkStart w:id="42" w:name="verify-each-bibliography-entry"/>
+    <w:p>
+      <w:pPr>
+        <w:pStyle w:val="Heading2"/>
+      </w:pPr>
+      <w:r>
+        <w:t xml:space="preserve">12 Verify each bibliography entry</w:t>
       </w:r>
     </w:p>
     <w:p>
@@ -3215,72 +3357,6 @@
         <w:pStyle w:val="FirstParagraph"/>
       </w:pPr>
       <w:r>
-        <w:t xml:space="preserve">Credit a quotation to whoever speaks it in the primary source,</w:t>
-      </w:r>
-      <w:r>
-        <w:t xml:space="preserve"> </w:t>
-      </w:r>
-      <w:r>
-        <w:t xml:space="preserve">even when the speaker is quoting someone else.</w:t>
-      </w:r>
-      <w:r>
-        <w:t xml:space="preserve"> </w:t>
-      </w:r>
-      <w:r>
-        <w:t xml:space="preserve">When attribution is in doubt, read the primary source (a transcript, the original page) first.</w:t>
-      </w:r>
-      <w:r>
-        <w:t xml:space="preserve"> </w:t>
-      </w:r>
-      <w:r>
-        <w:t xml:space="preserve">Uncertainty about who said a line is not evidence about who said it.</w:t>
-      </w:r>
-    </w:p>
-    <w:bookmarkEnd w:id="39"/>
-    <w:bookmarkStart w:id="40" w:name="Xdc6e961a4731f42c2c786ef03a498fc72396848"/>
-    <w:p>
-      <w:pPr>
-        <w:pStyle w:val="Heading2"/>
-      </w:pPr>
-      <w:r>
-        <w:t xml:space="preserve">11 Copy organization names from their source</w:t>
-      </w:r>
-    </w:p>
-    <w:p>
-      <w:pPr>
-        <w:pStyle w:val="FirstParagraph"/>
-      </w:pPr>
-      <w:r>
-        <w:t xml:space="preserve">When a bibliography entry names an organization,</w:t>
-      </w:r>
-      <w:r>
-        <w:t xml:space="preserve"> </w:t>
-      </w:r>
-      <w:r>
-        <w:t xml:space="preserve">copy the name from the organization’s own page (its about page, README or footer)</w:t>
-      </w:r>
-      <w:r>
-        <w:t xml:space="preserve"> </w:t>
-      </w:r>
-      <w:r>
-        <w:t xml:space="preserve">rather than expanding an acronym from memory.</w:t>
-      </w:r>
-    </w:p>
-    <w:bookmarkEnd w:id="40"/>
-    <w:bookmarkStart w:id="43" w:name="verify-each-bibliography-entry"/>
-    <w:p>
-      <w:pPr>
-        <w:pStyle w:val="Heading2"/>
-      </w:pPr>
-      <w:r>
-        <w:t xml:space="preserve">12 Verify each bibliography entry</w:t>
-      </w:r>
-    </w:p>
-    <w:p>
-      <w:pPr>
-        <w:pStyle w:val="FirstParagraph"/>
-      </w:pPr>
-      <w:r>
         <w:t xml:space="preserve">Check each detail of a bibliography entry against an official source.</w:t>
       </w:r>
       <w:r>
@@ -3292,7 +3368,7 @@
       <w:r>
         <w:t xml:space="preserve"> </w:t>
       </w:r>
-      <w:hyperlink r:id="rId41">
+      <w:hyperlink r:id="rId40">
         <w:r>
           <w:rPr>
             <w:rStyle w:val="Hyperlink"/>
@@ -3309,7 +3385,7 @@
       <w:r>
         <w:t xml:space="preserve"> </w:t>
       </w:r>
-      <w:hyperlink r:id="rId42">
+      <w:hyperlink r:id="rId41">
         <w:r>
           <w:rPr>
             <w:rStyle w:val="Hyperlink"/>
@@ -3351,14 +3427,111 @@
         <w:t xml:space="preserve">and say in the pull request what you checked against what.</w:t>
       </w:r>
     </w:p>
+    <w:bookmarkEnd w:id="42"/>
+    <w:bookmarkStart w:id="43" w:name="cite-an-alias-directly"/>
+    <w:p>
+      <w:pPr>
+        <w:pStyle w:val="Heading2"/>
+      </w:pPr>
+      <w:r>
+        <w:t xml:space="preserve">13 Cite an alias directly</w:t>
+      </w:r>
+    </w:p>
+    <w:p>
+      <w:pPr>
+        <w:pStyle w:val="FirstParagraph"/>
+      </w:pPr>
+      <w:r>
+        <w:t xml:space="preserve">When a source uses another name for a defined term,</w:t>
+      </w:r>
+      <w:r>
+        <w:t xml:space="preserve"> </w:t>
+      </w:r>
+      <w:r>
+        <w:t xml:space="preserve">write the alias in bold and cite the source after it,</w:t>
+      </w:r>
+      <w:r>
+        <w:t xml:space="preserve"> </w:t>
+      </w:r>
+      <w:r>
+        <w:t xml:space="preserve">as in</w:t>
+      </w:r>
+      <w:r>
+        <w:t xml:space="preserve"> </w:t>
+      </w:r>
+      <w:r>
+        <w:rPr>
+          <w:rStyle w:val="VerbatimChar"/>
+        </w:rPr>
+        <w:t xml:space="preserve">also called the **alias** [@key, section]</w:t>
+      </w:r>
+      <w:r>
+        <w:t xml:space="preserve">.</w:t>
+      </w:r>
+      <w:r>
+        <w:t xml:space="preserve"> </w:t>
+      </w:r>
+      <w:r>
+        <w:t xml:space="preserve">The citation already says that the source uses the name,</w:t>
+      </w:r>
+      <w:r>
+        <w:t xml:space="preserve"> </w:t>
+      </w:r>
+      <w:r>
+        <w:t xml:space="preserve">so do not add a sentence such as</w:t>
+      </w:r>
+      <w:r>
+        <w:t xml:space="preserve"> </w:t>
+      </w:r>
+      <w:r>
+        <w:t xml:space="preserve">“The source uses that name”</w:t>
+      </w:r>
+      <w:r>
+        <w:t xml:space="preserve">.</w:t>
+      </w:r>
+    </w:p>
+    <w:p>
+      <w:pPr>
+        <w:pStyle w:val="BlockText"/>
+      </w:pPr>
+      <w:r>
+        <w:t xml:space="preserve">❌</w:t>
+      </w:r>
+      <w:r>
+        <w:t xml:space="preserve"> </w:t>
+      </w:r>
+      <w:r>
+        <w:rPr>
+          <w:rStyle w:val="VerbatimChar"/>
+        </w:rPr>
+        <w:t xml:space="preserve">also called the **alias**. The cited textbook uses that name.</w:t>
+      </w:r>
+    </w:p>
+    <w:p>
+      <w:pPr>
+        <w:pStyle w:val="BlockText"/>
+      </w:pPr>
+      <w:r>
+        <w:t xml:space="preserve">✅</w:t>
+      </w:r>
+      <w:r>
+        <w:t xml:space="preserve"> </w:t>
+      </w:r>
+      <w:r>
+        <w:rPr>
+          <w:rStyle w:val="VerbatimChar"/>
+        </w:rPr>
+        <w:t xml:space="preserve">also called the **alias** [@key, section]</w:t>
+      </w:r>
+    </w:p>
     <w:bookmarkEnd w:id="43"/>
-    <w:bookmarkStart w:id="44" w:name="cite-an-alias-directly"/>
+    <w:bookmarkStart w:id="46" w:name="cite-the-original-for-named-results"/>
     <w:p>
       <w:pPr>
         <w:pStyle w:val="Heading2"/>
       </w:pPr>
       <w:r>
-        <w:t xml:space="preserve">13 Cite an alias directly</w:t>
+        <w:t xml:space="preserve">14 Cite the original for named results</w:t>
       </w:r>
     </w:p>
     <w:p>
@@ -3366,19 +3539,57 @@
         <w:pStyle w:val="FirstParagraph"/>
       </w:pPr>
       <w:r>
-        <w:t xml:space="preserve">When a source uses another name for a defined term,</w:t>
-      </w:r>
-      <w:r>
-        <w:t xml:space="preserve"> </w:t>
-      </w:r>
-      <w:r>
-        <w:t xml:space="preserve">write the alias in bold and cite the source after it,</w:t>
-      </w:r>
-      <w:r>
-        <w:t xml:space="preserve"> </w:t>
-      </w:r>
-      <w:r>
-        <w:t xml:space="preserve">as in</w:t>
+        <w:t xml:space="preserve">When you present a result that carries a person’s name,</w:t>
+      </w:r>
+      <w:r>
+        <w:t xml:space="preserve"> </w:t>
+      </w:r>
+      <w:r>
+        <w:t xml:space="preserve">or whose first appearance is well documented,</w:t>
+      </w:r>
+      <w:r>
+        <w:t xml:space="preserve"> </w:t>
+      </w:r>
+      <w:r>
+        <w:t xml:space="preserve">cite the publication where it first appeared</w:t>
+      </w:r>
+      <w:r>
+        <w:t xml:space="preserve"> </w:t>
+      </w:r>
+      <w:r>
+        <w:t xml:space="preserve">alongside a modern textbook that teaches it.</w:t>
+      </w:r>
+      <w:r>
+        <w:t xml:space="preserve"> </w:t>
+      </w:r>
+      <w:r>
+        <w:t xml:space="preserve">The original shows readers where the result comes from</w:t>
+      </w:r>
+      <w:r>
+        <w:t xml:space="preserve"> </w:t>
+      </w:r>
+      <w:r>
+        <w:t xml:space="preserve">and credits its authors.</w:t>
+      </w:r>
+      <w:r>
+        <w:t xml:space="preserve"> </w:t>
+      </w:r>
+      <w:r>
+        <w:t xml:space="preserve">The textbook is where a student will actually learn it.</w:t>
+      </w:r>
+    </w:p>
+    <w:p>
+      <w:pPr>
+        <w:pStyle w:val="BodyText"/>
+      </w:pPr>
+      <w:r>
+        <w:t xml:space="preserve">When the credit is only a citation,</w:t>
+      </w:r>
+      <w:r>
+        <w:t xml:space="preserve"> </w:t>
+      </w:r>
+      <w:r>
+        <w:t xml:space="preserve">end the definition or theorem div with a line</w:t>
       </w:r>
       <w:r>
         <w:t xml:space="preserve"> </w:t>
@@ -3387,7 +3598,7 @@
         <w:rPr>
           <w:rStyle w:val="VerbatimChar"/>
         </w:rPr>
-        <w:t xml:space="preserve">also called the **alias** [@key, section]</w:t>
+        <w:t xml:space="preserve">Source: @key [locator]</w:t>
       </w:r>
       <w:r>
         <w:t xml:space="preserve">.</w:t>
@@ -3396,66 +3607,93 @@
         <w:t xml:space="preserve"> </w:t>
       </w:r>
       <w:r>
-        <w:t xml:space="preserve">The citation already says that the source uses the name,</w:t>
-      </w:r>
-      <w:r>
-        <w:t xml:space="preserve"> </w:t>
-      </w:r>
-      <w:r>
-        <w:t xml:space="preserve">so do not add a sentence such as</w:t>
-      </w:r>
-      <w:r>
-        <w:t xml:space="preserve"> </w:t>
-      </w:r>
-      <w:r>
-        <w:t xml:space="preserve">“The source uses that name”</w:t>
-      </w:r>
-      <w:r>
-        <w:t xml:space="preserve">.</w:t>
-      </w:r>
-    </w:p>
-    <w:p>
-      <w:pPr>
-        <w:pStyle w:val="BlockText"/>
-      </w:pPr>
-      <w:r>
-        <w:t xml:space="preserve">❌</w:t>
-      </w:r>
-      <w:r>
-        <w:t xml:space="preserve"> </w:t>
-      </w:r>
-      <w:r>
-        <w:rPr>
-          <w:rStyle w:val="VerbatimChar"/>
-        </w:rPr>
-        <w:t xml:space="preserve">also called the **alias**. The cited textbook uses that name.</w:t>
-      </w:r>
-    </w:p>
-    <w:p>
-      <w:pPr>
-        <w:pStyle w:val="BlockText"/>
-      </w:pPr>
-      <w:r>
-        <w:t xml:space="preserve">✅</w:t>
-      </w:r>
-      <w:r>
-        <w:t xml:space="preserve"> </w:t>
-      </w:r>
-      <w:r>
-        <w:rPr>
-          <w:rStyle w:val="VerbatimChar"/>
-        </w:rPr>
-        <w:t xml:space="preserve">also called the **alias** [@key, section]</w:t>
-      </w:r>
-    </w:p>
-    <w:bookmarkEnd w:id="44"/>
-    <w:bookmarkStart w:id="47" w:name="cite-the-original-for-named-results"/>
-    <w:p>
-      <w:pPr>
-        <w:pStyle w:val="Heading2"/>
-      </w:pPr>
-      <w:r>
-        <w:t xml:space="preserve">14 Cite the original for named results</w:t>
+        <w:t xml:space="preserve">A reference adds no commentary to the statement,</w:t>
+      </w:r>
+      <w:r>
+        <w:t xml:space="preserve"> </w:t>
+      </w:r>
+      <w:r>
+        <w:t xml:space="preserve">and a separate remark that holds only a citation is clutter.</w:t>
+      </w:r>
+      <w:r>
+        <w:t xml:space="preserve"> </w:t>
+      </w:r>
+      <w:r>
+        <w:t xml:space="preserve">When the credit needs substantial prose about the source or history of the content,</w:t>
+      </w:r>
+      <w:r>
+        <w:t xml:space="preserve"> </w:t>
+      </w:r>
+      <w:r>
+        <w:t xml:space="preserve">put that prose in a short remark after the statement and its proof,</w:t>
+      </w:r>
+      <w:r>
+        <w:t xml:space="preserve"> </w:t>
+      </w:r>
+      <w:r>
+        <w:t xml:space="preserve">not inside the definition or theorem itself,</w:t>
+      </w:r>
+      <w:r>
+        <w:t xml:space="preserve"> </w:t>
+      </w:r>
+      <w:r>
+        <w:t xml:space="preserve">so that each theorem div still holds one result.</w:t>
+      </w:r>
+    </w:p>
+    <w:p>
+      <w:pPr>
+        <w:pStyle w:val="BodyText"/>
+      </w:pPr>
+      <w:r>
+        <w:t xml:space="preserve">Apply the rule to:</w:t>
+      </w:r>
+    </w:p>
+    <w:p>
+      <w:pPr>
+        <w:pStyle w:val="Compact"/>
+        <w:numPr>
+          <w:ilvl w:val="0"/>
+          <w:numId w:val="1018"/>
+        </w:numPr>
+      </w:pPr>
+      <w:r>
+        <w:t xml:space="preserve">named theorems, inequalities, and algorithms;</w:t>
+      </w:r>
+    </w:p>
+    <w:p>
+      <w:pPr>
+        <w:pStyle w:val="Compact"/>
+        <w:numPr>
+          <w:ilvl w:val="0"/>
+          <w:numId w:val="1018"/>
+        </w:numPr>
+      </w:pPr>
+      <w:r>
+        <w:t xml:space="preserve">definitions that a specific paper introduced;</w:t>
+      </w:r>
+    </w:p>
+    <w:p>
+      <w:pPr>
+        <w:pStyle w:val="Compact"/>
+        <w:numPr>
+          <w:ilvl w:val="0"/>
+          <w:numId w:val="1018"/>
+        </w:numPr>
+      </w:pPr>
+      <w:r>
+        <w:t xml:space="preserve">results whose usual name is not the whole story,</w:t>
+      </w:r>
+      <w:r>
+        <w:t xml:space="preserve"> </w:t>
+      </w:r>
+      <w:r>
+        <w:t xml:space="preserve">such as Chebyshev’s inequality,</w:t>
+      </w:r>
+      <w:r>
+        <w:t xml:space="preserve"> </w:t>
+      </w:r>
+      <w:r>
+        <w:t xml:space="preserve">which Bienaymé derived earlier.</w:t>
       </w:r>
     </w:p>
     <w:p>
@@ -3463,43 +3701,63 @@
         <w:pStyle w:val="FirstParagraph"/>
       </w:pPr>
       <w:r>
-        <w:t xml:space="preserve">When you present a result that carries a person’s name,</w:t>
-      </w:r>
-      <w:r>
-        <w:t xml:space="preserve"> </w:t>
-      </w:r>
-      <w:r>
-        <w:t xml:space="preserve">or whose first appearance is well documented,</w:t>
-      </w:r>
-      <w:r>
-        <w:t xml:space="preserve"> </w:t>
-      </w:r>
-      <w:r>
-        <w:t xml:space="preserve">cite the publication where it first appeared</w:t>
-      </w:r>
-      <w:r>
-        <w:t xml:space="preserve"> </w:t>
-      </w:r>
-      <w:r>
-        <w:t xml:space="preserve">alongside a modern textbook that teaches it.</w:t>
-      </w:r>
-      <w:r>
-        <w:t xml:space="preserve"> </w:t>
-      </w:r>
-      <w:r>
-        <w:t xml:space="preserve">The original shows readers where the result comes from</w:t>
-      </w:r>
-      <w:r>
-        <w:t xml:space="preserve"> </w:t>
-      </w:r>
-      <w:r>
-        <w:t xml:space="preserve">and credits its authors.</w:t>
-      </w:r>
-      <w:r>
-        <w:t xml:space="preserve"> </w:t>
-      </w:r>
-      <w:r>
-        <w:t xml:space="preserve">The textbook is where a student will actually learn it.</w:t>
+        <w:t xml:space="preserve">Do not apply it to:</w:t>
+      </w:r>
+    </w:p>
+    <w:p>
+      <w:pPr>
+        <w:pStyle w:val="Compact"/>
+        <w:numPr>
+          <w:ilvl w:val="0"/>
+          <w:numId w:val="1019"/>
+        </w:numPr>
+      </w:pPr>
+      <w:r>
+        <w:t xml:space="preserve">routine lemmas;</w:t>
+      </w:r>
+    </w:p>
+    <w:p>
+      <w:pPr>
+        <w:pStyle w:val="Compact"/>
+        <w:numPr>
+          <w:ilvl w:val="0"/>
+          <w:numId w:val="1019"/>
+        </w:numPr>
+      </w:pPr>
+      <w:r>
+        <w:t xml:space="preserve">textbook exercises;</w:t>
+      </w:r>
+    </w:p>
+    <w:p>
+      <w:pPr>
+        <w:pStyle w:val="Compact"/>
+        <w:numPr>
+          <w:ilvl w:val="0"/>
+          <w:numId w:val="1019"/>
+        </w:numPr>
+      </w:pPr>
+      <w:r>
+        <w:t xml:space="preserve">results with no identifiable first source.</w:t>
+      </w:r>
+    </w:p>
+    <w:p>
+      <w:pPr>
+        <w:pStyle w:val="FirstParagraph"/>
+      </w:pPr>
+      <w:r>
+        <w:t xml:space="preserve">When the credit is disputed or the first source is unclear,</w:t>
+      </w:r>
+      <w:r>
+        <w:t xml:space="preserve"> </w:t>
+      </w:r>
+      <w:r>
+        <w:t xml:space="preserve">say so in one sentence and cite a history of the result</w:t>
+      </w:r>
+      <w:r>
+        <w:t xml:space="preserve"> </w:t>
+      </w:r>
+      <w:r>
+        <w:t xml:space="preserve">instead of naming a source you have not checked.</w:t>
       </w:r>
     </w:p>
     <w:p>
@@ -3507,188 +3765,6 @@
         <w:pStyle w:val="BodyText"/>
       </w:pPr>
       <w:r>
-        <w:t xml:space="preserve">When the credit is only a citation,</w:t>
-      </w:r>
-      <w:r>
-        <w:t xml:space="preserve"> </w:t>
-      </w:r>
-      <w:r>
-        <w:t xml:space="preserve">end the definition or theorem div with a line</w:t>
-      </w:r>
-      <w:r>
-        <w:t xml:space="preserve"> </w:t>
-      </w:r>
-      <w:r>
-        <w:rPr>
-          <w:rStyle w:val="VerbatimChar"/>
-        </w:rPr>
-        <w:t xml:space="preserve">Source: @key [locator]</w:t>
-      </w:r>
-      <w:r>
-        <w:t xml:space="preserve">.</w:t>
-      </w:r>
-      <w:r>
-        <w:t xml:space="preserve"> </w:t>
-      </w:r>
-      <w:r>
-        <w:t xml:space="preserve">A reference adds no commentary to the statement,</w:t>
-      </w:r>
-      <w:r>
-        <w:t xml:space="preserve"> </w:t>
-      </w:r>
-      <w:r>
-        <w:t xml:space="preserve">and a separate remark that holds only a citation is clutter.</w:t>
-      </w:r>
-      <w:r>
-        <w:t xml:space="preserve"> </w:t>
-      </w:r>
-      <w:r>
-        <w:t xml:space="preserve">When the credit needs substantial prose about the source or history of the content,</w:t>
-      </w:r>
-      <w:r>
-        <w:t xml:space="preserve"> </w:t>
-      </w:r>
-      <w:r>
-        <w:t xml:space="preserve">put that prose in a short remark after the statement and its proof,</w:t>
-      </w:r>
-      <w:r>
-        <w:t xml:space="preserve"> </w:t>
-      </w:r>
-      <w:r>
-        <w:t xml:space="preserve">not inside the definition or theorem itself,</w:t>
-      </w:r>
-      <w:r>
-        <w:t xml:space="preserve"> </w:t>
-      </w:r>
-      <w:r>
-        <w:t xml:space="preserve">so that each theorem div still holds one result.</w:t>
-      </w:r>
-    </w:p>
-    <w:p>
-      <w:pPr>
-        <w:pStyle w:val="BodyText"/>
-      </w:pPr>
-      <w:r>
-        <w:t xml:space="preserve">Apply the rule to:</w:t>
-      </w:r>
-    </w:p>
-    <w:p>
-      <w:pPr>
-        <w:pStyle w:val="Compact"/>
-        <w:numPr>
-          <w:ilvl w:val="0"/>
-          <w:numId w:val="1018"/>
-        </w:numPr>
-      </w:pPr>
-      <w:r>
-        <w:t xml:space="preserve">named theorems, inequalities, and algorithms;</w:t>
-      </w:r>
-    </w:p>
-    <w:p>
-      <w:pPr>
-        <w:pStyle w:val="Compact"/>
-        <w:numPr>
-          <w:ilvl w:val="0"/>
-          <w:numId w:val="1018"/>
-        </w:numPr>
-      </w:pPr>
-      <w:r>
-        <w:t xml:space="preserve">definitions that a specific paper introduced;</w:t>
-      </w:r>
-    </w:p>
-    <w:p>
-      <w:pPr>
-        <w:pStyle w:val="Compact"/>
-        <w:numPr>
-          <w:ilvl w:val="0"/>
-          <w:numId w:val="1018"/>
-        </w:numPr>
-      </w:pPr>
-      <w:r>
-        <w:t xml:space="preserve">results whose usual name is not the whole story,</w:t>
-      </w:r>
-      <w:r>
-        <w:t xml:space="preserve"> </w:t>
-      </w:r>
-      <w:r>
-        <w:t xml:space="preserve">such as Chebyshev’s inequality,</w:t>
-      </w:r>
-      <w:r>
-        <w:t xml:space="preserve"> </w:t>
-      </w:r>
-      <w:r>
-        <w:t xml:space="preserve">which Bienaymé derived earlier.</w:t>
-      </w:r>
-    </w:p>
-    <w:p>
-      <w:pPr>
-        <w:pStyle w:val="FirstParagraph"/>
-      </w:pPr>
-      <w:r>
-        <w:t xml:space="preserve">Do not apply it to:</w:t>
-      </w:r>
-    </w:p>
-    <w:p>
-      <w:pPr>
-        <w:pStyle w:val="Compact"/>
-        <w:numPr>
-          <w:ilvl w:val="0"/>
-          <w:numId w:val="1019"/>
-        </w:numPr>
-      </w:pPr>
-      <w:r>
-        <w:t xml:space="preserve">routine lemmas;</w:t>
-      </w:r>
-    </w:p>
-    <w:p>
-      <w:pPr>
-        <w:pStyle w:val="Compact"/>
-        <w:numPr>
-          <w:ilvl w:val="0"/>
-          <w:numId w:val="1019"/>
-        </w:numPr>
-      </w:pPr>
-      <w:r>
-        <w:t xml:space="preserve">textbook exercises;</w:t>
-      </w:r>
-    </w:p>
-    <w:p>
-      <w:pPr>
-        <w:pStyle w:val="Compact"/>
-        <w:numPr>
-          <w:ilvl w:val="0"/>
-          <w:numId w:val="1019"/>
-        </w:numPr>
-      </w:pPr>
-      <w:r>
-        <w:t xml:space="preserve">results with no identifiable first source.</w:t>
-      </w:r>
-    </w:p>
-    <w:p>
-      <w:pPr>
-        <w:pStyle w:val="FirstParagraph"/>
-      </w:pPr>
-      <w:r>
-        <w:t xml:space="preserve">When the credit is disputed or the first source is unclear,</w:t>
-      </w:r>
-      <w:r>
-        <w:t xml:space="preserve"> </w:t>
-      </w:r>
-      <w:r>
-        <w:t xml:space="preserve">say so in one sentence and cite a history of the result</w:t>
-      </w:r>
-      <w:r>
-        <w:t xml:space="preserve"> </w:t>
-      </w:r>
-      <w:r>
-        <w:t xml:space="preserve">instead of naming a source you have not checked.</w:t>
-      </w:r>
-    </w:p>
-    <w:p>
-      <w:pPr>
-        <w:pStyle w:val="BodyText"/>
-      </w:pPr>
-      <w:r>
         <w:t xml:space="preserve">Check every detail of the original against an official source, such as:</w:t>
       </w:r>
     </w:p>
@@ -3730,7 +3806,7 @@
       <w:r>
         <w:t xml:space="preserve"> </w:t>
       </w:r>
-      <w:hyperlink r:id="rId45">
+      <w:hyperlink r:id="rId44">
         <w:r>
           <w:rPr>
             <w:rStyle w:val="Hyperlink"/>
@@ -3756,7 +3832,7 @@
         <w:t xml:space="preserve">and never fill in a title, volume, or page number from memory.</w:t>
       </w:r>
     </w:p>
-    <w:bookmarkStart w:id="46" w:name="exm-cite-original"/>
+    <w:bookmarkStart w:id="45" w:name="exm-cite-original"/>
     <w:p>
       <w:pPr>
         <w:pStyle w:val="BodyText"/>
@@ -3830,15 +3906,69 @@
         <w:t xml:space="preserve">.</w:t>
       </w:r>
     </w:p>
+    <w:bookmarkEnd w:id="45"/>
     <w:bookmarkEnd w:id="46"/>
+    <w:bookmarkStart w:id="47" w:name="put-the-content-first"/>
+    <w:p>
+      <w:pPr>
+        <w:pStyle w:val="Heading2"/>
+      </w:pPr>
+      <w:r>
+        <w:t xml:space="preserve">15 Put the content first</w:t>
+      </w:r>
+    </w:p>
+    <w:p>
+      <w:pPr>
+        <w:pStyle w:val="FirstParagraph"/>
+      </w:pPr>
+      <w:r>
+        <w:t xml:space="preserve">Headings and sentences should name the topic, not its author:</w:t>
+      </w:r>
+      <w:r>
+        <w:t xml:space="preserve"> </w:t>
+      </w:r>
+      <w:r>
+        <w:t xml:space="preserve">“A formal definition of machine learning”</w:t>
+      </w:r>
+      <w:r>
+        <w:t xml:space="preserve">,</w:t>
+      </w:r>
+      <w:r>
+        <w:t xml:space="preserve"> </w:t>
+      </w:r>
+      <w:r>
+        <w:t xml:space="preserve">not</w:t>
+      </w:r>
+      <w:r>
+        <w:t xml:space="preserve"> </w:t>
+      </w:r>
+      <w:r>
+        <w:t xml:space="preserve">“Mitchell’s definition”</w:t>
+      </w:r>
+      <w:r>
+        <w:t xml:space="preserve">.</w:t>
+      </w:r>
+      <w:r>
+        <w:t xml:space="preserve"> </w:t>
+      </w:r>
+      <w:r>
+        <w:t xml:space="preserve">Follow a quotation with its citation alone,</w:t>
+      </w:r>
+      <w:r>
+        <w:t xml:space="preserve"> </w:t>
+      </w:r>
+      <w:r>
+        <w:t xml:space="preserve">without commentary on who said it or where it was repeated.</w:t>
+      </w:r>
+    </w:p>
     <w:bookmarkEnd w:id="47"/>
-    <w:bookmarkStart w:id="48" w:name="put-the-content-first"/>
+    <w:bookmarkStart w:id="48" w:name="adapting-another-courses-material"/>
     <w:p>
       <w:pPr>
         <w:pStyle w:val="Heading2"/>
       </w:pPr>
       <w:r>
-        <w:t xml:space="preserve">15 Put the content first</w:t>
+        <w:t xml:space="preserve">16 Adapting another course’s material</w:t>
       </w:r>
     </w:p>
     <w:p>
@@ -3846,13 +3976,78 @@
         <w:pStyle w:val="FirstParagraph"/>
       </w:pPr>
       <w:r>
-        <w:t xml:space="preserve">Headings and sentences should name the topic, not its author:</w:t>
-      </w:r>
-      <w:r>
-        <w:t xml:space="preserve"> </w:t>
-      </w:r>
-      <w:r>
-        <w:t xml:space="preserve">“A formal definition of machine learning”</w:t>
+        <w:t xml:space="preserve">When teaching material draws on another course,</w:t>
+      </w:r>
+      <w:r>
+        <w:t xml:space="preserve"> </w:t>
+      </w:r>
+      <w:r>
+        <w:t xml:space="preserve">write your own version of the content</w:t>
+      </w:r>
+      <w:r>
+        <w:t xml:space="preserve"> </w:t>
+      </w:r>
+      <w:r>
+        <w:t xml:space="preserve">rather than summarizing how that course presents it.</w:t>
+      </w:r>
+      <w:r>
+        <w:t xml:space="preserve"> </w:t>
+      </w:r>
+      <w:r>
+        <w:t xml:space="preserve">Credit the source in a note at the start or end of the adapted section.</w:t>
+      </w:r>
+    </w:p>
+    <w:p>
+      <w:pPr>
+        <w:pStyle w:val="BodyText"/>
+      </w:pPr>
+      <w:r>
+        <w:t xml:space="preserve">Put that note in a div, never in running prose.</w:t>
+      </w:r>
+      <w:r>
+        <w:t xml:space="preserve"> </w:t>
+      </w:r>
+      <w:r>
+        <w:t xml:space="preserve">An attribution is not part of the argument,</w:t>
+      </w:r>
+      <w:r>
+        <w:t xml:space="preserve"> </w:t>
+      </w:r>
+      <w:r>
+        <w:t xml:space="preserve">and a reader skimming the section should be able to tell it apart</w:t>
+      </w:r>
+      <w:r>
+        <w:t xml:space="preserve"> </w:t>
+      </w:r>
+      <w:r>
+        <w:t xml:space="preserve">from the content it credits.</w:t>
+      </w:r>
+      <w:r>
+        <w:t xml:space="preserve"> </w:t>
+      </w:r>
+      <w:r>
+        <w:t xml:space="preserve">In Quarto, use a collapsed</w:t>
+      </w:r>
+      <w:r>
+        <w:t xml:space="preserve"> </w:t>
+      </w:r>
+      <w:r>
+        <w:rPr>
+          <w:rStyle w:val="VerbatimChar"/>
+        </w:rPr>
+        <w:t xml:space="preserve">.callout-note</w:t>
+      </w:r>
+      <w:r>
+        <w:t xml:space="preserve"> </w:t>
+      </w:r>
+      <w:r>
+        <w:t xml:space="preserve">titled</w:t>
+      </w:r>
+      <w:r>
+        <w:t xml:space="preserve"> </w:t>
+      </w:r>
+      <w:r>
+        <w:t xml:space="preserve">“Source”</w:t>
       </w:r>
       <w:r>
         <w:t xml:space="preserve">,</w:t>
@@ -3861,278 +4056,159 @@
         <w:t xml:space="preserve"> </w:t>
       </w:r>
       <w:r>
-        <w:t xml:space="preserve">not</w:t>
-      </w:r>
-      <w:r>
-        <w:t xml:space="preserve"> </w:t>
-      </w:r>
-      <w:r>
-        <w:t xml:space="preserve">“Mitchell’s definition”</w:t>
-      </w:r>
-      <w:r>
-        <w:t xml:space="preserve">.</w:t>
-      </w:r>
-      <w:r>
-        <w:t xml:space="preserve"> </w:t>
-      </w:r>
-      <w:r>
-        <w:t xml:space="preserve">Follow a quotation with its citation alone,</w:t>
-      </w:r>
-      <w:r>
-        <w:t xml:space="preserve"> </w:t>
-      </w:r>
-      <w:r>
-        <w:t xml:space="preserve">without commentary on who said it or where it was repeated.</w:t>
+        <w:t xml:space="preserve">which frames the credit and keeps it out of the way on the page.</w:t>
+      </w:r>
+      <w:r>
+        <w:t xml:space="preserve"> </w:t>
+      </w:r>
+      <w:r>
+        <w:t xml:space="preserve">A</w:t>
+      </w:r>
+      <w:r>
+        <w:t xml:space="preserve"> </w:t>
+      </w:r>
+      <w:r>
+        <w:rPr>
+          <w:rStyle w:val="VerbatimChar"/>
+        </w:rPr>
+        <w:t xml:space="preserve">::: notes</w:t>
+      </w:r>
+      <w:r>
+        <w:t xml:space="preserve"> </w:t>
+      </w:r>
+      <w:r>
+        <w:t xml:space="preserve">div keeps the credit out of the slides,</w:t>
+      </w:r>
+      <w:r>
+        <w:t xml:space="preserve"> </w:t>
+      </w:r>
+      <w:r>
+        <w:t xml:space="preserve">but on an HTML page it renders as a plain unstyled</w:t>
+      </w:r>
+      <w:r>
+        <w:t xml:space="preserve"> </w:t>
+      </w:r>
+      <w:r>
+        <w:rPr>
+          <w:rStyle w:val="VerbatimChar"/>
+        </w:rPr>
+        <w:t xml:space="preserve">&lt;div&gt;</w:t>
+      </w:r>
+      <w:r>
+        <w:t xml:space="preserve">,</w:t>
+      </w:r>
+      <w:r>
+        <w:t xml:space="preserve"> </w:t>
+      </w:r>
+      <w:r>
+        <w:t xml:space="preserve">which looks like running prose;</w:t>
+      </w:r>
+      <w:r>
+        <w:t xml:space="preserve"> </w:t>
+      </w:r>
+      <w:r>
+        <w:t xml:space="preserve">use it only on a site whose stylesheet sets</w:t>
+      </w:r>
+      <w:r>
+        <w:t xml:space="preserve"> </w:t>
+      </w:r>
+      <w:r>
+        <w:rPr>
+          <w:rStyle w:val="VerbatimChar"/>
+        </w:rPr>
+        <w:t xml:space="preserve">.notes</w:t>
+      </w:r>
+      <w:r>
+        <w:t xml:space="preserve"> </w:t>
+      </w:r>
+      <w:r>
+        <w:t xml:space="preserve">apart.</w:t>
+      </w:r>
+    </w:p>
+    <w:p>
+      <w:pPr>
+        <w:pStyle w:val="BodyText"/>
+      </w:pPr>
+      <w:r>
+        <w:t xml:space="preserve">The same applies to license notices</w:t>
+      </w:r>
+      <w:r>
+        <w:t xml:space="preserve"> </w:t>
+      </w:r>
+      <w:r>
+        <w:t xml:space="preserve">and to statements of how the adaptation differs from the source.</w:t>
+      </w:r>
+    </w:p>
+    <w:p>
+      <w:pPr>
+        <w:pStyle w:val="BodyText"/>
+      </w:pPr>
+      <w:r>
+        <w:t xml:space="preserve">❌ A plain paragraph between the heading and the first definition:</w:t>
+      </w:r>
+    </w:p>
+    <w:p>
+      <w:pPr>
+        <w:pStyle w:val="SourceCode"/>
+      </w:pPr>
+      <w:r>
+        <w:rPr>
+          <w:rStyle w:val="NormalTok"/>
+        </w:rPr>
+        <w:t xml:space="preserve">This section is adapted from @zhou2024, used under the MIT License.</w:t>
+      </w:r>
+    </w:p>
+    <w:p>
+      <w:pPr>
+        <w:pStyle w:val="FirstParagraph"/>
+      </w:pPr>
+      <w:r>
+        <w:t xml:space="preserve">✅ The same credit in a collapsed callout:</w:t>
+      </w:r>
+    </w:p>
+    <w:p>
+      <w:pPr>
+        <w:pStyle w:val="SourceCode"/>
+      </w:pPr>
+      <w:r>
+        <w:rPr>
+          <w:rStyle w:val="NormalTok"/>
+        </w:rPr>
+        <w:t xml:space="preserve">::: {.callout-note collapse="true"}</w:t>
+      </w:r>
+      <w:r>
+        <w:br/>
+      </w:r>
+      <w:r>
+        <w:rPr>
+          <w:rStyle w:val="FunctionTok"/>
+        </w:rPr>
+        <w:t xml:space="preserve">#### Source</w:t>
+      </w:r>
+      <w:r>
+        <w:br/>
+      </w:r>
+      <w:r>
+        <w:br/>
+      </w:r>
+      <w:r>
+        <w:rPr>
+          <w:rStyle w:val="NormalTok"/>
+        </w:rPr>
+        <w:t xml:space="preserve">This section is adapted from @zhou2024, used under the MIT License.</w:t>
+      </w:r>
+      <w:r>
+        <w:br/>
+      </w:r>
+      <w:r>
+        <w:rPr>
+          <w:rStyle w:val="NormalTok"/>
+        </w:rPr>
+        <w:t xml:space="preserve">:::</w:t>
       </w:r>
     </w:p>
     <w:bookmarkEnd w:id="48"/>
-    <w:bookmarkStart w:id="49" w:name="adapting-another-courses-material"/>
-    <w:p>
-      <w:pPr>
-        <w:pStyle w:val="Heading2"/>
-      </w:pPr>
-      <w:r>
-        <w:t xml:space="preserve">16 Adapting another course’s material</w:t>
-      </w:r>
-    </w:p>
-    <w:p>
-      <w:pPr>
-        <w:pStyle w:val="FirstParagraph"/>
-      </w:pPr>
-      <w:r>
-        <w:t xml:space="preserve">When teaching material draws on another course,</w:t>
-      </w:r>
-      <w:r>
-        <w:t xml:space="preserve"> </w:t>
-      </w:r>
-      <w:r>
-        <w:t xml:space="preserve">write your own version of the content</w:t>
-      </w:r>
-      <w:r>
-        <w:t xml:space="preserve"> </w:t>
-      </w:r>
-      <w:r>
-        <w:t xml:space="preserve">rather than summarizing how that course presents it.</w:t>
-      </w:r>
-      <w:r>
-        <w:t xml:space="preserve"> </w:t>
-      </w:r>
-      <w:r>
-        <w:t xml:space="preserve">Credit the source in a note at the start or end of the adapted section.</w:t>
-      </w:r>
-    </w:p>
-    <w:p>
-      <w:pPr>
-        <w:pStyle w:val="BodyText"/>
-      </w:pPr>
-      <w:r>
-        <w:t xml:space="preserve">Put that note in a div, never in running prose.</w:t>
-      </w:r>
-      <w:r>
-        <w:t xml:space="preserve"> </w:t>
-      </w:r>
-      <w:r>
-        <w:t xml:space="preserve">An attribution is not part of the argument,</w:t>
-      </w:r>
-      <w:r>
-        <w:t xml:space="preserve"> </w:t>
-      </w:r>
-      <w:r>
-        <w:t xml:space="preserve">and a reader skimming the section should be able to tell it apart</w:t>
-      </w:r>
-      <w:r>
-        <w:t xml:space="preserve"> </w:t>
-      </w:r>
-      <w:r>
-        <w:t xml:space="preserve">from the content it credits.</w:t>
-      </w:r>
-      <w:r>
-        <w:t xml:space="preserve"> </w:t>
-      </w:r>
-      <w:r>
-        <w:t xml:space="preserve">In Quarto, use a collapsed</w:t>
-      </w:r>
-      <w:r>
-        <w:t xml:space="preserve"> </w:t>
-      </w:r>
-      <w:r>
-        <w:rPr>
-          <w:rStyle w:val="VerbatimChar"/>
-        </w:rPr>
-        <w:t xml:space="preserve">.callout-note</w:t>
-      </w:r>
-      <w:r>
-        <w:t xml:space="preserve"> </w:t>
-      </w:r>
-      <w:r>
-        <w:t xml:space="preserve">titled</w:t>
-      </w:r>
-      <w:r>
-        <w:t xml:space="preserve"> </w:t>
-      </w:r>
-      <w:r>
-        <w:t xml:space="preserve">“Source”</w:t>
-      </w:r>
-      <w:r>
-        <w:t xml:space="preserve">,</w:t>
-      </w:r>
-      <w:r>
-        <w:t xml:space="preserve"> </w:t>
-      </w:r>
-      <w:r>
-        <w:t xml:space="preserve">which frames the credit and keeps it out of the way on the page.</w:t>
-      </w:r>
-      <w:r>
-        <w:t xml:space="preserve"> </w:t>
-      </w:r>
-      <w:r>
-        <w:t xml:space="preserve">A</w:t>
-      </w:r>
-      <w:r>
-        <w:t xml:space="preserve"> </w:t>
-      </w:r>
-      <w:r>
-        <w:rPr>
-          <w:rStyle w:val="VerbatimChar"/>
-        </w:rPr>
-        <w:t xml:space="preserve">::: notes</w:t>
-      </w:r>
-      <w:r>
-        <w:t xml:space="preserve"> </w:t>
-      </w:r>
-      <w:r>
-        <w:t xml:space="preserve">div keeps the credit out of the slides,</w:t>
-      </w:r>
-      <w:r>
-        <w:t xml:space="preserve"> </w:t>
-      </w:r>
-      <w:r>
-        <w:t xml:space="preserve">but on an HTML page it renders as a plain unstyled</w:t>
-      </w:r>
-      <w:r>
-        <w:t xml:space="preserve"> </w:t>
-      </w:r>
-      <w:r>
-        <w:rPr>
-          <w:rStyle w:val="VerbatimChar"/>
-        </w:rPr>
-        <w:t xml:space="preserve">&lt;div&gt;</w:t>
-      </w:r>
-      <w:r>
-        <w:t xml:space="preserve">,</w:t>
-      </w:r>
-      <w:r>
-        <w:t xml:space="preserve"> </w:t>
-      </w:r>
-      <w:r>
-        <w:t xml:space="preserve">which looks like running prose;</w:t>
-      </w:r>
-      <w:r>
-        <w:t xml:space="preserve"> </w:t>
-      </w:r>
-      <w:r>
-        <w:t xml:space="preserve">use it only on a site whose stylesheet sets</w:t>
-      </w:r>
-      <w:r>
-        <w:t xml:space="preserve"> </w:t>
-      </w:r>
-      <w:r>
-        <w:rPr>
-          <w:rStyle w:val="VerbatimChar"/>
-        </w:rPr>
-        <w:t xml:space="preserve">.notes</w:t>
-      </w:r>
-      <w:r>
-        <w:t xml:space="preserve"> </w:t>
-      </w:r>
-      <w:r>
-        <w:t xml:space="preserve">apart.</w:t>
-      </w:r>
-    </w:p>
-    <w:p>
-      <w:pPr>
-        <w:pStyle w:val="BodyText"/>
-      </w:pPr>
-      <w:r>
-        <w:t xml:space="preserve">The same applies to license notices</w:t>
-      </w:r>
-      <w:r>
-        <w:t xml:space="preserve"> </w:t>
-      </w:r>
-      <w:r>
-        <w:t xml:space="preserve">and to statements of how the adaptation differs from the source.</w:t>
-      </w:r>
-    </w:p>
-    <w:p>
-      <w:pPr>
-        <w:pStyle w:val="BodyText"/>
-      </w:pPr>
-      <w:r>
-        <w:t xml:space="preserve">❌ A plain paragraph between the heading and the first definition:</w:t>
-      </w:r>
-    </w:p>
-    <w:p>
-      <w:pPr>
-        <w:pStyle w:val="SourceCode"/>
-      </w:pPr>
-      <w:r>
-        <w:rPr>
-          <w:rStyle w:val="NormalTok"/>
-        </w:rPr>
-        <w:t xml:space="preserve">This section is adapted from @zhou2024, used under the MIT License.</w:t>
-      </w:r>
-    </w:p>
-    <w:p>
-      <w:pPr>
-        <w:pStyle w:val="FirstParagraph"/>
-      </w:pPr>
-      <w:r>
-        <w:t xml:space="preserve">✅ The same credit in a collapsed callout:</w:t>
-      </w:r>
-    </w:p>
-    <w:p>
-      <w:pPr>
-        <w:pStyle w:val="SourceCode"/>
-      </w:pPr>
-      <w:r>
-        <w:rPr>
-          <w:rStyle w:val="NormalTok"/>
-        </w:rPr>
-        <w:t xml:space="preserve">::: {.callout-note collapse="true"}</w:t>
-      </w:r>
-      <w:r>
-        <w:br/>
-      </w:r>
-      <w:r>
-        <w:rPr>
-          <w:rStyle w:val="FunctionTok"/>
-        </w:rPr>
-        <w:t xml:space="preserve">#### Source</w:t>
-      </w:r>
-      <w:r>
-        <w:br/>
-      </w:r>
-      <w:r>
-        <w:br/>
-      </w:r>
-      <w:r>
-        <w:rPr>
-          <w:rStyle w:val="NormalTok"/>
-        </w:rPr>
-        <w:t xml:space="preserve">This section is adapted from @zhou2024, used under the MIT License.</w:t>
-      </w:r>
-      <w:r>
-        <w:br/>
-      </w:r>
-      <w:r>
-        <w:rPr>
-          <w:rStyle w:val="NormalTok"/>
-        </w:rPr>
-        <w:t xml:space="preserve">:::</w:t>
-      </w:r>
-    </w:p>
-    <w:bookmarkEnd w:id="49"/>
-    <w:bookmarkStart w:id="50" w:name="material-from-your-own-work"/>
+    <w:bookmarkStart w:id="49" w:name="material-from-your-own-work"/>
     <w:p>
       <w:pPr>
         <w:pStyle w:val="Heading2"/>
@@ -4574,8 +4650,8 @@
         <w:t xml:space="preserve">When you find an existing credit to your own work, remove it and add or keep a link to it.</w:t>
       </w:r>
     </w:p>
-    <w:bookmarkEnd w:id="50"/>
-    <w:bookmarkStart w:id="51" w:name="common-citation-errors-to-avoid"/>
+    <w:bookmarkEnd w:id="49"/>
+    <w:bookmarkStart w:id="50" w:name="common-citation-errors-to-avoid"/>
     <w:p>
       <w:pPr>
         <w:pStyle w:val="Heading2"/>
@@ -4759,8 +4835,8 @@
         <w:t xml:space="preserve">: Failing to cite work that directly influenced your ideas</w:t>
       </w:r>
     </w:p>
-    <w:bookmarkEnd w:id="51"/>
-    <w:bookmarkStart w:id="57" w:name="examples"/>
+    <w:bookmarkEnd w:id="50"/>
+    <w:bookmarkStart w:id="56" w:name="examples"/>
     <w:p>
       <w:pPr>
         <w:pStyle w:val="Heading2"/>
@@ -4769,7 +4845,7 @@
         <w:t xml:space="preserve">19 Examples</w:t>
       </w:r>
     </w:p>
-    <w:bookmarkStart w:id="52" w:name="poor-unsupported-claim"/>
+    <w:bookmarkStart w:id="51" w:name="poor-unsupported-claim"/>
     <w:p>
       <w:pPr>
         <w:pStyle w:val="Heading3"/>
@@ -4801,8 +4877,8 @@
         <w:t xml:space="preserve">: This claim is stated as fact without any support.</w:t>
       </w:r>
     </w:p>
-    <w:bookmarkEnd w:id="52"/>
-    <w:bookmarkStart w:id="53" w:name="better-citation-provided"/>
+    <w:bookmarkEnd w:id="51"/>
+    <w:bookmarkStart w:id="52" w:name="better-citation-provided"/>
     <w:p>
       <w:pPr>
         <w:pStyle w:val="Heading3"/>
@@ -4843,8 +4919,8 @@
         <w:t xml:space="preserve">: Citations provide evidence for the claim.</w:t>
       </w:r>
     </w:p>
-    <w:bookmarkEnd w:id="53"/>
-    <w:bookmarkStart w:id="54" w:name="best-citation-with-context"/>
+    <w:bookmarkEnd w:id="52"/>
+    <w:bookmarkStart w:id="53" w:name="best-citation-with-context"/>
     <w:p>
       <w:pPr>
         <w:pStyle w:val="Heading3"/>
@@ -4897,8 +4973,8 @@
         <w:t xml:space="preserve">: The specific support each citation provides is explained.</w:t>
       </w:r>
     </w:p>
-    <w:bookmarkEnd w:id="54"/>
-    <w:bookmarkStart w:id="55" w:name="poor-irrelevant-citation"/>
+    <w:bookmarkEnd w:id="53"/>
+    <w:bookmarkStart w:id="54" w:name="poor-irrelevant-citation"/>
     <w:p>
       <w:pPr>
         <w:pStyle w:val="Heading3"/>
@@ -4939,8 +5015,8 @@
         <w:t xml:space="preserve">: Knuth’s 1984 paper on literate programming doesn’t address Python or data science.</w:t>
       </w:r>
     </w:p>
-    <w:bookmarkEnd w:id="55"/>
-    <w:bookmarkStart w:id="56" w:name="better-relevant-citation"/>
+    <w:bookmarkEnd w:id="54"/>
+    <w:bookmarkStart w:id="55" w:name="better-relevant-citation"/>
     <w:p>
       <w:pPr>
         <w:pStyle w:val="Heading3"/>
@@ -4981,9 +5057,9 @@
         <w:t xml:space="preserve">: The citation is to a current survey of programming language usage.</w:t>
       </w:r>
     </w:p>
+    <w:bookmarkEnd w:id="55"/>
     <w:bookmarkEnd w:id="56"/>
-    <w:bookmarkEnd w:id="57"/>
-    <w:bookmarkStart w:id="74" w:name="conclusion"/>
+    <w:bookmarkStart w:id="75" w:name="conclusion"/>
     <w:p>
       <w:pPr>
         <w:pStyle w:val="Heading2"/>
@@ -5042,8 +5118,8 @@
         <w:t xml:space="preserve">add a citation or present direct evidence.</w:t>
       </w:r>
     </w:p>
-    <w:bookmarkStart w:id="73" w:name="refs"/>
-    <w:bookmarkStart w:id="59" w:name="ref-bienayme1853"/>
+    <w:bookmarkStart w:id="74" w:name="refs"/>
+    <w:bookmarkStart w:id="58" w:name="ref-bienayme1853"/>
     <w:p>
       <w:pPr>
         <w:pStyle w:val="Bibliography"/>
@@ -5088,7 +5164,7 @@
       <w:r>
         <w:t xml:space="preserve"> </w:t>
       </w:r>
-      <w:hyperlink r:id="rId58">
+      <w:hyperlink r:id="rId57">
         <w:r>
           <w:rPr>
             <w:rStyle w:val="Hyperlink"/>
@@ -5100,8 +5176,8 @@
         <w:t xml:space="preserve">.</w:t>
       </w:r>
     </w:p>
-    <w:bookmarkEnd w:id="59"/>
-    <w:bookmarkStart w:id="61" w:name="ref-blitzstein2019introduction"/>
+    <w:bookmarkEnd w:id="58"/>
+    <w:bookmarkStart w:id="60" w:name="ref-blitzstein2019introduction"/>
     <w:p>
       <w:pPr>
         <w:pStyle w:val="Bibliography"/>
@@ -5125,7 +5201,7 @@
       <w:r>
         <w:t xml:space="preserve"> </w:t>
       </w:r>
-      <w:hyperlink r:id="rId60">
+      <w:hyperlink r:id="rId59">
         <w:r>
           <w:rPr>
             <w:rStyle w:val="Hyperlink"/>
@@ -5137,8 +5213,8 @@
         <w:t xml:space="preserve">.</w:t>
       </w:r>
     </w:p>
-    <w:bookmarkEnd w:id="61"/>
-    <w:bookmarkStart w:id="63" w:name="ref-hawkins2004"/>
+    <w:bookmarkEnd w:id="60"/>
+    <w:bookmarkStart w:id="62" w:name="ref-hawkins2004"/>
     <w:p>
       <w:pPr>
         <w:pStyle w:val="Bibliography"/>
@@ -5171,7 +5247,7 @@
       <w:r>
         <w:t xml:space="preserve"> </w:t>
       </w:r>
-      <w:hyperlink r:id="rId62">
+      <w:hyperlink r:id="rId61">
         <w:r>
           <w:rPr>
             <w:rStyle w:val="Hyperlink"/>
@@ -5183,8 +5259,8 @@
         <w:t xml:space="preserve">.</w:t>
       </w:r>
     </w:p>
-    <w:bookmarkEnd w:id="63"/>
-    <w:bookmarkStart w:id="65" w:name="ref-knuth84"/>
+    <w:bookmarkEnd w:id="62"/>
+    <w:bookmarkStart w:id="64" w:name="ref-knuth84"/>
     <w:p>
       <w:pPr>
         <w:pStyle w:val="Bibliography"/>
@@ -5217,7 +5293,7 @@
       <w:r>
         <w:t xml:space="preserve"> </w:t>
       </w:r>
-      <w:hyperlink r:id="rId64">
+      <w:hyperlink r:id="rId63">
         <w:r>
           <w:rPr>
             <w:rStyle w:val="Hyperlink"/>
@@ -5229,8 +5305,8 @@
         <w:t xml:space="preserve">.</w:t>
       </w:r>
     </w:p>
-    <w:bookmarkEnd w:id="65"/>
-    <w:bookmarkStart w:id="66" w:name="ref-mitchell1997"/>
+    <w:bookmarkEnd w:id="64"/>
+    <w:bookmarkStart w:id="65" w:name="ref-mitchell1997"/>
     <w:p>
       <w:pPr>
         <w:pStyle w:val="Bibliography"/>
@@ -5252,8 +5328,8 @@
         <w:t xml:space="preserve">. McGraw-Hill.</w:t>
       </w:r>
     </w:p>
-    <w:bookmarkEnd w:id="66"/>
-    <w:bookmarkStart w:id="68" w:name="ref-stackoverflow2024"/>
+    <w:bookmarkEnd w:id="65"/>
+    <w:bookmarkStart w:id="67" w:name="ref-stackoverflow2024"/>
     <w:p>
       <w:pPr>
         <w:pStyle w:val="Bibliography"/>
@@ -5277,7 +5353,7 @@
       <w:r>
         <w:t xml:space="preserve"> </w:t>
       </w:r>
-      <w:hyperlink r:id="rId67">
+      <w:hyperlink r:id="rId66">
         <w:r>
           <w:rPr>
             <w:rStyle w:val="Hyperlink"/>
@@ -5289,8 +5365,8 @@
         <w:t xml:space="preserve">.</w:t>
       </w:r>
     </w:p>
-    <w:bookmarkEnd w:id="68"/>
-    <w:bookmarkStart w:id="70" w:name="ref-tchebichef1867"/>
+    <w:bookmarkEnd w:id="67"/>
+    <w:bookmarkStart w:id="69" w:name="ref-tchebichef1867"/>
     <w:p>
       <w:pPr>
         <w:pStyle w:val="Bibliography"/>
@@ -5320,7 +5396,7 @@
       <w:r>
         <w:t xml:space="preserve"> </w:t>
       </w:r>
-      <w:hyperlink r:id="rId69">
+      <w:hyperlink r:id="rId68">
         <w:r>
           <w:rPr>
             <w:rStyle w:val="Hyperlink"/>
@@ -5332,8 +5408,8 @@
         <w:t xml:space="preserve">.</w:t>
       </w:r>
     </w:p>
-    <w:bookmarkEnd w:id="70"/>
-    <w:bookmarkStart w:id="72" w:name="ref-vapnik1998"/>
+    <w:bookmarkEnd w:id="69"/>
+    <w:bookmarkStart w:id="71" w:name="ref-vapnik1998"/>
     <w:p>
       <w:pPr>
         <w:pStyle w:val="Bibliography"/>
@@ -5357,7 +5433,7 @@
       <w:r>
         <w:t xml:space="preserve"> </w:t>
       </w:r>
-      <w:hyperlink r:id="rId71">
+      <w:hyperlink r:id="rId70">
         <w:r>
           <w:rPr>
             <w:rStyle w:val="Hyperlink"/>
@@ -5369,9 +5445,81 @@
         <w:t xml:space="preserve">.</w:t>
       </w:r>
     </w:p>
-    <w:bookmarkEnd w:id="72"/>
+    <w:bookmarkEnd w:id="71"/>
+    <w:bookmarkStart w:id="73" w:name="ref-wikipedia_poisson_distribution"/>
+    <w:p>
+      <w:pPr>
+        <w:pStyle w:val="Bibliography"/>
+      </w:pPr>
+      <w:r>
+        <w:t xml:space="preserve">Wikipedia contributors. 2026.</w:t>
+      </w:r>
+      <w:r>
+        <w:t xml:space="preserve"> </w:t>
+      </w:r>
+      <w:r>
+        <w:rPr>
+          <w:i/>
+          <w:iCs/>
+        </w:rPr>
+        <w:t xml:space="preserve">Poisson Distribution —</w:t>
+      </w:r>
+      <w:r>
+        <w:rPr>
+          <w:i/>
+          <w:iCs/>
+        </w:rPr>
+        <w:t xml:space="preserve"> </w:t>
+      </w:r>
+      <w:r>
+        <w:rPr>
+          <w:i/>
+          <w:iCs/>
+        </w:rPr>
+        <w:t xml:space="preserve">Wikipedia</w:t>
+      </w:r>
+      <w:r>
+        <w:rPr>
+          <w:i/>
+          <w:iCs/>
+        </w:rPr>
+        <w:t xml:space="preserve">,</w:t>
+      </w:r>
+      <w:r>
+        <w:rPr>
+          <w:i/>
+          <w:iCs/>
+        </w:rPr>
+        <w:t xml:space="preserve"> </w:t>
+      </w:r>
+      <w:r>
+        <w:rPr>
+          <w:i/>
+          <w:iCs/>
+        </w:rPr>
+        <w:t xml:space="preserve">the Free Encyclopedia</w:t>
+      </w:r>
+      <w:r>
+        <w:t xml:space="preserve">.</w:t>
+      </w:r>
+      <w:r>
+        <w:t xml:space="preserve"> </w:t>
+      </w:r>
+      <w:hyperlink r:id="rId72">
+        <w:r>
+          <w:rPr>
+            <w:rStyle w:val="Hyperlink"/>
+          </w:rPr>
+          <w:t xml:space="preserve">https://en.wikipedia.org/wiki/Poisson_distribution</w:t>
+        </w:r>
+      </w:hyperlink>
+      <w:r>
+        <w:t xml:space="preserve">.</w:t>
+      </w:r>
+    </w:p>
     <w:bookmarkEnd w:id="73"/>
     <w:bookmarkEnd w:id="74"/>
+    <w:bookmarkEnd w:id="75"/>
     <w:sectPr>
       <w:footnotePr>
         <w:numRestart w:val="eachSect"/>

</xml_diff>

<commit_message>
Deploying to gh-pages from @ Morrison-Lab/psw@5c6e64a93b7393330b003c55d0d8bca1041426b1 🚀
</commit_message>
<xml_diff>
--- a/chapters/citations-evidence.docx
+++ b/chapters/citations-evidence.docx
@@ -15,7 +15,7 @@
         <w:pStyle w:val="Date"/>
       </w:pPr>
       <w:r>
-        <w:t xml:space="preserve">Last modified: 2026-10-17 16:26:16 (PDT)</w:t>
+        <w:t xml:space="preserve">Last modified: 2026-10-18 11:25:03 (PDT)</w:t>
       </w:r>
     </w:p>
     <w:p>
@@ -3051,13 +3051,186 @@
     </w:p>
     <w:bookmarkEnd w:id="35"/>
     <w:bookmarkEnd w:id="36"/>
-    <w:bookmarkStart w:id="37" w:name="best-practices"/>
+    <w:bookmarkStart w:id="38" w:name="number-bracketed-citations"/>
     <w:p>
       <w:pPr>
         <w:pStyle w:val="Heading2"/>
       </w:pPr>
       <w:r>
-        <w:t xml:space="preserve">9 Best practices</w:t>
+        <w:t xml:space="preserve">9 Number bracketed citations</w:t>
+      </w:r>
+    </w:p>
+    <w:p>
+      <w:pPr>
+        <w:pStyle w:val="FirstParagraph"/>
+      </w:pPr>
+      <w:r>
+        <w:t xml:space="preserve">On the lab’s notes sites, a bracketed citation,</w:t>
+      </w:r>
+      <w:r>
+        <w:t xml:space="preserve"> </w:t>
+      </w:r>
+      <w:r>
+        <w:rPr>
+          <w:rStyle w:val="VerbatimChar"/>
+        </w:rPr>
+        <w:t xml:space="preserve">[@key]</w:t>
+      </w:r>
+      <w:r>
+        <w:t xml:space="preserve">, prints as a number, such as [1] or [1, p. 5].</w:t>
+      </w:r>
+      <w:r>
+        <w:t xml:space="preserve"> </w:t>
+      </w:r>
+      <w:r>
+        <w:t xml:space="preserve">An in-text citation,</w:t>
+      </w:r>
+      <w:r>
+        <w:t xml:space="preserve"> </w:t>
+      </w:r>
+      <w:r>
+        <w:rPr>
+          <w:rStyle w:val="VerbatimChar"/>
+        </w:rPr>
+        <w:t xml:space="preserve">@key</w:t>
+      </w:r>
+      <w:r>
+        <w:t xml:space="preserve">, prints the author name and the number, such as</w:t>
+      </w:r>
+      <w:r>
+        <w:t xml:space="preserve"> </w:t>
+      </w:r>
+      <w:r>
+        <w:t xml:space="preserve">“Hastie et al. [2]”</w:t>
+      </w:r>
+      <w:r>
+        <w:t xml:space="preserve">.</w:t>
+      </w:r>
+      <w:r>
+        <w:t xml:space="preserve"> </w:t>
+      </w:r>
+      <w:r>
+        <w:t xml:space="preserve">Write</w:t>
+      </w:r>
+      <w:r>
+        <w:t xml:space="preserve"> </w:t>
+      </w:r>
+      <w:r>
+        <w:rPr>
+          <w:rStyle w:val="VerbatimChar"/>
+        </w:rPr>
+        <w:t xml:space="preserve">[@key]</w:t>
+      </w:r>
+      <w:r>
+        <w:t xml:space="preserve"> </w:t>
+      </w:r>
+      <w:r>
+        <w:t xml:space="preserve">when the source supports a claim,</w:t>
+      </w:r>
+      <w:r>
+        <w:t xml:space="preserve"> </w:t>
+      </w:r>
+      <w:r>
+        <w:t xml:space="preserve">and</w:t>
+      </w:r>
+      <w:r>
+        <w:t xml:space="preserve"> </w:t>
+      </w:r>
+      <w:r>
+        <w:rPr>
+          <w:rStyle w:val="VerbatimChar"/>
+        </w:rPr>
+        <w:t xml:space="preserve">@key</w:t>
+      </w:r>
+      <w:r>
+        <w:t xml:space="preserve"> </w:t>
+      </w:r>
+      <w:r>
+        <w:t xml:space="preserve">when the author is the subject of the sentence.</w:t>
+      </w:r>
+      <w:r>
+        <w:t xml:space="preserve"> </w:t>
+      </w:r>
+      <w:r>
+        <w:t xml:space="preserve">Never start a sentence or a list item with a bare</w:t>
+      </w:r>
+      <w:r>
+        <w:t xml:space="preserve"> </w:t>
+      </w:r>
+      <w:r>
+        <w:rPr>
+          <w:rStyle w:val="VerbatimChar"/>
+        </w:rPr>
+        <w:t xml:space="preserve">@key</w:t>
+      </w:r>
+      <w:r>
+        <w:t xml:space="preserve"> </w:t>
+      </w:r>
+      <w:r>
+        <w:t xml:space="preserve">unless the author is its subject.</w:t>
+      </w:r>
+      <w:r>
+        <w:t xml:space="preserve"> </w:t>
+      </w:r>
+      <w:r>
+        <w:t xml:space="preserve">The author list becomes the subject, so a list of such items prints the same author name, such as</w:t>
+      </w:r>
+      <w:r>
+        <w:t xml:space="preserve"> </w:t>
+      </w:r>
+      <w:r>
+        <w:t xml:space="preserve">“Wikipedia contributors [3]”</w:t>
+      </w:r>
+      <w:r>
+        <w:t xml:space="preserve">, again and again.</w:t>
+      </w:r>
+      <w:r>
+        <w:t xml:space="preserve"> </w:t>
+      </w:r>
+      <w:r>
+        <w:t xml:space="preserve">Write the description first, and end the sentence with the bracketed</w:t>
+      </w:r>
+      <w:r>
+        <w:t xml:space="preserve"> </w:t>
+      </w:r>
+      <w:r>
+        <w:rPr>
+          <w:rStyle w:val="VerbatimChar"/>
+        </w:rPr>
+        <w:t xml:space="preserve">[@key]</w:t>
+      </w:r>
+      <w:r>
+        <w:t xml:space="preserve">.</w:t>
+      </w:r>
+      <w:r>
+        <w:t xml:space="preserve"> </w:t>
+      </w:r>
+      <w:r>
+        <w:t xml:space="preserve">The sites get this from the shared citation style and filter in</w:t>
+      </w:r>
+      <w:r>
+        <w:t xml:space="preserve"> </w:t>
+      </w:r>
+      <w:hyperlink r:id="rId37">
+        <w:r>
+          <w:rPr>
+            <w:rStyle w:val="Hyperlink"/>
+          </w:rPr>
+          <w:t xml:space="preserve">Morrison-Lab/macros</w:t>
+        </w:r>
+      </w:hyperlink>
+      <w:r>
+        <w:t xml:space="preserve">.</w:t>
+      </w:r>
+    </w:p>
+    <w:bookmarkEnd w:id="38"/>
+    <w:bookmarkStart w:id="39" w:name="best-practices"/>
+    <w:p>
+      <w:pPr>
+        <w:pStyle w:val="Heading2"/>
+      </w:pPr>
+      <w:r>
+        <w:t xml:space="preserve">10 Best practices</w:t>
       </w:r>
     </w:p>
     <w:p>
@@ -3228,14 +3401,14 @@
         <w:t xml:space="preserve">: When possible, include work from different research groups and perspectives</w:t>
       </w:r>
     </w:p>
-    <w:bookmarkEnd w:id="37"/>
-    <w:bookmarkStart w:id="38" w:name="quote-the-original"/>
+    <w:bookmarkEnd w:id="39"/>
+    <w:bookmarkStart w:id="40" w:name="quote-the-original"/>
     <w:p>
       <w:pPr>
         <w:pStyle w:val="Heading2"/>
       </w:pPr>
       <w:r>
-        <w:t xml:space="preserve">10 Quote the original</w:t>
+        <w:t xml:space="preserve">11 Quote the original</w:t>
       </w:r>
     </w:p>
     <w:p>
@@ -3312,14 +3485,14 @@
         <w:t xml:space="preserve">Uncertainty about who said a line is not evidence about who said it.</w:t>
       </w:r>
     </w:p>
-    <w:bookmarkEnd w:id="38"/>
-    <w:bookmarkStart w:id="39" w:name="Xdc6e961a4731f42c2c786ef03a498fc72396848"/>
+    <w:bookmarkEnd w:id="40"/>
+    <w:bookmarkStart w:id="41" w:name="Xdc6e961a4731f42c2c786ef03a498fc72396848"/>
     <w:p>
       <w:pPr>
         <w:pStyle w:val="Heading2"/>
       </w:pPr>
       <w:r>
-        <w:t xml:space="preserve">11 Copy organization names from their source</w:t>
+        <w:t xml:space="preserve">12 Copy organization names from their source</w:t>
       </w:r>
     </w:p>
     <w:p>
@@ -3342,14 +3515,14 @@
         <w:t xml:space="preserve">rather than expanding an acronym from memory.</w:t>
       </w:r>
     </w:p>
-    <w:bookmarkEnd w:id="39"/>
-    <w:bookmarkStart w:id="42" w:name="verify-each-bibliography-entry"/>
+    <w:bookmarkEnd w:id="41"/>
+    <w:bookmarkStart w:id="44" w:name="verify-each-bibliography-entry"/>
     <w:p>
       <w:pPr>
         <w:pStyle w:val="Heading2"/>
       </w:pPr>
       <w:r>
-        <w:t xml:space="preserve">12 Verify each bibliography entry</w:t>
+        <w:t xml:space="preserve">13 Verify each bibliography entry</w:t>
       </w:r>
     </w:p>
     <w:p>
@@ -3368,7 +3541,7 @@
       <w:r>
         <w:t xml:space="preserve"> </w:t>
       </w:r>
-      <w:hyperlink r:id="rId40">
+      <w:hyperlink r:id="rId42">
         <w:r>
           <w:rPr>
             <w:rStyle w:val="Hyperlink"/>
@@ -3385,7 +3558,7 @@
       <w:r>
         <w:t xml:space="preserve"> </w:t>
       </w:r>
-      <w:hyperlink r:id="rId41">
+      <w:hyperlink r:id="rId43">
         <w:r>
           <w:rPr>
             <w:rStyle w:val="Hyperlink"/>
@@ -3427,14 +3600,14 @@
         <w:t xml:space="preserve">and say in the pull request what you checked against what.</w:t>
       </w:r>
     </w:p>
-    <w:bookmarkEnd w:id="42"/>
-    <w:bookmarkStart w:id="43" w:name="cite-an-alias-directly"/>
+    <w:bookmarkEnd w:id="44"/>
+    <w:bookmarkStart w:id="45" w:name="cite-an-alias-directly"/>
     <w:p>
       <w:pPr>
         <w:pStyle w:val="Heading2"/>
       </w:pPr>
       <w:r>
-        <w:t xml:space="preserve">13 Cite an alias directly</w:t>
+        <w:t xml:space="preserve">14 Cite an alias directly</w:t>
       </w:r>
     </w:p>
     <w:p>
@@ -3524,14 +3697,14 @@
         <w:t xml:space="preserve">also called the **alias** [@key, section]</w:t>
       </w:r>
     </w:p>
-    <w:bookmarkEnd w:id="43"/>
-    <w:bookmarkStart w:id="46" w:name="cite-the-original-for-named-results"/>
+    <w:bookmarkEnd w:id="45"/>
+    <w:bookmarkStart w:id="48" w:name="cite-the-original-for-named-results"/>
     <w:p>
       <w:pPr>
         <w:pStyle w:val="Heading2"/>
       </w:pPr>
       <w:r>
-        <w:t xml:space="preserve">14 Cite the original for named results</w:t>
+        <w:t xml:space="preserve">15 Cite the original for named results</w:t>
       </w:r>
     </w:p>
     <w:p>
@@ -3806,7 +3979,7 @@
       <w:r>
         <w:t xml:space="preserve"> </w:t>
       </w:r>
-      <w:hyperlink r:id="rId44">
+      <w:hyperlink r:id="rId46">
         <w:r>
           <w:rPr>
             <w:rStyle w:val="Hyperlink"/>
@@ -3832,7 +4005,7 @@
         <w:t xml:space="preserve">and never fill in a title, volume, or page number from memory.</w:t>
       </w:r>
     </w:p>
-    <w:bookmarkStart w:id="45" w:name="exm-cite-original"/>
+    <w:bookmarkStart w:id="47" w:name="exm-cite-original"/>
     <w:p>
       <w:pPr>
         <w:pStyle w:val="BodyText"/>
@@ -3906,15 +4079,15 @@
         <w:t xml:space="preserve">.</w:t>
       </w:r>
     </w:p>
-    <w:bookmarkEnd w:id="45"/>
-    <w:bookmarkEnd w:id="46"/>
-    <w:bookmarkStart w:id="47" w:name="put-the-content-first"/>
+    <w:bookmarkEnd w:id="47"/>
+    <w:bookmarkEnd w:id="48"/>
+    <w:bookmarkStart w:id="49" w:name="put-the-content-first"/>
     <w:p>
       <w:pPr>
         <w:pStyle w:val="Heading2"/>
       </w:pPr>
       <w:r>
-        <w:t xml:space="preserve">15 Put the content first</w:t>
+        <w:t xml:space="preserve">16 Put the content first</w:t>
       </w:r>
     </w:p>
     <w:p>
@@ -3961,14 +4134,14 @@
         <w:t xml:space="preserve">without commentary on who said it or where it was repeated.</w:t>
       </w:r>
     </w:p>
-    <w:bookmarkEnd w:id="47"/>
-    <w:bookmarkStart w:id="48" w:name="adapting-another-courses-material"/>
+    <w:bookmarkEnd w:id="49"/>
+    <w:bookmarkStart w:id="50" w:name="adapting-another-courses-material"/>
     <w:p>
       <w:pPr>
         <w:pStyle w:val="Heading2"/>
       </w:pPr>
       <w:r>
-        <w:t xml:space="preserve">16 Adapting another course’s material</w:t>
+        <w:t xml:space="preserve">17 Adapting another course’s material</w:t>
       </w:r>
     </w:p>
     <w:p>
@@ -4207,14 +4380,14 @@
         <w:t xml:space="preserve">:::</w:t>
       </w:r>
     </w:p>
-    <w:bookmarkEnd w:id="48"/>
-    <w:bookmarkStart w:id="49" w:name="material-from-your-own-work"/>
+    <w:bookmarkEnd w:id="50"/>
+    <w:bookmarkStart w:id="51" w:name="material-from-your-own-work"/>
     <w:p>
       <w:pPr>
         <w:pStyle w:val="Heading2"/>
       </w:pPr>
       <w:r>
-        <w:t xml:space="preserve">17 Material from your own work</w:t>
+        <w:t xml:space="preserve">18 Material from your own work</w:t>
       </w:r>
     </w:p>
     <w:p>
@@ -4650,14 +4823,14 @@
         <w:t xml:space="preserve">When you find an existing credit to your own work, remove it and add or keep a link to it.</w:t>
       </w:r>
     </w:p>
-    <w:bookmarkEnd w:id="49"/>
-    <w:bookmarkStart w:id="50" w:name="common-citation-errors-to-avoid"/>
+    <w:bookmarkEnd w:id="51"/>
+    <w:bookmarkStart w:id="52" w:name="common-citation-errors-to-avoid"/>
     <w:p>
       <w:pPr>
         <w:pStyle w:val="Heading2"/>
       </w:pPr>
       <w:r>
-        <w:t xml:space="preserve">18 Common citation errors to avoid</w:t>
+        <w:t xml:space="preserve">19 Common citation errors to avoid</w:t>
       </w:r>
     </w:p>
     <w:p>
@@ -4835,23 +5008,23 @@
         <w:t xml:space="preserve">: Failing to cite work that directly influenced your ideas</w:t>
       </w:r>
     </w:p>
-    <w:bookmarkEnd w:id="50"/>
-    <w:bookmarkStart w:id="56" w:name="examples"/>
+    <w:bookmarkEnd w:id="52"/>
+    <w:bookmarkStart w:id="58" w:name="examples"/>
     <w:p>
       <w:pPr>
         <w:pStyle w:val="Heading2"/>
       </w:pPr>
       <w:r>
-        <w:t xml:space="preserve">19 Examples</w:t>
-      </w:r>
-    </w:p>
-    <w:bookmarkStart w:id="51" w:name="poor-unsupported-claim"/>
+        <w:t xml:space="preserve">20 Examples</w:t>
+      </w:r>
+    </w:p>
+    <w:bookmarkStart w:id="53" w:name="poor-unsupported-claim"/>
     <w:p>
       <w:pPr>
         <w:pStyle w:val="Heading3"/>
       </w:pPr>
       <w:r>
-        <w:t xml:space="preserve">19.1 Poor (unsupported claim)</w:t>
+        <w:t xml:space="preserve">20.1 Poor (unsupported claim)</w:t>
       </w:r>
     </w:p>
     <w:p>
@@ -4877,14 +5050,14 @@
         <w:t xml:space="preserve">: This claim is stated as fact without any support.</w:t>
       </w:r>
     </w:p>
-    <w:bookmarkEnd w:id="51"/>
-    <w:bookmarkStart w:id="52" w:name="better-citation-provided"/>
+    <w:bookmarkEnd w:id="53"/>
+    <w:bookmarkStart w:id="54" w:name="better-citation-provided"/>
     <w:p>
       <w:pPr>
         <w:pStyle w:val="Heading3"/>
       </w:pPr>
       <w:r>
-        <w:t xml:space="preserve">19.2 Better (citation provided)</w:t>
+        <w:t xml:space="preserve">20.2 Better (citation provided)</w:t>
       </w:r>
     </w:p>
     <w:p>
@@ -4919,14 +5092,14 @@
         <w:t xml:space="preserve">: Citations provide evidence for the claim.</w:t>
       </w:r>
     </w:p>
-    <w:bookmarkEnd w:id="52"/>
-    <w:bookmarkStart w:id="53" w:name="best-citation-with-context"/>
+    <w:bookmarkEnd w:id="54"/>
+    <w:bookmarkStart w:id="55" w:name="best-citation-with-context"/>
     <w:p>
       <w:pPr>
         <w:pStyle w:val="Heading3"/>
       </w:pPr>
       <w:r>
-        <w:t xml:space="preserve">19.3 Best (citation with context)</w:t>
+        <w:t xml:space="preserve">20.3 Best (citation with context)</w:t>
       </w:r>
     </w:p>
     <w:p>
@@ -4973,14 +5146,14 @@
         <w:t xml:space="preserve">: The specific support each citation provides is explained.</w:t>
       </w:r>
     </w:p>
-    <w:bookmarkEnd w:id="53"/>
-    <w:bookmarkStart w:id="54" w:name="poor-irrelevant-citation"/>
+    <w:bookmarkEnd w:id="55"/>
+    <w:bookmarkStart w:id="56" w:name="poor-irrelevant-citation"/>
     <w:p>
       <w:pPr>
         <w:pStyle w:val="Heading3"/>
       </w:pPr>
       <w:r>
-        <w:t xml:space="preserve">19.4 Poor (irrelevant citation)</w:t>
+        <w:t xml:space="preserve">20.4 Poor (irrelevant citation)</w:t>
       </w:r>
     </w:p>
     <w:p>
@@ -5015,14 +5188,14 @@
         <w:t xml:space="preserve">: Knuth’s 1984 paper on literate programming doesn’t address Python or data science.</w:t>
       </w:r>
     </w:p>
-    <w:bookmarkEnd w:id="54"/>
-    <w:bookmarkStart w:id="55" w:name="better-relevant-citation"/>
+    <w:bookmarkEnd w:id="56"/>
+    <w:bookmarkStart w:id="57" w:name="better-relevant-citation"/>
     <w:p>
       <w:pPr>
         <w:pStyle w:val="Heading3"/>
       </w:pPr>
       <w:r>
-        <w:t xml:space="preserve">19.5 Better (relevant citation)</w:t>
+        <w:t xml:space="preserve">20.5 Better (relevant citation)</w:t>
       </w:r>
     </w:p>
     <w:p>
@@ -5057,15 +5230,15 @@
         <w:t xml:space="preserve">: The citation is to a current survey of programming language usage.</w:t>
       </w:r>
     </w:p>
-    <w:bookmarkEnd w:id="55"/>
-    <w:bookmarkEnd w:id="56"/>
-    <w:bookmarkStart w:id="75" w:name="conclusion"/>
+    <w:bookmarkEnd w:id="57"/>
+    <w:bookmarkEnd w:id="58"/>
+    <w:bookmarkStart w:id="77" w:name="conclusion"/>
     <w:p>
       <w:pPr>
         <w:pStyle w:val="Heading2"/>
       </w:pPr>
       <w:r>
-        <w:t xml:space="preserve">20 Conclusion</w:t>
+        <w:t xml:space="preserve">21 Conclusion</w:t>
       </w:r>
     </w:p>
     <w:p>
@@ -5118,8 +5291,8 @@
         <w:t xml:space="preserve">add a citation or present direct evidence.</w:t>
       </w:r>
     </w:p>
-    <w:bookmarkStart w:id="74" w:name="refs"/>
-    <w:bookmarkStart w:id="58" w:name="ref-bienayme1853"/>
+    <w:bookmarkStart w:id="76" w:name="refs"/>
+    <w:bookmarkStart w:id="60" w:name="ref-bienayme1853"/>
     <w:p>
       <w:pPr>
         <w:pStyle w:val="Bibliography"/>
@@ -5164,7 +5337,7 @@
       <w:r>
         <w:t xml:space="preserve"> </w:t>
       </w:r>
-      <w:hyperlink r:id="rId57">
+      <w:hyperlink r:id="rId59">
         <w:r>
           <w:rPr>
             <w:rStyle w:val="Hyperlink"/>
@@ -5176,8 +5349,8 @@
         <w:t xml:space="preserve">.</w:t>
       </w:r>
     </w:p>
-    <w:bookmarkEnd w:id="58"/>
-    <w:bookmarkStart w:id="60" w:name="ref-blitzstein2019introduction"/>
+    <w:bookmarkEnd w:id="60"/>
+    <w:bookmarkStart w:id="62" w:name="ref-blitzstein2019introduction"/>
     <w:p>
       <w:pPr>
         <w:pStyle w:val="Bibliography"/>
@@ -5201,7 +5374,7 @@
       <w:r>
         <w:t xml:space="preserve"> </w:t>
       </w:r>
-      <w:hyperlink r:id="rId59">
+      <w:hyperlink r:id="rId61">
         <w:r>
           <w:rPr>
             <w:rStyle w:val="Hyperlink"/>
@@ -5213,8 +5386,8 @@
         <w:t xml:space="preserve">.</w:t>
       </w:r>
     </w:p>
-    <w:bookmarkEnd w:id="60"/>
-    <w:bookmarkStart w:id="62" w:name="ref-hawkins2004"/>
+    <w:bookmarkEnd w:id="62"/>
+    <w:bookmarkStart w:id="64" w:name="ref-hawkins2004"/>
     <w:p>
       <w:pPr>
         <w:pStyle w:val="Bibliography"/>
@@ -5247,7 +5420,7 @@
       <w:r>
         <w:t xml:space="preserve"> </w:t>
       </w:r>
-      <w:hyperlink r:id="rId61">
+      <w:hyperlink r:id="rId63">
         <w:r>
           <w:rPr>
             <w:rStyle w:val="Hyperlink"/>
@@ -5259,8 +5432,8 @@
         <w:t xml:space="preserve">.</w:t>
       </w:r>
     </w:p>
-    <w:bookmarkEnd w:id="62"/>
-    <w:bookmarkStart w:id="64" w:name="ref-knuth84"/>
+    <w:bookmarkEnd w:id="64"/>
+    <w:bookmarkStart w:id="66" w:name="ref-knuth84"/>
     <w:p>
       <w:pPr>
         <w:pStyle w:val="Bibliography"/>
@@ -5293,7 +5466,7 @@
       <w:r>
         <w:t xml:space="preserve"> </w:t>
       </w:r>
-      <w:hyperlink r:id="rId63">
+      <w:hyperlink r:id="rId65">
         <w:r>
           <w:rPr>
             <w:rStyle w:val="Hyperlink"/>
@@ -5305,8 +5478,8 @@
         <w:t xml:space="preserve">.</w:t>
       </w:r>
     </w:p>
-    <w:bookmarkEnd w:id="64"/>
-    <w:bookmarkStart w:id="65" w:name="ref-mitchell1997"/>
+    <w:bookmarkEnd w:id="66"/>
+    <w:bookmarkStart w:id="67" w:name="ref-mitchell1997"/>
     <w:p>
       <w:pPr>
         <w:pStyle w:val="Bibliography"/>
@@ -5328,8 +5501,8 @@
         <w:t xml:space="preserve">. McGraw-Hill.</w:t>
       </w:r>
     </w:p>
-    <w:bookmarkEnd w:id="65"/>
-    <w:bookmarkStart w:id="67" w:name="ref-stackoverflow2024"/>
+    <w:bookmarkEnd w:id="67"/>
+    <w:bookmarkStart w:id="69" w:name="ref-stackoverflow2024"/>
     <w:p>
       <w:pPr>
         <w:pStyle w:val="Bibliography"/>
@@ -5353,7 +5526,7 @@
       <w:r>
         <w:t xml:space="preserve"> </w:t>
       </w:r>
-      <w:hyperlink r:id="rId66">
+      <w:hyperlink r:id="rId68">
         <w:r>
           <w:rPr>
             <w:rStyle w:val="Hyperlink"/>
@@ -5365,8 +5538,8 @@
         <w:t xml:space="preserve">.</w:t>
       </w:r>
     </w:p>
-    <w:bookmarkEnd w:id="67"/>
-    <w:bookmarkStart w:id="69" w:name="ref-tchebichef1867"/>
+    <w:bookmarkEnd w:id="69"/>
+    <w:bookmarkStart w:id="71" w:name="ref-tchebichef1867"/>
     <w:p>
       <w:pPr>
         <w:pStyle w:val="Bibliography"/>
@@ -5396,7 +5569,7 @@
       <w:r>
         <w:t xml:space="preserve"> </w:t>
       </w:r>
-      <w:hyperlink r:id="rId68">
+      <w:hyperlink r:id="rId70">
         <w:r>
           <w:rPr>
             <w:rStyle w:val="Hyperlink"/>
@@ -5408,8 +5581,8 @@
         <w:t xml:space="preserve">.</w:t>
       </w:r>
     </w:p>
-    <w:bookmarkEnd w:id="69"/>
-    <w:bookmarkStart w:id="71" w:name="ref-vapnik1998"/>
+    <w:bookmarkEnd w:id="71"/>
+    <w:bookmarkStart w:id="73" w:name="ref-vapnik1998"/>
     <w:p>
       <w:pPr>
         <w:pStyle w:val="Bibliography"/>
@@ -5433,7 +5606,7 @@
       <w:r>
         <w:t xml:space="preserve"> </w:t>
       </w:r>
-      <w:hyperlink r:id="rId70">
+      <w:hyperlink r:id="rId72">
         <w:r>
           <w:rPr>
             <w:rStyle w:val="Hyperlink"/>
@@ -5445,8 +5618,8 @@
         <w:t xml:space="preserve">.</w:t>
       </w:r>
     </w:p>
-    <w:bookmarkEnd w:id="71"/>
-    <w:bookmarkStart w:id="73" w:name="ref-wikipedia_poisson_distribution"/>
+    <w:bookmarkEnd w:id="73"/>
+    <w:bookmarkStart w:id="75" w:name="ref-wikipedia_poisson_distribution"/>
     <w:p>
       <w:pPr>
         <w:pStyle w:val="Bibliography"/>
@@ -5505,7 +5678,7 @@
       <w:r>
         <w:t xml:space="preserve"> </w:t>
       </w:r>
-      <w:hyperlink r:id="rId72">
+      <w:hyperlink r:id="rId74">
         <w:r>
           <w:rPr>
             <w:rStyle w:val="Hyperlink"/>
@@ -5517,9 +5690,9 @@
         <w:t xml:space="preserve">.</w:t>
       </w:r>
     </w:p>
-    <w:bookmarkEnd w:id="73"/>
-    <w:bookmarkEnd w:id="74"/>
     <w:bookmarkEnd w:id="75"/>
+    <w:bookmarkEnd w:id="76"/>
+    <w:bookmarkEnd w:id="77"/>
     <w:sectPr>
       <w:footnotePr>
         <w:numRestart w:val="eachSect"/>

</xml_diff>

<commit_message>
Deploying to gh-pages from @ Morrison-Lab/psw@32fbbc83b2c3a0797bd9dcb41eb6235d01fed774 🚀
</commit_message>
<xml_diff>
--- a/chapters/citations-evidence.docx
+++ b/chapters/citations-evidence.docx
@@ -15,7 +15,7 @@
         <w:pStyle w:val="Date"/>
       </w:pPr>
       <w:r>
-        <w:t xml:space="preserve">Last modified: 2026-10-18 13:18:24 (PDT)</w:t>
+        <w:t xml:space="preserve">Last modified: 2026-10-18 13:23:31 (PDT)</w:t>
       </w:r>
     </w:p>
     <w:p>
@@ -2750,13 +2750,7 @@
         <w:t xml:space="preserve"> </w:t>
       </w:r>
       <w:r>
-        <w:t xml:space="preserve">So cite the Wikipedia article for each definition, theorem or named method whenever one exists,</w:t>
-      </w:r>
-      <w:r>
-        <w:t xml:space="preserve"> </w:t>
-      </w:r>
-      <w:r>
-        <w:t xml:space="preserve">and offer it as further reading:</w:t>
+        <w:t xml:space="preserve">So cite the Wikipedia article for each definition, theorem or named method whenever one exists:</w:t>
       </w:r>
       <w:r>
         <w:t xml:space="preserve"> </w:t>
@@ -2878,13 +2872,19 @@
         <w:t xml:space="preserve"> </w:t>
       </w:r>
       <w:r>
-        <w:t xml:space="preserve">Where a page ends a section with further reading,</w:t>
-      </w:r>
-      <w:r>
-        <w:t xml:space="preserve"> </w:t>
-      </w:r>
-      <w:r>
-        <w:t xml:space="preserve">list the same Wikipedia citation there too, next to the other further-reading sources.</w:t>
+        <w:t xml:space="preserve">Never list a Wikipedia article in a Further reading section.</w:t>
+      </w:r>
+      <w:r>
+        <w:t xml:space="preserve"> </w:t>
+      </w:r>
+      <w:r>
+        <w:t xml:space="preserve">Wikipedia appears only as a citation beside the content it covers.</w:t>
+      </w:r>
+      <w:r>
+        <w:t xml:space="preserve"> </w:t>
+      </w:r>
+      <w:r>
+        <w:t xml:space="preserve">A Further reading section lists primary sources, textbooks, courses and other resources instead.</w:t>
       </w:r>
     </w:p>
     <w:p>

</xml_diff>

<commit_message>
Deploying to gh-pages from @ Morrison-Lab/psw@f0a537eafd3bc6cf691003c99d01fd5874e08bed 🚀
</commit_message>
<xml_diff>
--- a/chapters/citations-evidence.docx
+++ b/chapters/citations-evidence.docx
@@ -15,7 +15,7 @@
         <w:pStyle w:val="Date"/>
       </w:pPr>
       <w:r>
-        <w:t xml:space="preserve">Last modified: 2026-10-18 23:00:30 (PDT)</w:t>
+        <w:t xml:space="preserve">Last modified: 2026-10-18 23:56:20 (PDT)</w:t>
       </w:r>
     </w:p>
     <w:p>
@@ -3224,13 +3224,13 @@
       </w:r>
     </w:p>
     <w:bookmarkEnd w:id="38"/>
-    <w:bookmarkStart w:id="39" w:name="best-practices"/>
+    <w:bookmarkStart w:id="40" w:name="cite-once-per-passage"/>
     <w:p>
       <w:pPr>
         <w:pStyle w:val="Heading2"/>
       </w:pPr>
       <w:r>
-        <w:t xml:space="preserve">10 Best practices</w:t>
+        <w:t xml:space="preserve">10 Cite a source once per passage</w:t>
       </w:r>
     </w:p>
     <w:p>
@@ -3238,32 +3238,188 @@
         <w:pStyle w:val="FirstParagraph"/>
       </w:pPr>
       <w:r>
-        <w:t xml:space="preserve">To effectively support your claims:</w:t>
-      </w:r>
-    </w:p>
-    <w:p>
-      <w:pPr>
-        <w:pStyle w:val="Compact"/>
-        <w:numPr>
-          <w:ilvl w:val="0"/>
-          <w:numId w:val="1017"/>
-        </w:numPr>
+        <w:t xml:space="preserve">Cite a source once in each div or passage, at the claim it supports.</w:t>
+      </w:r>
+      <w:r>
+        <w:t xml:space="preserve"> </w:t>
+      </w:r>
+      <w:r>
+        <w:t xml:space="preserve">A second citation of the same source in the same div adds a number that the reader must look up again</w:t>
+      </w:r>
+      <w:r>
+        <w:t xml:space="preserve"> </w:t>
+      </w:r>
+      <w:r>
+        <w:t xml:space="preserve">and tells them nothing new.</w:t>
+      </w:r>
+      <w:r>
+        <w:t xml:space="preserve"> </w:t>
+      </w:r>
+      <w:r>
+        <w:t xml:space="preserve">Cite again only when the second claim rests on a different part of the source,</w:t>
+      </w:r>
+      <w:r>
+        <w:t xml:space="preserve"> </w:t>
+      </w:r>
+      <w:r>
+        <w:t xml:space="preserve">and then give a locator, such as</w:t>
+      </w:r>
+      <w:r>
+        <w:t xml:space="preserve"> </w:t>
+      </w:r>
+      <w:r>
+        <w:rPr>
+          <w:rStyle w:val="VerbatimChar"/>
+        </w:rPr>
+        <w:t xml:space="preserve">[@key, p. 5]</w:t>
+      </w:r>
+      <w:r>
+        <w:t xml:space="preserve">.</w:t>
+      </w:r>
+      <w:r>
+        <w:t xml:space="preserve"> </w:t>
+      </w:r>
+      <w:r>
+        <w:t xml:space="preserve">The rule to cite a Wikipedia article once, where its term is defined, is a case of this one.</w:t>
+      </w:r>
+    </w:p>
+    <w:bookmarkStart w:id="39" w:name="exm-cite-once"/>
+    <w:p>
+      <w:pPr>
+        <w:pStyle w:val="BodyText"/>
       </w:pPr>
       <w:r>
         <w:rPr>
           <w:b/>
           <w:bCs/>
         </w:rPr>
-        <w:t xml:space="preserve">Cite as you write</w:t>
-      </w:r>
-      <w:r>
-        <w:t xml:space="preserve">: Add citations immediately when making claims, rather than planning to</w:t>
-      </w:r>
-      <w:r>
-        <w:t xml:space="preserve"> </w:t>
-      </w:r>
-      <w:r>
-        <w:t xml:space="preserve">“add references later”</w:t>
+        <w:t xml:space="preserve">Example 4 (Citing one source once in a definition)</w:t>
+      </w:r>
+      <w:r>
+        <w:t xml:space="preserve"> </w:t>
+      </w:r>
+      <w:r>
+        <w:t xml:space="preserve"> </w:t>
+      </w:r>
+    </w:p>
+    <w:p>
+      <w:pPr>
+        <w:pStyle w:val="BlockText"/>
+      </w:pPr>
+      <w:r>
+        <w:t xml:space="preserve">❌ A</w:t>
+      </w:r>
+      <w:r>
+        <w:t xml:space="preserve"> </w:t>
+      </w:r>
+      <w:r>
+        <w:rPr>
+          <w:i/>
+          <w:iCs/>
+        </w:rPr>
+        <w:t xml:space="preserve">Poisson random variable</w:t>
+      </w:r>
+      <w:r>
+        <w:t xml:space="preserve"> </w:t>
+      </w:r>
+      <w:r>
+        <w:t xml:space="preserve">counts events in a fixed interval</w:t>
+      </w:r>
+      <w:r>
+        <w:t xml:space="preserve"> </w:t>
+      </w:r>
+      <w:r>
+        <w:t xml:space="preserve">(Wikipedia contributors 2026)</w:t>
+      </w:r>
+      <w:r>
+        <w:t xml:space="preserve">.</w:t>
+      </w:r>
+      <w:r>
+        <w:t xml:space="preserve"> </w:t>
+      </w:r>
+      <w:r>
+        <w:t xml:space="preserve">Source:</w:t>
+      </w:r>
+      <w:r>
+        <w:t xml:space="preserve"> </w:t>
+      </w:r>
+      <w:r>
+        <w:t xml:space="preserve">Wikipedia contributors (2026)</w:t>
+      </w:r>
+      <w:r>
+        <w:t xml:space="preserve">.</w:t>
+      </w:r>
+    </w:p>
+    <w:p>
+      <w:pPr>
+        <w:pStyle w:val="BlockText"/>
+      </w:pPr>
+      <w:r>
+        <w:t xml:space="preserve">✅ A</w:t>
+      </w:r>
+      <w:r>
+        <w:t xml:space="preserve"> </w:t>
+      </w:r>
+      <w:r>
+        <w:rPr>
+          <w:i/>
+          <w:iCs/>
+        </w:rPr>
+        <w:t xml:space="preserve">Poisson random variable</w:t>
+      </w:r>
+      <w:r>
+        <w:t xml:space="preserve"> </w:t>
+      </w:r>
+      <w:r>
+        <w:t xml:space="preserve">counts events in a fixed interval.</w:t>
+      </w:r>
+      <w:r>
+        <w:t xml:space="preserve"> </w:t>
+      </w:r>
+      <w:r>
+        <w:t xml:space="preserve">Source:</w:t>
+      </w:r>
+      <w:r>
+        <w:t xml:space="preserve"> </w:t>
+      </w:r>
+      <w:r>
+        <w:t xml:space="preserve">Wikipedia contributors (2026)</w:t>
+      </w:r>
+      <w:r>
+        <w:t xml:space="preserve">.</w:t>
+      </w:r>
+    </w:p>
+    <w:p>
+      <w:pPr>
+        <w:pStyle w:val="FirstParagraph"/>
+      </w:pPr>
+      <w:r>
+        <w:t xml:space="preserve">Both versions credit the same article.</w:t>
+      </w:r>
+      <w:r>
+        <w:t xml:space="preserve"> </w:t>
+      </w:r>
+      <w:r>
+        <w:t xml:space="preserve">The second one does it once, in the source line that closes the div.</w:t>
+      </w:r>
+    </w:p>
+    <w:bookmarkEnd w:id="39"/>
+    <w:bookmarkEnd w:id="40"/>
+    <w:bookmarkStart w:id="41" w:name="best-practices"/>
+    <w:p>
+      <w:pPr>
+        <w:pStyle w:val="Heading2"/>
+      </w:pPr>
+      <w:r>
+        <w:t xml:space="preserve">11 Best practices</w:t>
+      </w:r>
+    </w:p>
+    <w:p>
+      <w:pPr>
+        <w:pStyle w:val="FirstParagraph"/>
+      </w:pPr>
+      <w:r>
+        <w:t xml:space="preserve">To effectively support your claims:</w:t>
       </w:r>
     </w:p>
     <w:p>
@@ -3279,10 +3435,16 @@
           <w:b/>
           <w:bCs/>
         </w:rPr>
-        <w:t xml:space="preserve">Use citation management tools</w:t>
-      </w:r>
-      <w:r>
-        <w:t xml:space="preserve">: Software like Zotero, Mendeley, or BibTeX helps organize and format references correctly</w:t>
+        <w:t xml:space="preserve">Cite as you write</w:t>
+      </w:r>
+      <w:r>
+        <w:t xml:space="preserve">: Add citations immediately when making claims, rather than planning to</w:t>
+      </w:r>
+      <w:r>
+        <w:t xml:space="preserve"> </w:t>
+      </w:r>
+      <w:r>
+        <w:t xml:space="preserve">“add references later”</w:t>
       </w:r>
     </w:p>
     <w:p>
@@ -3298,10 +3460,10 @@
           <w:b/>
           <w:bCs/>
         </w:rPr>
-        <w:t xml:space="preserve">Check your citations</w:t>
-      </w:r>
-      <w:r>
-        <w:t xml:space="preserve">: Before submitting, verify that every citation supports its associated claim</w:t>
+        <w:t xml:space="preserve">Use citation management tools</w:t>
+      </w:r>
+      <w:r>
+        <w:t xml:space="preserve">: Software like Zotero, Mendeley, or BibTeX helps organize and format references correctly</w:t>
       </w:r>
     </w:p>
     <w:p>
@@ -3317,31 +3479,10 @@
           <w:b/>
           <w:bCs/>
         </w:rPr>
-        <w:t xml:space="preserve">Provide context</w:t>
-      </w:r>
-      <w:r>
-        <w:t xml:space="preserve">: Help readers understand why a source is relevant (for example,</w:t>
-      </w:r>
-      <w:r>
-        <w:t xml:space="preserve"> </w:t>
-      </w:r>
-      <w:r>
-        <w:t xml:space="preserve">“Smith et al. (2020) demonstrated that…”</w:t>
-      </w:r>
-      <w:r>
-        <w:t xml:space="preserve"> </w:t>
-      </w:r>
-      <w:r>
-        <w:t xml:space="preserve">rather than just</w:t>
-      </w:r>
-      <w:r>
-        <w:t xml:space="preserve"> </w:t>
-      </w:r>
-      <w:r>
-        <w:t xml:space="preserve">“(Smith et al., 2020)”</w:t>
-      </w:r>
-      <w:r>
-        <w:t xml:space="preserve">)</w:t>
+        <w:t xml:space="preserve">Check your citations</w:t>
+      </w:r>
+      <w:r>
+        <w:t xml:space="preserve">: Before submitting, verify that every citation supports its associated claim</w:t>
       </w:r>
     </w:p>
     <w:p>
@@ -3357,10 +3498,31 @@
           <w:b/>
           <w:bCs/>
         </w:rPr>
-        <w:t xml:space="preserve">Balance primary and review sources</w:t>
-      </w:r>
-      <w:r>
-        <w:t xml:space="preserve">: Use primary sources for specific findings, reviews for general background</w:t>
+        <w:t xml:space="preserve">Provide context</w:t>
+      </w:r>
+      <w:r>
+        <w:t xml:space="preserve">: Help readers understand why a source is relevant (for example,</w:t>
+      </w:r>
+      <w:r>
+        <w:t xml:space="preserve"> </w:t>
+      </w:r>
+      <w:r>
+        <w:t xml:space="preserve">“Smith et al. (2020) demonstrated that…”</w:t>
+      </w:r>
+      <w:r>
+        <w:t xml:space="preserve"> </w:t>
+      </w:r>
+      <w:r>
+        <w:t xml:space="preserve">rather than just</w:t>
+      </w:r>
+      <w:r>
+        <w:t xml:space="preserve"> </w:t>
+      </w:r>
+      <w:r>
+        <w:t xml:space="preserve">“(Smith et al., 2020)”</w:t>
+      </w:r>
+      <w:r>
+        <w:t xml:space="preserve">)</w:t>
       </w:r>
     </w:p>
     <w:p>
@@ -3376,10 +3538,10 @@
           <w:b/>
           <w:bCs/>
         </w:rPr>
-        <w:t xml:space="preserve">Stay current</w:t>
-      </w:r>
-      <w:r>
-        <w:t xml:space="preserve">: Supplement foundational older references with recent work showing the current state of knowledge</w:t>
+        <w:t xml:space="preserve">Balance primary and review sources</w:t>
+      </w:r>
+      <w:r>
+        <w:t xml:space="preserve">: Use primary sources for specific findings, reviews for general background</w:t>
       </w:r>
     </w:p>
     <w:p>
@@ -3395,20 +3557,39 @@
           <w:b/>
           <w:bCs/>
         </w:rPr>
+        <w:t xml:space="preserve">Stay current</w:t>
+      </w:r>
+      <w:r>
+        <w:t xml:space="preserve">: Supplement foundational older references with recent work showing the current state of knowledge</w:t>
+      </w:r>
+    </w:p>
+    <w:p>
+      <w:pPr>
+        <w:pStyle w:val="Compact"/>
+        <w:numPr>
+          <w:ilvl w:val="0"/>
+          <w:numId w:val="1017"/>
+        </w:numPr>
+      </w:pPr>
+      <w:r>
+        <w:rPr>
+          <w:b/>
+          <w:bCs/>
+        </w:rPr>
         <w:t xml:space="preserve">Cite diverse sources</w:t>
       </w:r>
       <w:r>
         <w:t xml:space="preserve">: When possible, include work from different research groups and perspectives</w:t>
       </w:r>
     </w:p>
-    <w:bookmarkEnd w:id="39"/>
-    <w:bookmarkStart w:id="40" w:name="quote-the-original"/>
+    <w:bookmarkEnd w:id="41"/>
+    <w:bookmarkStart w:id="42" w:name="quote-the-original"/>
     <w:p>
       <w:pPr>
         <w:pStyle w:val="Heading2"/>
       </w:pPr>
       <w:r>
-        <w:t xml:space="preserve">11 Quote the original</w:t>
+        <w:t xml:space="preserve">12 Quote the original</w:t>
       </w:r>
     </w:p>
     <w:p>
@@ -3485,14 +3666,14 @@
         <w:t xml:space="preserve">Uncertainty about who said a line is not evidence about who said it.</w:t>
       </w:r>
     </w:p>
-    <w:bookmarkEnd w:id="40"/>
-    <w:bookmarkStart w:id="41" w:name="Xdc6e961a4731f42c2c786ef03a498fc72396848"/>
+    <w:bookmarkEnd w:id="42"/>
+    <w:bookmarkStart w:id="43" w:name="Xdc6e961a4731f42c2c786ef03a498fc72396848"/>
     <w:p>
       <w:pPr>
         <w:pStyle w:val="Heading2"/>
       </w:pPr>
       <w:r>
-        <w:t xml:space="preserve">12 Copy organization names from their source</w:t>
+        <w:t xml:space="preserve">13 Copy organization names from their source</w:t>
       </w:r>
     </w:p>
     <w:p>
@@ -3515,14 +3696,14 @@
         <w:t xml:space="preserve">rather than expanding an acronym from memory.</w:t>
       </w:r>
     </w:p>
-    <w:bookmarkEnd w:id="41"/>
-    <w:bookmarkStart w:id="44" w:name="verify-each-bibliography-entry"/>
+    <w:bookmarkEnd w:id="43"/>
+    <w:bookmarkStart w:id="46" w:name="verify-each-bibliography-entry"/>
     <w:p>
       <w:pPr>
         <w:pStyle w:val="Heading2"/>
       </w:pPr>
       <w:r>
-        <w:t xml:space="preserve">13 Verify each bibliography entry</w:t>
+        <w:t xml:space="preserve">14 Verify each bibliography entry</w:t>
       </w:r>
     </w:p>
     <w:p>
@@ -3541,7 +3722,7 @@
       <w:r>
         <w:t xml:space="preserve"> </w:t>
       </w:r>
-      <w:hyperlink r:id="rId42">
+      <w:hyperlink r:id="rId44">
         <w:r>
           <w:rPr>
             <w:rStyle w:val="Hyperlink"/>
@@ -3558,7 +3739,7 @@
       <w:r>
         <w:t xml:space="preserve"> </w:t>
       </w:r>
-      <w:hyperlink r:id="rId43">
+      <w:hyperlink r:id="rId45">
         <w:r>
           <w:rPr>
             <w:rStyle w:val="Hyperlink"/>
@@ -3600,14 +3781,14 @@
         <w:t xml:space="preserve">and say in the pull request what you checked against what.</w:t>
       </w:r>
     </w:p>
-    <w:bookmarkEnd w:id="44"/>
-    <w:bookmarkStart w:id="45" w:name="cite-an-alias-directly"/>
+    <w:bookmarkEnd w:id="46"/>
+    <w:bookmarkStart w:id="47" w:name="cite-an-alias-directly"/>
     <w:p>
       <w:pPr>
         <w:pStyle w:val="Heading2"/>
       </w:pPr>
       <w:r>
-        <w:t xml:space="preserve">14 Cite an alias directly</w:t>
+        <w:t xml:space="preserve">15 Cite an alias directly</w:t>
       </w:r>
     </w:p>
     <w:p>
@@ -3697,14 +3878,14 @@
         <w:t xml:space="preserve">also called the **alias** [@key, section]</w:t>
       </w:r>
     </w:p>
-    <w:bookmarkEnd w:id="45"/>
-    <w:bookmarkStart w:id="48" w:name="cite-the-original-for-named-results"/>
+    <w:bookmarkEnd w:id="47"/>
+    <w:bookmarkStart w:id="50" w:name="cite-the-original-for-named-results"/>
     <w:p>
       <w:pPr>
         <w:pStyle w:val="Heading2"/>
       </w:pPr>
       <w:r>
-        <w:t xml:space="preserve">15 Cite the original for named results</w:t>
+        <w:t xml:space="preserve">16 Cite the original for named results</w:t>
       </w:r>
     </w:p>
     <w:p>
@@ -3979,7 +4160,7 @@
       <w:r>
         <w:t xml:space="preserve"> </w:t>
       </w:r>
-      <w:hyperlink r:id="rId46">
+      <w:hyperlink r:id="rId48">
         <w:r>
           <w:rPr>
             <w:rStyle w:val="Hyperlink"/>
@@ -4005,7 +4186,7 @@
         <w:t xml:space="preserve">and never fill in a title, volume, or page number from memory.</w:t>
       </w:r>
     </w:p>
-    <w:bookmarkStart w:id="47" w:name="exm-cite-original"/>
+    <w:bookmarkStart w:id="49" w:name="exm-cite-original"/>
     <w:p>
       <w:pPr>
         <w:pStyle w:val="BodyText"/>
@@ -4015,7 +4196,7 @@
           <w:b/>
           <w:bCs/>
         </w:rPr>
-        <w:t xml:space="preserve">Example 4 (Crediting Chebyshev’s inequality)</w:t>
+        <w:t xml:space="preserve">Example 5 (Crediting Chebyshev’s inequality)</w:t>
       </w:r>
       <w:r>
         <w:t xml:space="preserve"> </w:t>
@@ -4079,15 +4260,15 @@
         <w:t xml:space="preserve">.</w:t>
       </w:r>
     </w:p>
-    <w:bookmarkEnd w:id="47"/>
-    <w:bookmarkEnd w:id="48"/>
-    <w:bookmarkStart w:id="49" w:name="put-the-content-first"/>
+    <w:bookmarkEnd w:id="49"/>
+    <w:bookmarkEnd w:id="50"/>
+    <w:bookmarkStart w:id="51" w:name="put-the-content-first"/>
     <w:p>
       <w:pPr>
         <w:pStyle w:val="Heading2"/>
       </w:pPr>
       <w:r>
-        <w:t xml:space="preserve">16 Put the content first</w:t>
+        <w:t xml:space="preserve">17 Put the content first</w:t>
       </w:r>
     </w:p>
     <w:p>
@@ -4134,14 +4315,14 @@
         <w:t xml:space="preserve">without commentary on who said it or where it was repeated.</w:t>
       </w:r>
     </w:p>
-    <w:bookmarkEnd w:id="49"/>
-    <w:bookmarkStart w:id="50" w:name="adapting-another-courses-material"/>
+    <w:bookmarkEnd w:id="51"/>
+    <w:bookmarkStart w:id="52" w:name="adapting-another-courses-material"/>
     <w:p>
       <w:pPr>
         <w:pStyle w:val="Heading2"/>
       </w:pPr>
       <w:r>
-        <w:t xml:space="preserve">17 Adapting another course’s material</w:t>
+        <w:t xml:space="preserve">18 Adapting another course’s material</w:t>
       </w:r>
     </w:p>
     <w:p>
@@ -4380,14 +4561,14 @@
         <w:t xml:space="preserve">:::</w:t>
       </w:r>
     </w:p>
-    <w:bookmarkEnd w:id="50"/>
-    <w:bookmarkStart w:id="51" w:name="material-from-your-own-work"/>
+    <w:bookmarkEnd w:id="52"/>
+    <w:bookmarkStart w:id="53" w:name="material-from-your-own-work"/>
     <w:p>
       <w:pPr>
         <w:pStyle w:val="Heading2"/>
       </w:pPr>
       <w:r>
-        <w:t xml:space="preserve">18 Material from your own work</w:t>
+        <w:t xml:space="preserve">19 Material from your own work</w:t>
       </w:r>
     </w:p>
     <w:p>
@@ -4823,14 +5004,14 @@
         <w:t xml:space="preserve">When you find an existing credit to your own work, remove it and add or keep a link to it.</w:t>
       </w:r>
     </w:p>
-    <w:bookmarkEnd w:id="51"/>
-    <w:bookmarkStart w:id="52" w:name="common-citation-errors-to-avoid"/>
+    <w:bookmarkEnd w:id="53"/>
+    <w:bookmarkStart w:id="54" w:name="common-citation-errors-to-avoid"/>
     <w:p>
       <w:pPr>
         <w:pStyle w:val="Heading2"/>
       </w:pPr>
       <w:r>
-        <w:t xml:space="preserve">19 Common citation errors to avoid</w:t>
+        <w:t xml:space="preserve">20 Common citation errors to avoid</w:t>
       </w:r>
     </w:p>
     <w:p>
@@ -4964,10 +5145,24 @@
           <w:b/>
           <w:bCs/>
         </w:rPr>
-        <w:t xml:space="preserve">Citation padding</w:t>
-      </w:r>
-      <w:r>
-        <w:t xml:space="preserve">: Adding citations that don’t actually support your claims just to appear well-referenced</w:t>
+        <w:t xml:space="preserve">Redundant citation</w:t>
+      </w:r>
+      <w:r>
+        <w:t xml:space="preserve">: Citing the same source more than once in one div or passage (see</w:t>
+      </w:r>
+      <w:r>
+        <w:t xml:space="preserve"> </w:t>
+      </w:r>
+      <w:hyperlink w:anchor="cite-once-per-passage">
+        <w:r>
+          <w:rPr>
+            <w:rStyle w:val="Hyperlink"/>
+          </w:rPr>
+          <w:t xml:space="preserve">Cite a source once per passage</w:t>
+        </w:r>
+      </w:hyperlink>
+      <w:r>
+        <w:t xml:space="preserve">)</w:t>
       </w:r>
     </w:p>
     <w:p>
@@ -4983,10 +5178,10 @@
           <w:b/>
           <w:bCs/>
         </w:rPr>
-        <w:t xml:space="preserve">Selective citation</w:t>
-      </w:r>
-      <w:r>
-        <w:t xml:space="preserve">: Only citing work that supports your position while ignoring contradictory evidence</w:t>
+        <w:t xml:space="preserve">Citation padding</w:t>
+      </w:r>
+      <w:r>
+        <w:t xml:space="preserve">: Adding citations that don’t actually support your claims just to appear well-referenced</w:t>
       </w:r>
     </w:p>
     <w:p>
@@ -5002,62 +5197,48 @@
           <w:b/>
           <w:bCs/>
         </w:rPr>
-        <w:t xml:space="preserve">Ghost authorship</w:t>
-      </w:r>
-      <w:r>
-        <w:t xml:space="preserve">: Failing to cite work that directly influenced your ideas</w:t>
-      </w:r>
-    </w:p>
-    <w:bookmarkEnd w:id="52"/>
-    <w:bookmarkStart w:id="58" w:name="examples"/>
-    <w:p>
-      <w:pPr>
-        <w:pStyle w:val="Heading2"/>
-      </w:pPr>
-      <w:r>
-        <w:t xml:space="preserve">20 Examples</w:t>
-      </w:r>
-    </w:p>
-    <w:bookmarkStart w:id="53" w:name="poor-unsupported-claim"/>
-    <w:p>
-      <w:pPr>
-        <w:pStyle w:val="Heading3"/>
-      </w:pPr>
-      <w:r>
-        <w:t xml:space="preserve">20.1 Poor (unsupported claim)</w:t>
-      </w:r>
-    </w:p>
-    <w:p>
-      <w:pPr>
-        <w:pStyle w:val="BlockText"/>
-      </w:pPr>
-      <w:r>
-        <w:t xml:space="preserve">Machine learning models often perform poorly on small datasets.</w:t>
-      </w:r>
-    </w:p>
-    <w:p>
-      <w:pPr>
-        <w:pStyle w:val="FirstParagraph"/>
+        <w:t xml:space="preserve">Selective citation</w:t>
+      </w:r>
+      <w:r>
+        <w:t xml:space="preserve">: Only citing work that supports your position while ignoring contradictory evidence</w:t>
+      </w:r>
+    </w:p>
+    <w:p>
+      <w:pPr>
+        <w:pStyle w:val="Compact"/>
+        <w:numPr>
+          <w:ilvl w:val="0"/>
+          <w:numId w:val="1023"/>
+        </w:numPr>
       </w:pPr>
       <w:r>
         <w:rPr>
           <w:b/>
           <w:bCs/>
         </w:rPr>
-        <w:t xml:space="preserve">Problem</w:t>
-      </w:r>
-      <w:r>
-        <w:t xml:space="preserve">: This claim is stated as fact without any support.</w:t>
-      </w:r>
-    </w:p>
-    <w:bookmarkEnd w:id="53"/>
-    <w:bookmarkStart w:id="54" w:name="better-citation-provided"/>
+        <w:t xml:space="preserve">Ghost authorship</w:t>
+      </w:r>
+      <w:r>
+        <w:t xml:space="preserve">: Failing to cite work that directly influenced your ideas</w:t>
+      </w:r>
+    </w:p>
+    <w:bookmarkEnd w:id="54"/>
+    <w:bookmarkStart w:id="60" w:name="examples"/>
+    <w:p>
+      <w:pPr>
+        <w:pStyle w:val="Heading2"/>
+      </w:pPr>
+      <w:r>
+        <w:t xml:space="preserve">21 Examples</w:t>
+      </w:r>
+    </w:p>
+    <w:bookmarkStart w:id="55" w:name="poor-unsupported-claim"/>
     <w:p>
       <w:pPr>
         <w:pStyle w:val="Heading3"/>
       </w:pPr>
       <w:r>
-        <w:t xml:space="preserve">20.2 Better (citation provided)</w:t>
+        <w:t xml:space="preserve">21.1 Poor (unsupported claim)</w:t>
       </w:r>
     </w:p>
     <w:p>
@@ -5065,16 +5246,7 @@
         <w:pStyle w:val="BlockText"/>
       </w:pPr>
       <w:r>
-        <w:t xml:space="preserve">Machine learning models often perform poorly on small datasets</w:t>
-      </w:r>
-      <w:r>
-        <w:t xml:space="preserve"> </w:t>
-      </w:r>
-      <w:r>
-        <w:t xml:space="preserve">(Vapnik 1998; Hawkins 2004)</w:t>
-      </w:r>
-      <w:r>
-        <w:t xml:space="preserve">.</w:t>
+        <w:t xml:space="preserve">Machine learning models often perform poorly on small datasets.</w:t>
       </w:r>
     </w:p>
     <w:p>
@@ -5086,20 +5258,20 @@
           <w:b/>
           <w:bCs/>
         </w:rPr>
-        <w:t xml:space="preserve">Improvement</w:t>
-      </w:r>
-      <w:r>
-        <w:t xml:space="preserve">: Citations provide evidence for the claim.</w:t>
-      </w:r>
-    </w:p>
-    <w:bookmarkEnd w:id="54"/>
-    <w:bookmarkStart w:id="55" w:name="best-citation-with-context"/>
+        <w:t xml:space="preserve">Problem</w:t>
+      </w:r>
+      <w:r>
+        <w:t xml:space="preserve">: This claim is stated as fact without any support.</w:t>
+      </w:r>
+    </w:p>
+    <w:bookmarkEnd w:id="55"/>
+    <w:bookmarkStart w:id="56" w:name="better-citation-provided"/>
     <w:p>
       <w:pPr>
         <w:pStyle w:val="Heading3"/>
       </w:pPr>
       <w:r>
-        <w:t xml:space="preserve">20.3 Best (citation with context)</w:t>
+        <w:t xml:space="preserve">21.2 Better (citation provided)</w:t>
       </w:r>
     </w:p>
     <w:p>
@@ -5107,19 +5279,7 @@
         <w:pStyle w:val="BlockText"/>
       </w:pPr>
       <w:r>
-        <w:t xml:space="preserve">Machine learning models often perform poorly on small datasets.</w:t>
-      </w:r>
-      <w:r>
-        <w:t xml:space="preserve"> </w:t>
-      </w:r>
-      <w:r>
-        <w:t xml:space="preserve">Vapnik (1998) showed that the generalization error of learning algorithms typically decreases as training set size increases,</w:t>
-      </w:r>
-      <w:r>
-        <w:t xml:space="preserve"> </w:t>
-      </w:r>
-      <w:r>
-        <w:t xml:space="preserve">and Hawkins (2004) demonstrated that complex models are particularly prone to overfitting when trained on limited data</w:t>
+        <w:t xml:space="preserve">Machine learning models often perform poorly on small datasets</w:t>
       </w:r>
       <w:r>
         <w:t xml:space="preserve"> </w:t>
@@ -5143,17 +5303,17 @@
         <w:t xml:space="preserve">Improvement</w:t>
       </w:r>
       <w:r>
-        <w:t xml:space="preserve">: The specific support each citation provides is explained.</w:t>
-      </w:r>
-    </w:p>
-    <w:bookmarkEnd w:id="55"/>
-    <w:bookmarkStart w:id="56" w:name="poor-irrelevant-citation"/>
+        <w:t xml:space="preserve">: Citations provide evidence for the claim.</w:t>
+      </w:r>
+    </w:p>
+    <w:bookmarkEnd w:id="56"/>
+    <w:bookmarkStart w:id="57" w:name="best-citation-with-context"/>
     <w:p>
       <w:pPr>
         <w:pStyle w:val="Heading3"/>
       </w:pPr>
       <w:r>
-        <w:t xml:space="preserve">20.4 Poor (irrelevant citation)</w:t>
+        <w:t xml:space="preserve">21.3 Best (citation with context)</w:t>
       </w:r>
     </w:p>
     <w:p>
@@ -5161,13 +5321,25 @@
         <w:pStyle w:val="BlockText"/>
       </w:pPr>
       <w:r>
-        <w:t xml:space="preserve">Python is the most popular programming language for data science</w:t>
-      </w:r>
-      <w:r>
-        <w:t xml:space="preserve"> </w:t>
-      </w:r>
-      <w:r>
-        <w:t xml:space="preserve">(Knuth 1984)</w:t>
+        <w:t xml:space="preserve">Machine learning models often perform poorly on small datasets.</w:t>
+      </w:r>
+      <w:r>
+        <w:t xml:space="preserve"> </w:t>
+      </w:r>
+      <w:r>
+        <w:t xml:space="preserve">Vapnik (1998) showed that the generalization error of learning algorithms typically decreases as training set size increases,</w:t>
+      </w:r>
+      <w:r>
+        <w:t xml:space="preserve"> </w:t>
+      </w:r>
+      <w:r>
+        <w:t xml:space="preserve">and Hawkins (2004) demonstrated that complex models are particularly prone to overfitting when trained on limited data</w:t>
+      </w:r>
+      <w:r>
+        <w:t xml:space="preserve"> </w:t>
+      </w:r>
+      <w:r>
+        <w:t xml:space="preserve">(Vapnik 1998; Hawkins 2004)</w:t>
       </w:r>
       <w:r>
         <w:t xml:space="preserve">.</w:t>
@@ -5182,20 +5354,20 @@
           <w:b/>
           <w:bCs/>
         </w:rPr>
-        <w:t xml:space="preserve">Problem</w:t>
-      </w:r>
-      <w:r>
-        <w:t xml:space="preserve">: Knuth’s 1984 paper on literate programming doesn’t address Python or data science.</w:t>
-      </w:r>
-    </w:p>
-    <w:bookmarkEnd w:id="56"/>
-    <w:bookmarkStart w:id="57" w:name="better-relevant-citation"/>
+        <w:t xml:space="preserve">Improvement</w:t>
+      </w:r>
+      <w:r>
+        <w:t xml:space="preserve">: The specific support each citation provides is explained.</w:t>
+      </w:r>
+    </w:p>
+    <w:bookmarkEnd w:id="57"/>
+    <w:bookmarkStart w:id="58" w:name="poor-irrelevant-citation"/>
     <w:p>
       <w:pPr>
         <w:pStyle w:val="Heading3"/>
       </w:pPr>
       <w:r>
-        <w:t xml:space="preserve">20.5 Better (relevant citation)</w:t>
+        <w:t xml:space="preserve">21.4 Poor (irrelevant citation)</w:t>
       </w:r>
     </w:p>
     <w:p>
@@ -5209,7 +5381,7 @@
         <w:t xml:space="preserve"> </w:t>
       </w:r>
       <w:r>
-        <w:t xml:space="preserve">(Stack Overflow 2024)</w:t>
+        <w:t xml:space="preserve">(Knuth 1984)</w:t>
       </w:r>
       <w:r>
         <w:t xml:space="preserve">.</w:t>
@@ -5224,21 +5396,63 @@
           <w:b/>
           <w:bCs/>
         </w:rPr>
+        <w:t xml:space="preserve">Problem</w:t>
+      </w:r>
+      <w:r>
+        <w:t xml:space="preserve">: Knuth’s 1984 paper on literate programming doesn’t address Python or data science.</w:t>
+      </w:r>
+    </w:p>
+    <w:bookmarkEnd w:id="58"/>
+    <w:bookmarkStart w:id="59" w:name="better-relevant-citation"/>
+    <w:p>
+      <w:pPr>
+        <w:pStyle w:val="Heading3"/>
+      </w:pPr>
+      <w:r>
+        <w:t xml:space="preserve">21.5 Better (relevant citation)</w:t>
+      </w:r>
+    </w:p>
+    <w:p>
+      <w:pPr>
+        <w:pStyle w:val="BlockText"/>
+      </w:pPr>
+      <w:r>
+        <w:t xml:space="preserve">Python is the most popular programming language for data science</w:t>
+      </w:r>
+      <w:r>
+        <w:t xml:space="preserve"> </w:t>
+      </w:r>
+      <w:r>
+        <w:t xml:space="preserve">(Stack Overflow 2024)</w:t>
+      </w:r>
+      <w:r>
+        <w:t xml:space="preserve">.</w:t>
+      </w:r>
+    </w:p>
+    <w:p>
+      <w:pPr>
+        <w:pStyle w:val="FirstParagraph"/>
+      </w:pPr>
+      <w:r>
+        <w:rPr>
+          <w:b/>
+          <w:bCs/>
+        </w:rPr>
         <w:t xml:space="preserve">Improvement</w:t>
       </w:r>
       <w:r>
         <w:t xml:space="preserve">: The citation is to a current survey of programming language usage.</w:t>
       </w:r>
     </w:p>
-    <w:bookmarkEnd w:id="57"/>
-    <w:bookmarkEnd w:id="58"/>
-    <w:bookmarkStart w:id="77" w:name="conclusion"/>
+    <w:bookmarkEnd w:id="59"/>
+    <w:bookmarkEnd w:id="60"/>
+    <w:bookmarkStart w:id="79" w:name="conclusion"/>
     <w:p>
       <w:pPr>
         <w:pStyle w:val="Heading2"/>
       </w:pPr>
       <w:r>
-        <w:t xml:space="preserve">21 Conclusion</w:t>
+        <w:t xml:space="preserve">22 Conclusion</w:t>
       </w:r>
     </w:p>
     <w:p>
@@ -5291,8 +5505,8 @@
         <w:t xml:space="preserve">add a citation or present direct evidence.</w:t>
       </w:r>
     </w:p>
-    <w:bookmarkStart w:id="76" w:name="refs"/>
-    <w:bookmarkStart w:id="60" w:name="ref-bienayme1853"/>
+    <w:bookmarkStart w:id="78" w:name="refs"/>
+    <w:bookmarkStart w:id="62" w:name="ref-bienayme1853"/>
     <w:p>
       <w:pPr>
         <w:pStyle w:val="Bibliography"/>
@@ -5337,7 +5551,7 @@
       <w:r>
         <w:t xml:space="preserve"> </w:t>
       </w:r>
-      <w:hyperlink r:id="rId59">
+      <w:hyperlink r:id="rId61">
         <w:r>
           <w:rPr>
             <w:rStyle w:val="Hyperlink"/>
@@ -5349,8 +5563,8 @@
         <w:t xml:space="preserve">.</w:t>
       </w:r>
     </w:p>
-    <w:bookmarkEnd w:id="60"/>
-    <w:bookmarkStart w:id="62" w:name="ref-blitzstein2019introduction"/>
+    <w:bookmarkEnd w:id="62"/>
+    <w:bookmarkStart w:id="64" w:name="ref-blitzstein2019introduction"/>
     <w:p>
       <w:pPr>
         <w:pStyle w:val="Bibliography"/>
@@ -5374,7 +5588,7 @@
       <w:r>
         <w:t xml:space="preserve"> </w:t>
       </w:r>
-      <w:hyperlink r:id="rId61">
+      <w:hyperlink r:id="rId63">
         <w:r>
           <w:rPr>
             <w:rStyle w:val="Hyperlink"/>
@@ -5386,8 +5600,8 @@
         <w:t xml:space="preserve">.</w:t>
       </w:r>
     </w:p>
-    <w:bookmarkEnd w:id="62"/>
-    <w:bookmarkStart w:id="64" w:name="ref-hawkins2004"/>
+    <w:bookmarkEnd w:id="64"/>
+    <w:bookmarkStart w:id="66" w:name="ref-hawkins2004"/>
     <w:p>
       <w:pPr>
         <w:pStyle w:val="Bibliography"/>
@@ -5420,7 +5634,7 @@
       <w:r>
         <w:t xml:space="preserve"> </w:t>
       </w:r>
-      <w:hyperlink r:id="rId63">
+      <w:hyperlink r:id="rId65">
         <w:r>
           <w:rPr>
             <w:rStyle w:val="Hyperlink"/>
@@ -5432,8 +5646,8 @@
         <w:t xml:space="preserve">.</w:t>
       </w:r>
     </w:p>
-    <w:bookmarkEnd w:id="64"/>
-    <w:bookmarkStart w:id="66" w:name="ref-knuth84"/>
+    <w:bookmarkEnd w:id="66"/>
+    <w:bookmarkStart w:id="68" w:name="ref-knuth84"/>
     <w:p>
       <w:pPr>
         <w:pStyle w:val="Bibliography"/>
@@ -5466,7 +5680,7 @@
       <w:r>
         <w:t xml:space="preserve"> </w:t>
       </w:r>
-      <w:hyperlink r:id="rId65">
+      <w:hyperlink r:id="rId67">
         <w:r>
           <w:rPr>
             <w:rStyle w:val="Hyperlink"/>
@@ -5478,8 +5692,8 @@
         <w:t xml:space="preserve">.</w:t>
       </w:r>
     </w:p>
-    <w:bookmarkEnd w:id="66"/>
-    <w:bookmarkStart w:id="67" w:name="ref-mitchell1997"/>
+    <w:bookmarkEnd w:id="68"/>
+    <w:bookmarkStart w:id="69" w:name="ref-mitchell1997"/>
     <w:p>
       <w:pPr>
         <w:pStyle w:val="Bibliography"/>
@@ -5501,8 +5715,8 @@
         <w:t xml:space="preserve">. McGraw-Hill.</w:t>
       </w:r>
     </w:p>
-    <w:bookmarkEnd w:id="67"/>
-    <w:bookmarkStart w:id="69" w:name="ref-stackoverflow2024"/>
+    <w:bookmarkEnd w:id="69"/>
+    <w:bookmarkStart w:id="71" w:name="ref-stackoverflow2024"/>
     <w:p>
       <w:pPr>
         <w:pStyle w:val="Bibliography"/>
@@ -5526,7 +5740,7 @@
       <w:r>
         <w:t xml:space="preserve"> </w:t>
       </w:r>
-      <w:hyperlink r:id="rId68">
+      <w:hyperlink r:id="rId70">
         <w:r>
           <w:rPr>
             <w:rStyle w:val="Hyperlink"/>
@@ -5538,8 +5752,8 @@
         <w:t xml:space="preserve">.</w:t>
       </w:r>
     </w:p>
-    <w:bookmarkEnd w:id="69"/>
-    <w:bookmarkStart w:id="71" w:name="ref-tchebichef1867"/>
+    <w:bookmarkEnd w:id="71"/>
+    <w:bookmarkStart w:id="73" w:name="ref-tchebichef1867"/>
     <w:p>
       <w:pPr>
         <w:pStyle w:val="Bibliography"/>
@@ -5569,7 +5783,7 @@
       <w:r>
         <w:t xml:space="preserve"> </w:t>
       </w:r>
-      <w:hyperlink r:id="rId70">
+      <w:hyperlink r:id="rId72">
         <w:r>
           <w:rPr>
             <w:rStyle w:val="Hyperlink"/>
@@ -5581,8 +5795,8 @@
         <w:t xml:space="preserve">.</w:t>
       </w:r>
     </w:p>
-    <w:bookmarkEnd w:id="71"/>
-    <w:bookmarkStart w:id="73" w:name="ref-vapnik1998"/>
+    <w:bookmarkEnd w:id="73"/>
+    <w:bookmarkStart w:id="75" w:name="ref-vapnik1998"/>
     <w:p>
       <w:pPr>
         <w:pStyle w:val="Bibliography"/>
@@ -5606,7 +5820,7 @@
       <w:r>
         <w:t xml:space="preserve"> </w:t>
       </w:r>
-      <w:hyperlink r:id="rId72">
+      <w:hyperlink r:id="rId74">
         <w:r>
           <w:rPr>
             <w:rStyle w:val="Hyperlink"/>
@@ -5618,8 +5832,8 @@
         <w:t xml:space="preserve">.</w:t>
       </w:r>
     </w:p>
-    <w:bookmarkEnd w:id="73"/>
-    <w:bookmarkStart w:id="75" w:name="ref-wikipedia_poisson_distribution"/>
+    <w:bookmarkEnd w:id="75"/>
+    <w:bookmarkStart w:id="77" w:name="ref-wikipedia_poisson_distribution"/>
     <w:p>
       <w:pPr>
         <w:pStyle w:val="Bibliography"/>
@@ -5678,7 +5892,7 @@
       <w:r>
         <w:t xml:space="preserve"> </w:t>
       </w:r>
-      <w:hyperlink r:id="rId74">
+      <w:hyperlink r:id="rId76">
         <w:r>
           <w:rPr>
             <w:rStyle w:val="Hyperlink"/>
@@ -5690,9 +5904,9 @@
         <w:t xml:space="preserve">.</w:t>
       </w:r>
     </w:p>
-    <w:bookmarkEnd w:id="75"/>
-    <w:bookmarkEnd w:id="76"/>
     <w:bookmarkEnd w:id="77"/>
+    <w:bookmarkEnd w:id="78"/>
+    <w:bookmarkEnd w:id="79"/>
     <w:sectPr>
       <w:footnotePr>
         <w:numRestart w:val="eachSect"/>

</xml_diff>

<commit_message>
Deploying to gh-pages from @ Morrison-Lab/psw@504a347b977cc33c11836d3b6e76055741e36600 🚀
</commit_message>
<xml_diff>
--- a/chapters/citations-evidence.docx
+++ b/chapters/citations-evidence.docx
@@ -15,7 +15,7 @@
         <w:pStyle w:val="Date"/>
       </w:pPr>
       <w:r>
-        <w:t xml:space="preserve">Last modified: 2026-10-24 21:51:54 (PDT)</w:t>
+        <w:t xml:space="preserve">Last modified: 2026-10-25 19:24:30 (PDT)</w:t>
       </w:r>
     </w:p>
     <w:p>
@@ -4210,7 +4210,7 @@
         <w:pStyle w:val="BlockText"/>
       </w:pPr>
       <w:r>
-        <w:t xml:space="preserve">❌ Chebyshev’s inequality says that …</w:t>
+        <w:t xml:space="preserve">❌ Chebyshev’s inequality bounds the probability that …</w:t>
       </w:r>
     </w:p>
     <w:p>
@@ -4218,7 +4218,7 @@
         <w:pStyle w:val="BlockText"/>
       </w:pPr>
       <w:r>
-        <w:t xml:space="preserve">✅ Chebyshev’s inequality says that …</w:t>
+        <w:t xml:space="preserve">✅ Chebyshev’s inequality bounds the probability that …</w:t>
       </w:r>
       <w:r>
         <w:t xml:space="preserve"> </w:t>

</xml_diff>

<commit_message>
Deploying to gh-pages from @ Morrison-Lab/psw@90cdd53dfa8404ac67617d7713f9a4f58b2c7a24 🚀
</commit_message>
<xml_diff>
--- a/chapters/citations-evidence.docx
+++ b/chapters/citations-evidence.docx
@@ -15,7 +15,7 @@
         <w:pStyle w:val="Date"/>
       </w:pPr>
       <w:r>
-        <w:t xml:space="preserve">Last modified: 2026-10-25 19:24:30 (PDT)</w:t>
+        <w:t xml:space="preserve">Last modified: 2026-10-25 19:43:06 (PDT)</w:t>
       </w:r>
     </w:p>
     <w:p>
@@ -2305,7 +2305,7 @@
       </w:r>
     </w:p>
     <w:bookmarkEnd w:id="27"/>
-    <w:bookmarkStart w:id="34" w:name="link-liberally"/>
+    <w:bookmarkStart w:id="37" w:name="link-liberally"/>
     <w:p>
       <w:pPr>
         <w:pStyle w:val="Heading2"/>
@@ -2481,7 +2481,52 @@
         <w:t xml:space="preserve"> </w:t>
       </w:r>
       <w:r>
-        <w:t xml:space="preserve">instead of repeating its content.</w:t>
+        <w:t xml:space="preserve">instead of repeating its content;</w:t>
+      </w:r>
+    </w:p>
+    <w:p>
+      <w:pPr>
+        <w:pStyle w:val="Compact"/>
+        <w:numPr>
+          <w:ilvl w:val="0"/>
+          <w:numId w:val="1014"/>
+        </w:numPr>
+      </w:pPr>
+      <w:r>
+        <w:t xml:space="preserve">a back-reference,</w:t>
+      </w:r>
+      <w:r>
+        <w:t xml:space="preserve"> </w:t>
+      </w:r>
+      <w:r>
+        <w:t xml:space="preserve">such as</w:t>
+      </w:r>
+      <w:r>
+        <w:t xml:space="preserve"> </w:t>
+      </w:r>
+      <w:r>
+        <w:t xml:space="preserve">“as defined above”</w:t>
+      </w:r>
+      <w:r>
+        <w:t xml:space="preserve"> </w:t>
+      </w:r>
+      <w:r>
+        <w:t xml:space="preserve">or</w:t>
+      </w:r>
+      <w:r>
+        <w:t xml:space="preserve"> </w:t>
+      </w:r>
+      <w:r>
+        <w:t xml:space="preserve">“the model from the previous section”</w:t>
+      </w:r>
+      <w:r>
+        <w:t xml:space="preserve">,</w:t>
+      </w:r>
+      <w:r>
+        <w:t xml:space="preserve"> </w:t>
+      </w:r>
+      <w:r>
+        <w:t xml:space="preserve">to the content that it points back to.</w:t>
       </w:r>
     </w:p>
     <w:p>
@@ -2489,12 +2534,176 @@
         <w:pStyle w:val="FirstParagraph"/>
       </w:pPr>
       <w:r>
+        <w:t xml:space="preserve">A reader who skipped the earlier section,</w:t>
+      </w:r>
+      <w:r>
+        <w:t xml:space="preserve"> </w:t>
+      </w:r>
+      <w:r>
+        <w:t xml:space="preserve">or who opened the page from a link to its middle,</w:t>
+      </w:r>
+      <w:r>
+        <w:t xml:space="preserve"> </w:t>
+      </w:r>
+      <w:r>
+        <w:t xml:space="preserve">can jump to the content that a back-reference points to only if the back-reference is a link.</w:t>
+      </w:r>
+      <w:r>
+        <w:t xml:space="preserve"> </w:t>
+      </w:r>
+      <w:r>
+        <w:t xml:space="preserve">Put the link on the words that name the target,</w:t>
+      </w:r>
+      <w:r>
+        <w:t xml:space="preserve"> </w:t>
+      </w:r>
+      <w:r>
+        <w:t xml:space="preserve">once per paragraph.</w:t>
+      </w:r>
+      <w:r>
+        <w:t xml:space="preserve"> </w:t>
+      </w:r>
+      <w:r>
+        <w:t xml:space="preserve">Where you can, use the target’s name instead of</w:t>
+      </w:r>
+      <w:r>
+        <w:t xml:space="preserve"> </w:t>
+      </w:r>
+      <w:r>
+        <w:t xml:space="preserve">“above”</w:t>
+      </w:r>
+      <w:r>
+        <w:t xml:space="preserve"> </w:t>
+      </w:r>
+      <w:r>
+        <w:t xml:space="preserve">or</w:t>
+      </w:r>
+      <w:r>
+        <w:t xml:space="preserve"> </w:t>
+      </w:r>
+      <w:r>
+        <w:t xml:space="preserve">“earlier”</w:t>
+      </w:r>
+      <w:r>
+        <w:t xml:space="preserve">,</w:t>
+      </w:r>
+      <w:r>
+        <w:t xml:space="preserve"> </w:t>
+      </w:r>
+      <w:r>
+        <w:t xml:space="preserve">since a word that names a position becomes wrong</w:t>
+      </w:r>
+      <w:r>
+        <w:t xml:space="preserve"> </w:t>
+      </w:r>
+      <w:r>
+        <w:t xml:space="preserve">when a later edit moves the content</w:t>
+      </w:r>
+      <w:r>
+        <w:t xml:space="preserve"> </w:t>
+      </w:r>
+      <w:r>
+        <w:t xml:space="preserve">(see</w:t>
+      </w:r>
+      <w:r>
+        <w:t xml:space="preserve"> </w:t>
+      </w:r>
+      <w:hyperlink r:id="rId30">
+        <w:r>
+          <w:rPr>
+            <w:rStyle w:val="Hyperlink"/>
+          </w:rPr>
+          <w:t xml:space="preserve">Avoid forward references</w:t>
+        </w:r>
+      </w:hyperlink>
+      <w:r>
+        <w:t xml:space="preserve">).</w:t>
+      </w:r>
+    </w:p>
+    <w:bookmarkStart w:id="32" w:name="exm-link-back-reference"/>
+    <w:p>
+      <w:pPr>
+        <w:pStyle w:val="BodyText"/>
+      </w:pPr>
+      <w:r>
+        <w:rPr>
+          <w:b/>
+          <w:bCs/>
+        </w:rPr>
+        <w:t xml:space="preserve">Example 2 (Linking a reference back to earlier content)</w:t>
+      </w:r>
+      <w:r>
+        <w:t xml:space="preserve"> </w:t>
+      </w:r>
+      <w:r>
+        <w:t xml:space="preserve"> </w:t>
+      </w:r>
+    </w:p>
+    <w:p>
+      <w:pPr>
+        <w:pStyle w:val="BlockText"/>
+      </w:pPr>
+      <w:r>
+        <w:t xml:space="preserve">❌ The likelihood of the logistic regression model from the previous chapter</w:t>
+      </w:r>
+      <w:r>
+        <w:t xml:space="preserve"> </w:t>
+      </w:r>
+      <w:r>
+        <w:t xml:space="preserve">is a product of Bernoulli probabilities.</w:t>
+      </w:r>
+    </w:p>
+    <w:p>
+      <w:pPr>
+        <w:pStyle w:val="BlockText"/>
+      </w:pPr>
+      <w:r>
+        <w:t xml:space="preserve">✅ The likelihood of the</w:t>
+      </w:r>
+      <w:r>
+        <w:t xml:space="preserve"> </w:t>
+      </w:r>
+      <w:hyperlink r:id="rId31">
+        <w:r>
+          <w:rPr>
+            <w:rStyle w:val="Hyperlink"/>
+          </w:rPr>
+          <w:t xml:space="preserve">logistic regression</w:t>
+        </w:r>
+      </w:hyperlink>
+      <w:r>
+        <w:t xml:space="preserve"> </w:t>
+      </w:r>
+      <w:r>
+        <w:t xml:space="preserve">model</w:t>
+      </w:r>
+      <w:r>
+        <w:t xml:space="preserve"> </w:t>
+      </w:r>
+      <w:r>
+        <w:t xml:space="preserve">is a product of Bernoulli probabilities.</w:t>
+      </w:r>
+    </w:p>
+    <w:p>
+      <w:pPr>
+        <w:pStyle w:val="FirstParagraph"/>
+      </w:pPr>
+      <w:r>
+        <w:t xml:space="preserve">In the ✅ version, the link takes the reader to the model’s definition.</w:t>
+      </w:r>
+    </w:p>
+    <w:bookmarkEnd w:id="32"/>
+    <w:p>
+      <w:pPr>
+        <w:pStyle w:val="BodyText"/>
+      </w:pPr>
+      <w:r>
         <w:t xml:space="preserve">In</w:t>
       </w:r>
       <w:r>
         <w:t xml:space="preserve"> </w:t>
       </w:r>
-      <w:hyperlink r:id="rId30">
+      <w:hyperlink r:id="rId33">
         <w:r>
           <w:rPr>
             <w:rStyle w:val="Hyperlink"/>
@@ -2603,7 +2812,7 @@
         <w:t xml:space="preserve">the target is unstable, and a stable alternative such as a DOI exists.</w:t>
       </w:r>
     </w:p>
-    <w:bookmarkStart w:id="33" w:name="exm-link-liberally"/>
+    <w:bookmarkStart w:id="36" w:name="exm-link-liberally"/>
     <w:p>
       <w:pPr>
         <w:pStyle w:val="FirstParagraph"/>
@@ -2613,7 +2822,7 @@
           <w:b/>
           <w:bCs/>
         </w:rPr>
-        <w:t xml:space="preserve">Example 2 (Adding links a reader would use)</w:t>
+        <w:t xml:space="preserve">Example 3 (Adding links a reader would use)</w:t>
       </w:r>
       <w:r>
         <w:t xml:space="preserve"> </w:t>
@@ -2646,7 +2855,7 @@
       <w:r>
         <w:t xml:space="preserve"> </w:t>
       </w:r>
-      <w:hyperlink r:id="rId31">
+      <w:hyperlink r:id="rId34">
         <w:r>
           <w:rPr>
             <w:rStyle w:val="Hyperlink"/>
@@ -2669,7 +2878,7 @@
       <w:r>
         <w:t xml:space="preserve"> </w:t>
       </w:r>
-      <w:hyperlink r:id="rId32">
+      <w:hyperlink r:id="rId35">
         <w:r>
           <w:rPr>
             <w:rStyle w:val="Hyperlink"/>
@@ -2716,9 +2925,9 @@
         <w:t xml:space="preserve">can now follow the link instead of searching.</w:t>
       </w:r>
     </w:p>
-    <w:bookmarkEnd w:id="33"/>
-    <w:bookmarkEnd w:id="34"/>
-    <w:bookmarkStart w:id="36" w:name="cite-wikipedia-beside-the-primary-source"/>
+    <w:bookmarkEnd w:id="36"/>
+    <w:bookmarkEnd w:id="37"/>
+    <w:bookmarkStart w:id="39" w:name="cite-wikipedia-beside-the-primary-source"/>
     <w:p>
       <w:pPr>
         <w:pStyle w:val="Heading2"/>
@@ -2959,7 +3168,7 @@
         <w:t xml:space="preserve">later uses link to your own definition.</w:t>
       </w:r>
     </w:p>
-    <w:bookmarkStart w:id="35" w:name="exm-link-wikipedia"/>
+    <w:bookmarkStart w:id="38" w:name="exm-link-wikipedia"/>
     <w:p>
       <w:pPr>
         <w:pStyle w:val="FirstParagraph"/>
@@ -2969,7 +3178,7 @@
           <w:b/>
           <w:bCs/>
         </w:rPr>
-        <w:t xml:space="preserve">Example 3 (Citing a definition’s Wikipedia article)</w:t>
+        <w:t xml:space="preserve">Example 4 (Citing a definition’s Wikipedia article)</w:t>
       </w:r>
       <w:r>
         <w:t xml:space="preserve"> </w:t>
@@ -3049,9 +3258,9 @@
         <w:t xml:space="preserve">and the definition itself still comes from your own text and its traditional reference.</w:t>
       </w:r>
     </w:p>
-    <w:bookmarkEnd w:id="35"/>
-    <w:bookmarkEnd w:id="36"/>
-    <w:bookmarkStart w:id="38" w:name="number-bracketed-citations"/>
+    <w:bookmarkEnd w:id="38"/>
+    <w:bookmarkEnd w:id="39"/>
+    <w:bookmarkStart w:id="41" w:name="number-bracketed-citations"/>
     <w:p>
       <w:pPr>
         <w:pStyle w:val="Heading2"/>
@@ -3211,7 +3420,7 @@
       <w:r>
         <w:t xml:space="preserve"> </w:t>
       </w:r>
-      <w:hyperlink r:id="rId37">
+      <w:hyperlink r:id="rId40">
         <w:r>
           <w:rPr>
             <w:rStyle w:val="Hyperlink"/>
@@ -3223,8 +3432,8 @@
         <w:t xml:space="preserve">.</w:t>
       </w:r>
     </w:p>
-    <w:bookmarkEnd w:id="38"/>
-    <w:bookmarkStart w:id="40" w:name="cite-once-per-passage"/>
+    <w:bookmarkEnd w:id="41"/>
+    <w:bookmarkStart w:id="43" w:name="cite-once-per-passage"/>
     <w:p>
       <w:pPr>
         <w:pStyle w:val="Heading2"/>
@@ -3283,7 +3492,7 @@
         <w:t xml:space="preserve">The rule to cite a Wikipedia article once, where its term is defined, is a case of this one.</w:t>
       </w:r>
     </w:p>
-    <w:bookmarkStart w:id="39" w:name="exm-cite-once"/>
+    <w:bookmarkStart w:id="42" w:name="exm-cite-once"/>
     <w:p>
       <w:pPr>
         <w:pStyle w:val="BodyText"/>
@@ -3293,7 +3502,7 @@
           <w:b/>
           <w:bCs/>
         </w:rPr>
-        <w:t xml:space="preserve">Example 4 (Citing one source once in a definition)</w:t>
+        <w:t xml:space="preserve">Example 5 (Citing one source once in a definition)</w:t>
       </w:r>
       <w:r>
         <w:t xml:space="preserve"> </w:t>
@@ -3403,9 +3612,9 @@
         <w:t xml:space="preserve">The second one does it once, in the source line that closes the div.</w:t>
       </w:r>
     </w:p>
-    <w:bookmarkEnd w:id="39"/>
-    <w:bookmarkEnd w:id="40"/>
-    <w:bookmarkStart w:id="41" w:name="best-practices"/>
+    <w:bookmarkEnd w:id="42"/>
+    <w:bookmarkEnd w:id="43"/>
+    <w:bookmarkStart w:id="44" w:name="best-practices"/>
     <w:p>
       <w:pPr>
         <w:pStyle w:val="Heading2"/>
@@ -3582,8 +3791,8 @@
         <w:t xml:space="preserve">: When possible, include work from different research groups and perspectives</w:t>
       </w:r>
     </w:p>
-    <w:bookmarkEnd w:id="41"/>
-    <w:bookmarkStart w:id="42" w:name="quote-the-original"/>
+    <w:bookmarkEnd w:id="44"/>
+    <w:bookmarkStart w:id="45" w:name="quote-the-original"/>
     <w:p>
       <w:pPr>
         <w:pStyle w:val="Heading2"/>
@@ -3666,8 +3875,8 @@
         <w:t xml:space="preserve">Uncertainty about who said a line is not evidence about who said it.</w:t>
       </w:r>
     </w:p>
-    <w:bookmarkEnd w:id="42"/>
-    <w:bookmarkStart w:id="43" w:name="Xdc6e961a4731f42c2c786ef03a498fc72396848"/>
+    <w:bookmarkEnd w:id="45"/>
+    <w:bookmarkStart w:id="46" w:name="Xdc6e961a4731f42c2c786ef03a498fc72396848"/>
     <w:p>
       <w:pPr>
         <w:pStyle w:val="Heading2"/>
@@ -3696,8 +3905,8 @@
         <w:t xml:space="preserve">rather than expanding an acronym from memory.</w:t>
       </w:r>
     </w:p>
-    <w:bookmarkEnd w:id="43"/>
-    <w:bookmarkStart w:id="46" w:name="verify-each-bibliography-entry"/>
+    <w:bookmarkEnd w:id="46"/>
+    <w:bookmarkStart w:id="49" w:name="verify-each-bibliography-entry"/>
     <w:p>
       <w:pPr>
         <w:pStyle w:val="Heading2"/>
@@ -3722,7 +3931,7 @@
       <w:r>
         <w:t xml:space="preserve"> </w:t>
       </w:r>
-      <w:hyperlink r:id="rId44">
+      <w:hyperlink r:id="rId47">
         <w:r>
           <w:rPr>
             <w:rStyle w:val="Hyperlink"/>
@@ -3739,7 +3948,7 @@
       <w:r>
         <w:t xml:space="preserve"> </w:t>
       </w:r>
-      <w:hyperlink r:id="rId45">
+      <w:hyperlink r:id="rId48">
         <w:r>
           <w:rPr>
             <w:rStyle w:val="Hyperlink"/>
@@ -3781,8 +3990,8 @@
         <w:t xml:space="preserve">and say in the pull request what you checked against what.</w:t>
       </w:r>
     </w:p>
-    <w:bookmarkEnd w:id="46"/>
-    <w:bookmarkStart w:id="47" w:name="cite-an-alias-directly"/>
+    <w:bookmarkEnd w:id="49"/>
+    <w:bookmarkStart w:id="50" w:name="cite-an-alias-directly"/>
     <w:p>
       <w:pPr>
         <w:pStyle w:val="Heading2"/>
@@ -3878,8 +4087,8 @@
         <w:t xml:space="preserve">also called the **alias** [@key, section]</w:t>
       </w:r>
     </w:p>
-    <w:bookmarkEnd w:id="47"/>
-    <w:bookmarkStart w:id="50" w:name="cite-the-original-for-named-results"/>
+    <w:bookmarkEnd w:id="50"/>
+    <w:bookmarkStart w:id="53" w:name="cite-the-original-for-named-results"/>
     <w:p>
       <w:pPr>
         <w:pStyle w:val="Heading2"/>
@@ -4160,7 +4369,7 @@
       <w:r>
         <w:t xml:space="preserve"> </w:t>
       </w:r>
-      <w:hyperlink r:id="rId48">
+      <w:hyperlink r:id="rId51">
         <w:r>
           <w:rPr>
             <w:rStyle w:val="Hyperlink"/>
@@ -4186,7 +4395,7 @@
         <w:t xml:space="preserve">and never fill in a title, volume, or page number from memory.</w:t>
       </w:r>
     </w:p>
-    <w:bookmarkStart w:id="49" w:name="exm-cite-original"/>
+    <w:bookmarkStart w:id="52" w:name="exm-cite-original"/>
     <w:p>
       <w:pPr>
         <w:pStyle w:val="BodyText"/>
@@ -4196,7 +4405,7 @@
           <w:b/>
           <w:bCs/>
         </w:rPr>
-        <w:t xml:space="preserve">Example 5 (Crediting Chebyshev’s inequality)</w:t>
+        <w:t xml:space="preserve">Example 6 (Crediting Chebyshev’s inequality)</w:t>
       </w:r>
       <w:r>
         <w:t xml:space="preserve"> </w:t>
@@ -4260,9 +4469,9 @@
         <w:t xml:space="preserve">.</w:t>
       </w:r>
     </w:p>
-    <w:bookmarkEnd w:id="49"/>
-    <w:bookmarkEnd w:id="50"/>
-    <w:bookmarkStart w:id="51" w:name="put-the-content-first"/>
+    <w:bookmarkEnd w:id="52"/>
+    <w:bookmarkEnd w:id="53"/>
+    <w:bookmarkStart w:id="54" w:name="put-the-content-first"/>
     <w:p>
       <w:pPr>
         <w:pStyle w:val="Heading2"/>
@@ -4315,8 +4524,8 @@
         <w:t xml:space="preserve">without commentary on who said it or where it was repeated.</w:t>
       </w:r>
     </w:p>
-    <w:bookmarkEnd w:id="51"/>
-    <w:bookmarkStart w:id="52" w:name="adapting-another-courses-material"/>
+    <w:bookmarkEnd w:id="54"/>
+    <w:bookmarkStart w:id="55" w:name="adapting-another-courses-material"/>
     <w:p>
       <w:pPr>
         <w:pStyle w:val="Heading2"/>
@@ -4561,8 +4770,8 @@
         <w:t xml:space="preserve">:::</w:t>
       </w:r>
     </w:p>
-    <w:bookmarkEnd w:id="52"/>
-    <w:bookmarkStart w:id="53" w:name="material-from-your-own-work"/>
+    <w:bookmarkEnd w:id="55"/>
+    <w:bookmarkStart w:id="56" w:name="material-from-your-own-work"/>
     <w:p>
       <w:pPr>
         <w:pStyle w:val="Heading2"/>
@@ -5004,8 +5213,8 @@
         <w:t xml:space="preserve">When you find an existing credit to your own work, remove it and add or keep a link to it.</w:t>
       </w:r>
     </w:p>
-    <w:bookmarkEnd w:id="53"/>
-    <w:bookmarkStart w:id="54" w:name="common-citation-errors-to-avoid"/>
+    <w:bookmarkEnd w:id="56"/>
+    <w:bookmarkStart w:id="57" w:name="common-citation-errors-to-avoid"/>
     <w:p>
       <w:pPr>
         <w:pStyle w:val="Heading2"/>
@@ -5222,8 +5431,8 @@
         <w:t xml:space="preserve">: Failing to cite work that directly influenced your ideas</w:t>
       </w:r>
     </w:p>
-    <w:bookmarkEnd w:id="54"/>
-    <w:bookmarkStart w:id="60" w:name="examples"/>
+    <w:bookmarkEnd w:id="57"/>
+    <w:bookmarkStart w:id="63" w:name="examples"/>
     <w:p>
       <w:pPr>
         <w:pStyle w:val="Heading2"/>
@@ -5232,7 +5441,7 @@
         <w:t xml:space="preserve">21 Examples</w:t>
       </w:r>
     </w:p>
-    <w:bookmarkStart w:id="55" w:name="poor-unsupported-claim"/>
+    <w:bookmarkStart w:id="58" w:name="poor-unsupported-claim"/>
     <w:p>
       <w:pPr>
         <w:pStyle w:val="Heading3"/>
@@ -5264,8 +5473,8 @@
         <w:t xml:space="preserve">: This claim is stated as fact without any support.</w:t>
       </w:r>
     </w:p>
-    <w:bookmarkEnd w:id="55"/>
-    <w:bookmarkStart w:id="56" w:name="better-citation-provided"/>
+    <w:bookmarkEnd w:id="58"/>
+    <w:bookmarkStart w:id="59" w:name="better-citation-provided"/>
     <w:p>
       <w:pPr>
         <w:pStyle w:val="Heading3"/>
@@ -5306,8 +5515,8 @@
         <w:t xml:space="preserve">: Citations provide evidence for the claim.</w:t>
       </w:r>
     </w:p>
-    <w:bookmarkEnd w:id="56"/>
-    <w:bookmarkStart w:id="57" w:name="best-citation-with-context"/>
+    <w:bookmarkEnd w:id="59"/>
+    <w:bookmarkStart w:id="60" w:name="best-citation-with-context"/>
     <w:p>
       <w:pPr>
         <w:pStyle w:val="Heading3"/>
@@ -5360,8 +5569,8 @@
         <w:t xml:space="preserve">: The specific support each citation provides is explained.</w:t>
       </w:r>
     </w:p>
-    <w:bookmarkEnd w:id="57"/>
-    <w:bookmarkStart w:id="58" w:name="poor-irrelevant-citation"/>
+    <w:bookmarkEnd w:id="60"/>
+    <w:bookmarkStart w:id="61" w:name="poor-irrelevant-citation"/>
     <w:p>
       <w:pPr>
         <w:pStyle w:val="Heading3"/>
@@ -5402,8 +5611,8 @@
         <w:t xml:space="preserve">: Knuth’s 1984 paper on literate programming doesn’t address Python or data science.</w:t>
       </w:r>
     </w:p>
-    <w:bookmarkEnd w:id="58"/>
-    <w:bookmarkStart w:id="59" w:name="better-relevant-citation"/>
+    <w:bookmarkEnd w:id="61"/>
+    <w:bookmarkStart w:id="62" w:name="better-relevant-citation"/>
     <w:p>
       <w:pPr>
         <w:pStyle w:val="Heading3"/>
@@ -5444,9 +5653,9 @@
         <w:t xml:space="preserve">: The citation is to a current survey of programming language usage.</w:t>
       </w:r>
     </w:p>
-    <w:bookmarkEnd w:id="59"/>
-    <w:bookmarkEnd w:id="60"/>
-    <w:bookmarkStart w:id="79" w:name="conclusion"/>
+    <w:bookmarkEnd w:id="62"/>
+    <w:bookmarkEnd w:id="63"/>
+    <w:bookmarkStart w:id="82" w:name="conclusion"/>
     <w:p>
       <w:pPr>
         <w:pStyle w:val="Heading2"/>
@@ -5505,8 +5714,8 @@
         <w:t xml:space="preserve">add a citation or present direct evidence.</w:t>
       </w:r>
     </w:p>
-    <w:bookmarkStart w:id="78" w:name="refs"/>
-    <w:bookmarkStart w:id="62" w:name="ref-bienayme1853"/>
+    <w:bookmarkStart w:id="81" w:name="refs"/>
+    <w:bookmarkStart w:id="65" w:name="ref-bienayme1853"/>
     <w:p>
       <w:pPr>
         <w:pStyle w:val="Bibliography"/>
@@ -5551,7 +5760,7 @@
       <w:r>
         <w:t xml:space="preserve"> </w:t>
       </w:r>
-      <w:hyperlink r:id="rId61">
+      <w:hyperlink r:id="rId64">
         <w:r>
           <w:rPr>
             <w:rStyle w:val="Hyperlink"/>
@@ -5563,8 +5772,8 @@
         <w:t xml:space="preserve">.</w:t>
       </w:r>
     </w:p>
-    <w:bookmarkEnd w:id="62"/>
-    <w:bookmarkStart w:id="64" w:name="ref-blitzstein2019introduction"/>
+    <w:bookmarkEnd w:id="65"/>
+    <w:bookmarkStart w:id="67" w:name="ref-blitzstein2019introduction"/>
     <w:p>
       <w:pPr>
         <w:pStyle w:val="Bibliography"/>
@@ -5588,7 +5797,7 @@
       <w:r>
         <w:t xml:space="preserve"> </w:t>
       </w:r>
-      <w:hyperlink r:id="rId63">
+      <w:hyperlink r:id="rId66">
         <w:r>
           <w:rPr>
             <w:rStyle w:val="Hyperlink"/>
@@ -5600,8 +5809,8 @@
         <w:t xml:space="preserve">.</w:t>
       </w:r>
     </w:p>
-    <w:bookmarkEnd w:id="64"/>
-    <w:bookmarkStart w:id="66" w:name="ref-hawkins2004"/>
+    <w:bookmarkEnd w:id="67"/>
+    <w:bookmarkStart w:id="69" w:name="ref-hawkins2004"/>
     <w:p>
       <w:pPr>
         <w:pStyle w:val="Bibliography"/>
@@ -5634,7 +5843,7 @@
       <w:r>
         <w:t xml:space="preserve"> </w:t>
       </w:r>
-      <w:hyperlink r:id="rId65">
+      <w:hyperlink r:id="rId68">
         <w:r>
           <w:rPr>
             <w:rStyle w:val="Hyperlink"/>
@@ -5646,8 +5855,8 @@
         <w:t xml:space="preserve">.</w:t>
       </w:r>
     </w:p>
-    <w:bookmarkEnd w:id="66"/>
-    <w:bookmarkStart w:id="68" w:name="ref-knuth84"/>
+    <w:bookmarkEnd w:id="69"/>
+    <w:bookmarkStart w:id="71" w:name="ref-knuth84"/>
     <w:p>
       <w:pPr>
         <w:pStyle w:val="Bibliography"/>
@@ -5680,7 +5889,7 @@
       <w:r>
         <w:t xml:space="preserve"> </w:t>
       </w:r>
-      <w:hyperlink r:id="rId67">
+      <w:hyperlink r:id="rId70">
         <w:r>
           <w:rPr>
             <w:rStyle w:val="Hyperlink"/>
@@ -5692,8 +5901,8 @@
         <w:t xml:space="preserve">.</w:t>
       </w:r>
     </w:p>
-    <w:bookmarkEnd w:id="68"/>
-    <w:bookmarkStart w:id="69" w:name="ref-mitchell1997"/>
+    <w:bookmarkEnd w:id="71"/>
+    <w:bookmarkStart w:id="72" w:name="ref-mitchell1997"/>
     <w:p>
       <w:pPr>
         <w:pStyle w:val="Bibliography"/>
@@ -5715,8 +5924,8 @@
         <w:t xml:space="preserve">. McGraw-Hill.</w:t>
       </w:r>
     </w:p>
-    <w:bookmarkEnd w:id="69"/>
-    <w:bookmarkStart w:id="71" w:name="ref-stackoverflow2024"/>
+    <w:bookmarkEnd w:id="72"/>
+    <w:bookmarkStart w:id="74" w:name="ref-stackoverflow2024"/>
     <w:p>
       <w:pPr>
         <w:pStyle w:val="Bibliography"/>
@@ -5740,7 +5949,7 @@
       <w:r>
         <w:t xml:space="preserve"> </w:t>
       </w:r>
-      <w:hyperlink r:id="rId70">
+      <w:hyperlink r:id="rId73">
         <w:r>
           <w:rPr>
             <w:rStyle w:val="Hyperlink"/>
@@ -5752,8 +5961,8 @@
         <w:t xml:space="preserve">.</w:t>
       </w:r>
     </w:p>
-    <w:bookmarkEnd w:id="71"/>
-    <w:bookmarkStart w:id="73" w:name="ref-tchebichef1867"/>
+    <w:bookmarkEnd w:id="74"/>
+    <w:bookmarkStart w:id="76" w:name="ref-tchebichef1867"/>
     <w:p>
       <w:pPr>
         <w:pStyle w:val="Bibliography"/>
@@ -5783,7 +5992,7 @@
       <w:r>
         <w:t xml:space="preserve"> </w:t>
       </w:r>
-      <w:hyperlink r:id="rId72">
+      <w:hyperlink r:id="rId75">
         <w:r>
           <w:rPr>
             <w:rStyle w:val="Hyperlink"/>
@@ -5795,8 +6004,8 @@
         <w:t xml:space="preserve">.</w:t>
       </w:r>
     </w:p>
-    <w:bookmarkEnd w:id="73"/>
-    <w:bookmarkStart w:id="75" w:name="ref-vapnik1998"/>
+    <w:bookmarkEnd w:id="76"/>
+    <w:bookmarkStart w:id="78" w:name="ref-vapnik1998"/>
     <w:p>
       <w:pPr>
         <w:pStyle w:val="Bibliography"/>
@@ -5820,7 +6029,7 @@
       <w:r>
         <w:t xml:space="preserve"> </w:t>
       </w:r>
-      <w:hyperlink r:id="rId74">
+      <w:hyperlink r:id="rId77">
         <w:r>
           <w:rPr>
             <w:rStyle w:val="Hyperlink"/>
@@ -5832,8 +6041,8 @@
         <w:t xml:space="preserve">.</w:t>
       </w:r>
     </w:p>
-    <w:bookmarkEnd w:id="75"/>
-    <w:bookmarkStart w:id="77" w:name="ref-wikipedia_poisson_distribution"/>
+    <w:bookmarkEnd w:id="78"/>
+    <w:bookmarkStart w:id="80" w:name="ref-wikipedia_poisson_distribution"/>
     <w:p>
       <w:pPr>
         <w:pStyle w:val="Bibliography"/>
@@ -5892,7 +6101,7 @@
       <w:r>
         <w:t xml:space="preserve"> </w:t>
       </w:r>
-      <w:hyperlink r:id="rId76">
+      <w:hyperlink r:id="rId79">
         <w:r>
           <w:rPr>
             <w:rStyle w:val="Hyperlink"/>
@@ -5904,9 +6113,9 @@
         <w:t xml:space="preserve">.</w:t>
       </w:r>
     </w:p>
-    <w:bookmarkEnd w:id="77"/>
-    <w:bookmarkEnd w:id="78"/>
-    <w:bookmarkEnd w:id="79"/>
+    <w:bookmarkEnd w:id="80"/>
+    <w:bookmarkEnd w:id="81"/>
+    <w:bookmarkEnd w:id="82"/>
     <w:sectPr>
       <w:footnotePr>
         <w:numRestart w:val="eachSect"/>

</xml_diff>

<commit_message>
Deploying to gh-pages from @ Morrison-Lab/psw@4326a1c21f7075d814d20601c8d4a6b2e61928c1 🚀
</commit_message>
<xml_diff>
--- a/chapters/citations-evidence.docx
+++ b/chapters/citations-evidence.docx
@@ -15,7 +15,7 @@
         <w:pStyle w:val="Date"/>
       </w:pPr>
       <w:r>
-        <w:t xml:space="preserve">Last modified: 2026-10-28 00:14:18 (PDT)</w:t>
+        <w:t xml:space="preserve">Last modified: 2026-10-28 00:37:47 (PDT)</w:t>
       </w:r>
     </w:p>
     <w:p>
@@ -1014,6 +1014,9 @@
       </m:oMath>
       <w:r>
         <w:t xml:space="preserve">,</w:t>
+      </w:r>
+      <w:r>
+        <w:t xml:space="preserve"> </w:t>
       </w:r>
       <w:r>
         <w:t xml:space="preserve"> </w:t>
@@ -1295,6 +1298,9 @@
         <w:t xml:space="preserve"> </w:t>
       </w:r>
       <w:r>
+        <w:t xml:space="preserve"> </w:t>
+      </w:r>
+      <w:r>
         <w:t xml:space="preserve">in order:</w:t>
       </w:r>
     </w:p>
@@ -2305,7 +2311,7 @@
       </w:r>
     </w:p>
     <w:bookmarkEnd w:id="27"/>
-    <w:bookmarkStart w:id="37" w:name="link-liberally"/>
+    <w:bookmarkStart w:id="38" w:name="link-liberally"/>
     <w:p>
       <w:pPr>
         <w:pStyle w:val="Heading2"/>
@@ -2355,7 +2361,24 @@
         </w:numPr>
       </w:pPr>
       <w:r>
-        <w:t xml:space="preserve">a term to the place where it is defined,</w:t>
+        <w:t xml:space="preserve">a</w:t>
+      </w:r>
+      <w:r>
+        <w:t xml:space="preserve"> </w:t>
+      </w:r>
+      <w:hyperlink r:id="rId28">
+        <w:r>
+          <w:rPr>
+            <w:rStyle w:val="Hyperlink"/>
+          </w:rPr>
+          <w:t xml:space="preserve">term</w:t>
+        </w:r>
+      </w:hyperlink>
+      <w:r>
+        <w:t xml:space="preserve"> </w:t>
+      </w:r>
+      <w:r>
+        <w:t xml:space="preserve">to the place where it is defined,</w:t>
       </w:r>
       <w:r>
         <w:t xml:space="preserve"> </w:t>
@@ -2390,7 +2413,7 @@
       <w:r>
         <w:t xml:space="preserve"> </w:t>
       </w:r>
-      <w:hyperlink r:id="rId28">
+      <w:hyperlink r:id="rId29">
         <w:r>
           <w:rPr>
             <w:rStyle w:val="Hyperlink"/>
@@ -2439,7 +2462,7 @@
       <w:r>
         <w:t xml:space="preserve"> </w:t>
       </w:r>
-      <w:hyperlink r:id="rId29">
+      <w:hyperlink r:id="rId30">
         <w:r>
           <w:rPr>
             <w:rStyle w:val="Hyperlink"/>
@@ -2608,7 +2631,7 @@
       <w:r>
         <w:t xml:space="preserve"> </w:t>
       </w:r>
-      <w:hyperlink r:id="rId30">
+      <w:hyperlink r:id="rId31">
         <w:r>
           <w:rPr>
             <w:rStyle w:val="Hyperlink"/>
@@ -2620,7 +2643,7 @@
         <w:t xml:space="preserve">).</w:t>
       </w:r>
     </w:p>
-    <w:bookmarkStart w:id="32" w:name="exm-link-back-reference"/>
+    <w:bookmarkStart w:id="33" w:name="exm-link-back-reference"/>
     <w:p>
       <w:pPr>
         <w:pStyle w:val="BodyText"/>
@@ -2650,6 +2673,9 @@
         <w:t xml:space="preserve"> </w:t>
       </w:r>
       <w:r>
+        <w:t xml:space="preserve"> </w:t>
+      </w:r>
+      <w:r>
         <w:t xml:space="preserve">is a product of Bernoulli probabilities.</w:t>
       </w:r>
     </w:p>
@@ -2663,7 +2689,7 @@
       <w:r>
         <w:t xml:space="preserve"> </w:t>
       </w:r>
-      <w:hyperlink r:id="rId31">
+      <w:hyperlink r:id="rId32">
         <w:r>
           <w:rPr>
             <w:rStyle w:val="Hyperlink"/>
@@ -2692,7 +2718,7 @@
         <w:t xml:space="preserve">In the ✅ version, the link takes the reader to the model’s definition.</w:t>
       </w:r>
     </w:p>
-    <w:bookmarkEnd w:id="32"/>
+    <w:bookmarkEnd w:id="33"/>
     <w:p>
       <w:pPr>
         <w:pStyle w:val="BodyText"/>
@@ -2703,7 +2729,7 @@
       <w:r>
         <w:t xml:space="preserve"> </w:t>
       </w:r>
-      <w:hyperlink r:id="rId33">
+      <w:hyperlink r:id="rId34">
         <w:r>
           <w:rPr>
             <w:rStyle w:val="Hyperlink"/>
@@ -2812,7 +2838,7 @@
         <w:t xml:space="preserve">the target is unstable, and a stable alternative such as a DOI exists.</w:t>
       </w:r>
     </w:p>
-    <w:bookmarkStart w:id="36" w:name="exm-link-liberally"/>
+    <w:bookmarkStart w:id="37" w:name="exm-link-liberally"/>
     <w:p>
       <w:pPr>
         <w:pStyle w:val="FirstParagraph"/>
@@ -2844,6 +2870,9 @@
       <w:r>
         <w:t xml:space="preserve">and report a 95% confidence interval for each fixed effect.</w:t>
       </w:r>
+      <w:r>
+        <w:t xml:space="preserve"> </w:t>
+      </w:r>
     </w:p>
     <w:p>
       <w:pPr>
@@ -2855,7 +2884,7 @@
       <w:r>
         <w:t xml:space="preserve"> </w:t>
       </w:r>
-      <w:hyperlink r:id="rId34">
+      <w:hyperlink r:id="rId35">
         <w:r>
           <w:rPr>
             <w:rStyle w:val="Hyperlink"/>
@@ -2878,7 +2907,7 @@
       <w:r>
         <w:t xml:space="preserve"> </w:t>
       </w:r>
-      <w:hyperlink r:id="rId35">
+      <w:hyperlink r:id="rId36">
         <w:r>
           <w:rPr>
             <w:rStyle w:val="Hyperlink"/>
@@ -2925,9 +2954,9 @@
         <w:t xml:space="preserve">can now follow the link instead of searching.</w:t>
       </w:r>
     </w:p>
-    <w:bookmarkEnd w:id="36"/>
     <w:bookmarkEnd w:id="37"/>
-    <w:bookmarkStart w:id="39" w:name="cite-wikipedia-beside-the-primary-source"/>
+    <w:bookmarkEnd w:id="38"/>
+    <w:bookmarkStart w:id="40" w:name="cite-wikipedia-beside-the-primary-source"/>
     <w:p>
       <w:pPr>
         <w:pStyle w:val="Heading2"/>
@@ -3159,7 +3188,24 @@
         </w:numPr>
       </w:pPr>
       <w:r>
-        <w:t xml:space="preserve">Cite an article once where its term is defined, not at every use;</w:t>
+        <w:t xml:space="preserve">Cite an article once where its</w:t>
+      </w:r>
+      <w:r>
+        <w:t xml:space="preserve"> </w:t>
+      </w:r>
+      <w:hyperlink r:id="rId28">
+        <w:r>
+          <w:rPr>
+            <w:rStyle w:val="Hyperlink"/>
+          </w:rPr>
+          <w:t xml:space="preserve">term</w:t>
+        </w:r>
+      </w:hyperlink>
+      <w:r>
+        <w:t xml:space="preserve"> </w:t>
+      </w:r>
+      <w:r>
+        <w:t xml:space="preserve">is defined, not at every use;</w:t>
       </w:r>
       <w:r>
         <w:t xml:space="preserve"> </w:t>
@@ -3168,7 +3214,7 @@
         <w:t xml:space="preserve">later uses link to your own definition.</w:t>
       </w:r>
     </w:p>
-    <w:bookmarkStart w:id="38" w:name="exm-link-wikipedia"/>
+    <w:bookmarkStart w:id="39" w:name="exm-link-wikipedia"/>
     <w:p>
       <w:pPr>
         <w:pStyle w:val="FirstParagraph"/>
@@ -3258,9 +3304,9 @@
         <w:t xml:space="preserve">and the definition itself still comes from your own text and its traditional reference.</w:t>
       </w:r>
     </w:p>
-    <w:bookmarkEnd w:id="38"/>
     <w:bookmarkEnd w:id="39"/>
-    <w:bookmarkStart w:id="41" w:name="number-bracketed-citations"/>
+    <w:bookmarkEnd w:id="40"/>
+    <w:bookmarkStart w:id="42" w:name="number-bracketed-citations"/>
     <w:p>
       <w:pPr>
         <w:pStyle w:val="Heading2"/>
@@ -3420,7 +3466,7 @@
       <w:r>
         <w:t xml:space="preserve"> </w:t>
       </w:r>
-      <w:hyperlink r:id="rId40">
+      <w:hyperlink r:id="rId41">
         <w:r>
           <w:rPr>
             <w:rStyle w:val="Hyperlink"/>
@@ -3432,8 +3478,8 @@
         <w:t xml:space="preserve">.</w:t>
       </w:r>
     </w:p>
-    <w:bookmarkEnd w:id="41"/>
-    <w:bookmarkStart w:id="43" w:name="cite-once-per-passage"/>
+    <w:bookmarkEnd w:id="42"/>
+    <w:bookmarkStart w:id="44" w:name="cite-once-per-passage"/>
     <w:p>
       <w:pPr>
         <w:pStyle w:val="Heading2"/>
@@ -3489,10 +3535,27 @@
         <w:t xml:space="preserve"> </w:t>
       </w:r>
       <w:r>
-        <w:t xml:space="preserve">The rule to cite a Wikipedia article once, where its term is defined, is a case of this one.</w:t>
-      </w:r>
-    </w:p>
-    <w:bookmarkStart w:id="42" w:name="exm-cite-once"/>
+        <w:t xml:space="preserve">The rule to cite a Wikipedia article once, where its</w:t>
+      </w:r>
+      <w:r>
+        <w:t xml:space="preserve"> </w:t>
+      </w:r>
+      <w:hyperlink r:id="rId28">
+        <w:r>
+          <w:rPr>
+            <w:rStyle w:val="Hyperlink"/>
+          </w:rPr>
+          <w:t xml:space="preserve">term</w:t>
+        </w:r>
+      </w:hyperlink>
+      <w:r>
+        <w:t xml:space="preserve"> </w:t>
+      </w:r>
+      <w:r>
+        <w:t xml:space="preserve">is defined, is a case of this one.</w:t>
+      </w:r>
+    </w:p>
+    <w:bookmarkStart w:id="43" w:name="exm-cite-once"/>
     <w:p>
       <w:pPr>
         <w:pStyle w:val="BodyText"/>
@@ -3612,9 +3675,9 @@
         <w:t xml:space="preserve">The second one does it once, in the source line that closes the div.</w:t>
       </w:r>
     </w:p>
-    <w:bookmarkEnd w:id="42"/>
     <w:bookmarkEnd w:id="43"/>
-    <w:bookmarkStart w:id="44" w:name="best-practices"/>
+    <w:bookmarkEnd w:id="44"/>
+    <w:bookmarkStart w:id="45" w:name="best-practices"/>
     <w:p>
       <w:pPr>
         <w:pStyle w:val="Heading2"/>
@@ -3791,8 +3854,8 @@
         <w:t xml:space="preserve">: When possible, include work from different research groups and perspectives</w:t>
       </w:r>
     </w:p>
-    <w:bookmarkEnd w:id="44"/>
-    <w:bookmarkStart w:id="45" w:name="quote-the-original"/>
+    <w:bookmarkEnd w:id="45"/>
+    <w:bookmarkStart w:id="46" w:name="quote-the-original"/>
     <w:p>
       <w:pPr>
         <w:pStyle w:val="Heading2"/>
@@ -3875,8 +3938,8 @@
         <w:t xml:space="preserve">Uncertainty about who said a line is not evidence about who said it.</w:t>
       </w:r>
     </w:p>
-    <w:bookmarkEnd w:id="45"/>
-    <w:bookmarkStart w:id="46" w:name="Xdc6e961a4731f42c2c786ef03a498fc72396848"/>
+    <w:bookmarkEnd w:id="46"/>
+    <w:bookmarkStart w:id="47" w:name="Xdc6e961a4731f42c2c786ef03a498fc72396848"/>
     <w:p>
       <w:pPr>
         <w:pStyle w:val="Heading2"/>
@@ -3905,8 +3968,8 @@
         <w:t xml:space="preserve">rather than expanding an acronym from memory.</w:t>
       </w:r>
     </w:p>
-    <w:bookmarkEnd w:id="46"/>
-    <w:bookmarkStart w:id="49" w:name="verify-each-bibliography-entry"/>
+    <w:bookmarkEnd w:id="47"/>
+    <w:bookmarkStart w:id="50" w:name="verify-each-bibliography-entry"/>
     <w:p>
       <w:pPr>
         <w:pStyle w:val="Heading2"/>
@@ -3931,7 +3994,7 @@
       <w:r>
         <w:t xml:space="preserve"> </w:t>
       </w:r>
-      <w:hyperlink r:id="rId47">
+      <w:hyperlink r:id="rId48">
         <w:r>
           <w:rPr>
             <w:rStyle w:val="Hyperlink"/>
@@ -3948,7 +4011,7 @@
       <w:r>
         <w:t xml:space="preserve"> </w:t>
       </w:r>
-      <w:hyperlink r:id="rId48">
+      <w:hyperlink r:id="rId49">
         <w:r>
           <w:rPr>
             <w:rStyle w:val="Hyperlink"/>
@@ -3990,8 +4053,8 @@
         <w:t xml:space="preserve">and say in the pull request what you checked against what.</w:t>
       </w:r>
     </w:p>
-    <w:bookmarkEnd w:id="49"/>
-    <w:bookmarkStart w:id="50" w:name="cite-an-alias-directly"/>
+    <w:bookmarkEnd w:id="50"/>
+    <w:bookmarkStart w:id="51" w:name="cite-an-alias-directly"/>
     <w:p>
       <w:pPr>
         <w:pStyle w:val="Heading2"/>
@@ -4005,7 +4068,21 @@
         <w:pStyle w:val="FirstParagraph"/>
       </w:pPr>
       <w:r>
-        <w:t xml:space="preserve">When a source uses another name for a defined term,</w:t>
+        <w:t xml:space="preserve">When a source uses another name for a defined</w:t>
+      </w:r>
+      <w:r>
+        <w:t xml:space="preserve"> </w:t>
+      </w:r>
+      <w:hyperlink r:id="rId28">
+        <w:r>
+          <w:rPr>
+            <w:rStyle w:val="Hyperlink"/>
+          </w:rPr>
+          <w:t xml:space="preserve">term</w:t>
+        </w:r>
+      </w:hyperlink>
+      <w:r>
+        <w:t xml:space="preserve">,</w:t>
       </w:r>
       <w:r>
         <w:t xml:space="preserve"> </w:t>
@@ -4087,8 +4164,8 @@
         <w:t xml:space="preserve">also called the **alias** [@key, section]</w:t>
       </w:r>
     </w:p>
-    <w:bookmarkEnd w:id="50"/>
-    <w:bookmarkStart w:id="53" w:name="cite-the-original-for-named-results"/>
+    <w:bookmarkEnd w:id="51"/>
+    <w:bookmarkStart w:id="54" w:name="cite-the-original-for-named-results"/>
     <w:p>
       <w:pPr>
         <w:pStyle w:val="Heading2"/>
@@ -4369,7 +4446,7 @@
       <w:r>
         <w:t xml:space="preserve"> </w:t>
       </w:r>
-      <w:hyperlink r:id="rId51">
+      <w:hyperlink r:id="rId52">
         <w:r>
           <w:rPr>
             <w:rStyle w:val="Hyperlink"/>
@@ -4395,7 +4472,7 @@
         <w:t xml:space="preserve">and never fill in a title, volume, or page number from memory.</w:t>
       </w:r>
     </w:p>
-    <w:bookmarkStart w:id="52" w:name="exm-cite-original"/>
+    <w:bookmarkStart w:id="53" w:name="exm-cite-original"/>
     <w:p>
       <w:pPr>
         <w:pStyle w:val="BodyText"/>
@@ -4469,9 +4546,9 @@
         <w:t xml:space="preserve">.</w:t>
       </w:r>
     </w:p>
-    <w:bookmarkEnd w:id="52"/>
     <w:bookmarkEnd w:id="53"/>
-    <w:bookmarkStart w:id="54" w:name="put-the-content-first"/>
+    <w:bookmarkEnd w:id="54"/>
+    <w:bookmarkStart w:id="55" w:name="put-the-content-first"/>
     <w:p>
       <w:pPr>
         <w:pStyle w:val="Heading2"/>
@@ -4524,8 +4601,8 @@
         <w:t xml:space="preserve">without commentary on who said it or where it was repeated.</w:t>
       </w:r>
     </w:p>
-    <w:bookmarkEnd w:id="54"/>
-    <w:bookmarkStart w:id="55" w:name="adapting-another-courses-material"/>
+    <w:bookmarkEnd w:id="55"/>
+    <w:bookmarkStart w:id="56" w:name="adapting-another-courses-material"/>
     <w:p>
       <w:pPr>
         <w:pStyle w:val="Heading2"/>
@@ -4770,8 +4847,8 @@
         <w:t xml:space="preserve">:::</w:t>
       </w:r>
     </w:p>
-    <w:bookmarkEnd w:id="55"/>
-    <w:bookmarkStart w:id="56" w:name="material-from-your-own-work"/>
+    <w:bookmarkEnd w:id="56"/>
+    <w:bookmarkStart w:id="57" w:name="material-from-your-own-work"/>
     <w:p>
       <w:pPr>
         <w:pStyle w:val="Heading2"/>
@@ -4955,7 +5032,10 @@
         <w:t xml:space="preserve"> </w:t>
       </w:r>
       <w:r>
-        <w:t xml:space="preserve">follows the publisher’s reuse terms, which may require a citation;</w:t>
+        <w:t xml:space="preserve">follows the publisher’s reuse terms, which may require a citation</w:t>
+      </w:r>
+      <w:r>
+        <w:t xml:space="preserve">;</w:t>
       </w:r>
       <w:r>
         <w:t xml:space="preserve"> </w:t>
@@ -5213,8 +5293,8 @@
         <w:t xml:space="preserve">When you find an existing credit to your own work, remove it and add or keep a link to it.</w:t>
       </w:r>
     </w:p>
-    <w:bookmarkEnd w:id="56"/>
-    <w:bookmarkStart w:id="57" w:name="common-citation-errors-to-avoid"/>
+    <w:bookmarkEnd w:id="57"/>
+    <w:bookmarkStart w:id="58" w:name="common-citation-errors-to-avoid"/>
     <w:p>
       <w:pPr>
         <w:pStyle w:val="Heading2"/>
@@ -5431,8 +5511,8 @@
         <w:t xml:space="preserve">: Failing to cite work that directly influenced your ideas</w:t>
       </w:r>
     </w:p>
-    <w:bookmarkEnd w:id="57"/>
-    <w:bookmarkStart w:id="63" w:name="examples"/>
+    <w:bookmarkEnd w:id="58"/>
+    <w:bookmarkStart w:id="64" w:name="examples"/>
     <w:p>
       <w:pPr>
         <w:pStyle w:val="Heading2"/>
@@ -5441,7 +5521,7 @@
         <w:t xml:space="preserve">21 Examples</w:t>
       </w:r>
     </w:p>
-    <w:bookmarkStart w:id="58" w:name="poor-unsupported-claim"/>
+    <w:bookmarkStart w:id="59" w:name="poor-unsupported-claim"/>
     <w:p>
       <w:pPr>
         <w:pStyle w:val="Heading3"/>
@@ -5473,8 +5553,8 @@
         <w:t xml:space="preserve">: This claim is stated as fact without any support.</w:t>
       </w:r>
     </w:p>
-    <w:bookmarkEnd w:id="58"/>
-    <w:bookmarkStart w:id="59" w:name="better-citation-provided"/>
+    <w:bookmarkEnd w:id="59"/>
+    <w:bookmarkStart w:id="60" w:name="better-citation-provided"/>
     <w:p>
       <w:pPr>
         <w:pStyle w:val="Heading3"/>
@@ -5515,8 +5595,8 @@
         <w:t xml:space="preserve">: Citations provide evidence for the claim.</w:t>
       </w:r>
     </w:p>
-    <w:bookmarkEnd w:id="59"/>
-    <w:bookmarkStart w:id="60" w:name="best-citation-with-context"/>
+    <w:bookmarkEnd w:id="60"/>
+    <w:bookmarkStart w:id="61" w:name="best-citation-with-context"/>
     <w:p>
       <w:pPr>
         <w:pStyle w:val="Heading3"/>
@@ -5569,8 +5649,8 @@
         <w:t xml:space="preserve">: The specific support each citation provides is explained.</w:t>
       </w:r>
     </w:p>
-    <w:bookmarkEnd w:id="60"/>
-    <w:bookmarkStart w:id="61" w:name="poor-irrelevant-citation"/>
+    <w:bookmarkEnd w:id="61"/>
+    <w:bookmarkStart w:id="62" w:name="poor-irrelevant-citation"/>
     <w:p>
       <w:pPr>
         <w:pStyle w:val="Heading3"/>
@@ -5611,8 +5691,8 @@
         <w:t xml:space="preserve">: Knuth’s 1984 paper on literate programming doesn’t address Python or data science.</w:t>
       </w:r>
     </w:p>
-    <w:bookmarkEnd w:id="61"/>
-    <w:bookmarkStart w:id="62" w:name="better-relevant-citation"/>
+    <w:bookmarkEnd w:id="62"/>
+    <w:bookmarkStart w:id="63" w:name="better-relevant-citation"/>
     <w:p>
       <w:pPr>
         <w:pStyle w:val="Heading3"/>
@@ -5653,9 +5733,9 @@
         <w:t xml:space="preserve">: The citation is to a current survey of programming language usage.</w:t>
       </w:r>
     </w:p>
-    <w:bookmarkEnd w:id="62"/>
     <w:bookmarkEnd w:id="63"/>
-    <w:bookmarkStart w:id="82" w:name="conclusion"/>
+    <w:bookmarkEnd w:id="64"/>
+    <w:bookmarkStart w:id="83" w:name="conclusion"/>
     <w:p>
       <w:pPr>
         <w:pStyle w:val="Heading2"/>
@@ -5714,8 +5794,8 @@
         <w:t xml:space="preserve">add a citation or present direct evidence.</w:t>
       </w:r>
     </w:p>
-    <w:bookmarkStart w:id="81" w:name="refs"/>
-    <w:bookmarkStart w:id="65" w:name="ref-bienayme1853"/>
+    <w:bookmarkStart w:id="82" w:name="refs"/>
+    <w:bookmarkStart w:id="66" w:name="ref-bienayme1853"/>
     <w:p>
       <w:pPr>
         <w:pStyle w:val="Bibliography"/>
@@ -5760,7 +5840,7 @@
       <w:r>
         <w:t xml:space="preserve"> </w:t>
       </w:r>
-      <w:hyperlink r:id="rId64">
+      <w:hyperlink r:id="rId65">
         <w:r>
           <w:rPr>
             <w:rStyle w:val="Hyperlink"/>
@@ -5772,8 +5852,8 @@
         <w:t xml:space="preserve">.</w:t>
       </w:r>
     </w:p>
-    <w:bookmarkEnd w:id="65"/>
-    <w:bookmarkStart w:id="67" w:name="ref-blitzstein2019introduction"/>
+    <w:bookmarkEnd w:id="66"/>
+    <w:bookmarkStart w:id="68" w:name="ref-blitzstein2019introduction"/>
     <w:p>
       <w:pPr>
         <w:pStyle w:val="Bibliography"/>
@@ -5797,7 +5877,7 @@
       <w:r>
         <w:t xml:space="preserve"> </w:t>
       </w:r>
-      <w:hyperlink r:id="rId66">
+      <w:hyperlink r:id="rId67">
         <w:r>
           <w:rPr>
             <w:rStyle w:val="Hyperlink"/>
@@ -5809,8 +5889,8 @@
         <w:t xml:space="preserve">.</w:t>
       </w:r>
     </w:p>
-    <w:bookmarkEnd w:id="67"/>
-    <w:bookmarkStart w:id="69" w:name="ref-hawkins2004"/>
+    <w:bookmarkEnd w:id="68"/>
+    <w:bookmarkStart w:id="70" w:name="ref-hawkins2004"/>
     <w:p>
       <w:pPr>
         <w:pStyle w:val="Bibliography"/>
@@ -5843,7 +5923,7 @@
       <w:r>
         <w:t xml:space="preserve"> </w:t>
       </w:r>
-      <w:hyperlink r:id="rId68">
+      <w:hyperlink r:id="rId69">
         <w:r>
           <w:rPr>
             <w:rStyle w:val="Hyperlink"/>
@@ -5855,8 +5935,8 @@
         <w:t xml:space="preserve">.</w:t>
       </w:r>
     </w:p>
-    <w:bookmarkEnd w:id="69"/>
-    <w:bookmarkStart w:id="71" w:name="ref-knuth84"/>
+    <w:bookmarkEnd w:id="70"/>
+    <w:bookmarkStart w:id="72" w:name="ref-knuth84"/>
     <w:p>
       <w:pPr>
         <w:pStyle w:val="Bibliography"/>
@@ -5889,7 +5969,7 @@
       <w:r>
         <w:t xml:space="preserve"> </w:t>
       </w:r>
-      <w:hyperlink r:id="rId70">
+      <w:hyperlink r:id="rId71">
         <w:r>
           <w:rPr>
             <w:rStyle w:val="Hyperlink"/>
@@ -5901,8 +5981,8 @@
         <w:t xml:space="preserve">.</w:t>
       </w:r>
     </w:p>
-    <w:bookmarkEnd w:id="71"/>
-    <w:bookmarkStart w:id="72" w:name="ref-mitchell1997"/>
+    <w:bookmarkEnd w:id="72"/>
+    <w:bookmarkStart w:id="73" w:name="ref-mitchell1997"/>
     <w:p>
       <w:pPr>
         <w:pStyle w:val="Bibliography"/>
@@ -5924,8 +6004,8 @@
         <w:t xml:space="preserve">. McGraw-Hill.</w:t>
       </w:r>
     </w:p>
-    <w:bookmarkEnd w:id="72"/>
-    <w:bookmarkStart w:id="74" w:name="ref-stackoverflow2024"/>
+    <w:bookmarkEnd w:id="73"/>
+    <w:bookmarkStart w:id="75" w:name="ref-stackoverflow2024"/>
     <w:p>
       <w:pPr>
         <w:pStyle w:val="Bibliography"/>
@@ -5949,7 +6029,7 @@
       <w:r>
         <w:t xml:space="preserve"> </w:t>
       </w:r>
-      <w:hyperlink r:id="rId73">
+      <w:hyperlink r:id="rId74">
         <w:r>
           <w:rPr>
             <w:rStyle w:val="Hyperlink"/>
@@ -5961,8 +6041,8 @@
         <w:t xml:space="preserve">.</w:t>
       </w:r>
     </w:p>
-    <w:bookmarkEnd w:id="74"/>
-    <w:bookmarkStart w:id="76" w:name="ref-tchebichef1867"/>
+    <w:bookmarkEnd w:id="75"/>
+    <w:bookmarkStart w:id="77" w:name="ref-tchebichef1867"/>
     <w:p>
       <w:pPr>
         <w:pStyle w:val="Bibliography"/>
@@ -5992,7 +6072,7 @@
       <w:r>
         <w:t xml:space="preserve"> </w:t>
       </w:r>
-      <w:hyperlink r:id="rId75">
+      <w:hyperlink r:id="rId76">
         <w:r>
           <w:rPr>
             <w:rStyle w:val="Hyperlink"/>
@@ -6004,8 +6084,8 @@
         <w:t xml:space="preserve">.</w:t>
       </w:r>
     </w:p>
-    <w:bookmarkEnd w:id="76"/>
-    <w:bookmarkStart w:id="78" w:name="ref-vapnik1998"/>
+    <w:bookmarkEnd w:id="77"/>
+    <w:bookmarkStart w:id="79" w:name="ref-vapnik1998"/>
     <w:p>
       <w:pPr>
         <w:pStyle w:val="Bibliography"/>
@@ -6029,7 +6109,7 @@
       <w:r>
         <w:t xml:space="preserve"> </w:t>
       </w:r>
-      <w:hyperlink r:id="rId77">
+      <w:hyperlink r:id="rId78">
         <w:r>
           <w:rPr>
             <w:rStyle w:val="Hyperlink"/>
@@ -6041,8 +6121,8 @@
         <w:t xml:space="preserve">.</w:t>
       </w:r>
     </w:p>
-    <w:bookmarkEnd w:id="78"/>
-    <w:bookmarkStart w:id="80" w:name="ref-wikipedia_poisson_distribution"/>
+    <w:bookmarkEnd w:id="79"/>
+    <w:bookmarkStart w:id="81" w:name="ref-wikipedia_poisson_distribution"/>
     <w:p>
       <w:pPr>
         <w:pStyle w:val="Bibliography"/>
@@ -6101,7 +6181,7 @@
       <w:r>
         <w:t xml:space="preserve"> </w:t>
       </w:r>
-      <w:hyperlink r:id="rId79">
+      <w:hyperlink r:id="rId80">
         <w:r>
           <w:rPr>
             <w:rStyle w:val="Hyperlink"/>
@@ -6113,9 +6193,9 @@
         <w:t xml:space="preserve">.</w:t>
       </w:r>
     </w:p>
-    <w:bookmarkEnd w:id="80"/>
     <w:bookmarkEnd w:id="81"/>
     <w:bookmarkEnd w:id="82"/>
+    <w:bookmarkEnd w:id="83"/>
     <w:sectPr>
       <w:footnotePr>
         <w:numRestart w:val="eachSect"/>

</xml_diff>